<commit_message>
Review state definitions and data dictionary
</commit_message>
<xml_diff>
--- a/docs/data-dictionary.docx
+++ b/docs/data-dictionary.docx
@@ -4,6 +4,7 @@
   <w:body>
     <w:p>
       <w:pPr>
+        <w:jc w:val="center"/>
         <w:rPr>
           <w:rFonts w:ascii="Times New Roman" w:hAnsi="Times New Roman" w:cs="Times New Roman"/>
           <w:b/>
@@ -31,13 +32,13 @@
         <w:tblLook w:val="04A0" w:firstRow="1" w:lastRow="0" w:firstColumn="1" w:lastColumn="0" w:noHBand="0" w:noVBand="1"/>
       </w:tblPr>
       <w:tblGrid>
-        <w:gridCol w:w="2887"/>
-        <w:gridCol w:w="1376"/>
+        <w:gridCol w:w="2830"/>
+        <w:gridCol w:w="1367"/>
         <w:gridCol w:w="1168"/>
         <w:gridCol w:w="750"/>
         <w:gridCol w:w="1443"/>
         <w:gridCol w:w="1870"/>
-        <w:gridCol w:w="1629"/>
+        <w:gridCol w:w="1695"/>
       </w:tblGrid>
       <w:tr>
         <w:trPr>
@@ -50,6 +51,7 @@
           </w:tcPr>
           <w:p>
             <w:pPr>
+              <w:jc w:val="center"/>
               <w:rPr>
                 <w:rFonts w:ascii="Times New Roman" w:hAnsi="Times New Roman" w:cs="Times New Roman"/>
               </w:rPr>
@@ -68,6 +70,7 @@
           </w:tcPr>
           <w:p>
             <w:pPr>
+              <w:jc w:val="center"/>
               <w:cnfStyle w:val="100000000000" w:firstRow="1" w:lastRow="0" w:firstColumn="0" w:lastColumn="0" w:oddVBand="0" w:evenVBand="0" w:oddHBand="0" w:evenHBand="0" w:firstRowFirstColumn="0" w:firstRowLastColumn="0" w:lastRowFirstColumn="0" w:lastRowLastColumn="0"/>
               <w:rPr>
                 <w:rFonts w:ascii="Times New Roman" w:hAnsi="Times New Roman" w:cs="Times New Roman"/>
@@ -87,6 +90,7 @@
           </w:tcPr>
           <w:p>
             <w:pPr>
+              <w:jc w:val="center"/>
               <w:cnfStyle w:val="100000000000" w:firstRow="1" w:lastRow="0" w:firstColumn="0" w:lastColumn="0" w:oddVBand="0" w:evenVBand="0" w:oddHBand="0" w:evenHBand="0" w:firstRowFirstColumn="0" w:firstRowLastColumn="0" w:lastRowFirstColumn="0" w:lastRowLastColumn="0"/>
               <w:rPr>
                 <w:rFonts w:ascii="Times New Roman" w:hAnsi="Times New Roman" w:cs="Times New Roman"/>
@@ -106,6 +110,7 @@
           </w:tcPr>
           <w:p>
             <w:pPr>
+              <w:jc w:val="center"/>
               <w:cnfStyle w:val="100000000000" w:firstRow="1" w:lastRow="0" w:firstColumn="0" w:lastColumn="0" w:oddVBand="0" w:evenVBand="0" w:oddHBand="0" w:evenHBand="0" w:firstRowFirstColumn="0" w:firstRowLastColumn="0" w:lastRowFirstColumn="0" w:lastRowLastColumn="0"/>
               <w:rPr>
                 <w:rFonts w:ascii="Times New Roman" w:hAnsi="Times New Roman" w:cs="Times New Roman"/>
@@ -125,6 +130,7 @@
           </w:tcPr>
           <w:p>
             <w:pPr>
+              <w:jc w:val="center"/>
               <w:cnfStyle w:val="100000000000" w:firstRow="1" w:lastRow="0" w:firstColumn="0" w:lastColumn="0" w:oddVBand="0" w:evenVBand="0" w:oddHBand="0" w:evenHBand="0" w:firstRowFirstColumn="0" w:firstRowLastColumn="0" w:lastRowFirstColumn="0" w:lastRowLastColumn="0"/>
               <w:rPr>
                 <w:rFonts w:ascii="Times New Roman" w:hAnsi="Times New Roman" w:cs="Times New Roman"/>
@@ -144,6 +150,7 @@
           </w:tcPr>
           <w:p>
             <w:pPr>
+              <w:jc w:val="center"/>
               <w:cnfStyle w:val="100000000000" w:firstRow="1" w:lastRow="0" w:firstColumn="0" w:lastColumn="0" w:oddVBand="0" w:evenVBand="0" w:oddHBand="0" w:evenHBand="0" w:firstRowFirstColumn="0" w:firstRowLastColumn="0" w:lastRowFirstColumn="0" w:lastRowLastColumn="0"/>
               <w:rPr>
                 <w:rFonts w:ascii="Times New Roman" w:hAnsi="Times New Roman" w:cs="Times New Roman"/>
@@ -163,6 +170,7 @@
           </w:tcPr>
           <w:p>
             <w:pPr>
+              <w:jc w:val="center"/>
               <w:cnfStyle w:val="100000000000" w:firstRow="1" w:lastRow="0" w:firstColumn="0" w:lastColumn="0" w:oddVBand="0" w:evenVBand="0" w:oddHBand="0" w:evenHBand="0" w:firstRowFirstColumn="0" w:firstRowLastColumn="0" w:lastRowFirstColumn="0" w:lastRowLastColumn="0"/>
               <w:rPr>
                 <w:rFonts w:ascii="Times New Roman" w:hAnsi="Times New Roman" w:cs="Times New Roman"/>
@@ -185,6 +193,7 @@
           </w:tcPr>
           <w:p>
             <w:pPr>
+              <w:jc w:val="center"/>
               <w:rPr>
                 <w:rFonts w:ascii="Times New Roman" w:hAnsi="Times New Roman" w:cs="Times New Roman"/>
                 <w:b w:val="0"/>
@@ -196,29 +205,237 @@
                 <w:rFonts w:ascii="Times New Roman" w:hAnsi="Times New Roman" w:cs="Times New Roman"/>
                 <w:b w:val="0"/>
                 <w:bCs w:val="0"/>
+              </w:rPr>
+              <w:t>swap</w:t>
+            </w:r>
+            <w:r>
+              <w:rPr>
+                <w:rFonts w:ascii="Times New Roman" w:hAnsi="Times New Roman" w:cs="Times New Roman"/>
+                <w:b w:val="0"/>
+                <w:bCs w:val="0"/>
+              </w:rPr>
+              <w:t>_request_id</w:t>
+            </w:r>
+          </w:p>
+        </w:tc>
+        <w:tc>
+          <w:tcPr>
+            <w:tcW w:w="1376" w:type="dxa"/>
+          </w:tcPr>
+          <w:p>
+            <w:pPr>
+              <w:jc w:val="center"/>
+              <w:cnfStyle w:val="000000000000" w:firstRow="0" w:lastRow="0" w:firstColumn="0" w:lastColumn="0" w:oddVBand="0" w:evenVBand="0" w:oddHBand="0" w:evenHBand="0" w:firstRowFirstColumn="0" w:firstRowLastColumn="0" w:lastRowFirstColumn="0" w:lastRowLastColumn="0"/>
+              <w:rPr>
+                <w:rFonts w:ascii="Times New Roman" w:hAnsi="Times New Roman" w:cs="Times New Roman"/>
+              </w:rPr>
+            </w:pPr>
+            <w:r>
+              <w:rPr>
+                <w:rFonts w:ascii="Times New Roman" w:hAnsi="Times New Roman" w:cs="Times New Roman"/>
+              </w:rPr>
+              <w:t>Specific identifier for swap request</w:t>
+            </w:r>
+          </w:p>
+        </w:tc>
+        <w:tc>
+          <w:tcPr>
+            <w:tcW w:w="1168" w:type="dxa"/>
+          </w:tcPr>
+          <w:p>
+            <w:pPr>
+              <w:jc w:val="center"/>
+              <w:cnfStyle w:val="000000000000" w:firstRow="0" w:lastRow="0" w:firstColumn="0" w:lastColumn="0" w:oddVBand="0" w:evenVBand="0" w:oddHBand="0" w:evenHBand="0" w:firstRowFirstColumn="0" w:firstRowLastColumn="0" w:lastRowFirstColumn="0" w:lastRowLastColumn="0"/>
+              <w:rPr>
+                <w:rFonts w:ascii="Times New Roman" w:hAnsi="Times New Roman" w:cs="Times New Roman"/>
+              </w:rPr>
+            </w:pPr>
+          </w:p>
+          <w:p>
+            <w:pPr>
+              <w:jc w:val="center"/>
+              <w:cnfStyle w:val="000000000000" w:firstRow="0" w:lastRow="0" w:firstColumn="0" w:lastColumn="0" w:oddVBand="0" w:evenVBand="0" w:oddHBand="0" w:evenHBand="0" w:firstRowFirstColumn="0" w:firstRowLastColumn="0" w:lastRowFirstColumn="0" w:lastRowLastColumn="0"/>
+              <w:rPr>
+                <w:rFonts w:ascii="Times New Roman" w:hAnsi="Times New Roman" w:cs="Times New Roman"/>
+              </w:rPr>
+            </w:pPr>
+          </w:p>
+          <w:p>
+            <w:pPr>
+              <w:jc w:val="center"/>
+              <w:cnfStyle w:val="000000000000" w:firstRow="0" w:lastRow="0" w:firstColumn="0" w:lastColumn="0" w:oddVBand="0" w:evenVBand="0" w:oddHBand="0" w:evenHBand="0" w:firstRowFirstColumn="0" w:firstRowLastColumn="0" w:lastRowFirstColumn="0" w:lastRowLastColumn="0"/>
+              <w:rPr>
+                <w:rFonts w:ascii="Times New Roman" w:hAnsi="Times New Roman" w:cs="Times New Roman"/>
+              </w:rPr>
+            </w:pPr>
+            <w:r>
+              <w:rPr>
+                <w:rFonts w:ascii="Times New Roman" w:hAnsi="Times New Roman" w:cs="Times New Roman"/>
+              </w:rPr>
+              <w:t>String</w:t>
+            </w:r>
+          </w:p>
+        </w:tc>
+        <w:tc>
+          <w:tcPr>
+            <w:tcW w:w="750" w:type="dxa"/>
+          </w:tcPr>
+          <w:p>
+            <w:pPr>
+              <w:jc w:val="center"/>
+              <w:cnfStyle w:val="000000000000" w:firstRow="0" w:lastRow="0" w:firstColumn="0" w:lastColumn="0" w:oddVBand="0" w:evenVBand="0" w:oddHBand="0" w:evenHBand="0" w:firstRowFirstColumn="0" w:firstRowLastColumn="0" w:lastRowFirstColumn="0" w:lastRowLastColumn="0"/>
+              <w:rPr>
+                <w:rFonts w:ascii="Times New Roman" w:hAnsi="Times New Roman" w:cs="Times New Roman"/>
+                <w:b/>
+                <w:bCs/>
                 <w:sz w:val="32"/>
                 <w:szCs w:val="32"/>
               </w:rPr>
-              <w:t xml:space="preserve"> </w:t>
-            </w:r>
-            <w:proofErr w:type="spellStart"/>
-            <w:r>
+            </w:pPr>
+          </w:p>
+          <w:p>
+            <w:pPr>
+              <w:jc w:val="center"/>
+              <w:cnfStyle w:val="000000000000" w:firstRow="0" w:lastRow="0" w:firstColumn="0" w:lastColumn="0" w:oddVBand="0" w:evenVBand="0" w:oddHBand="0" w:evenHBand="0" w:firstRowFirstColumn="0" w:firstRowLastColumn="0" w:lastRowFirstColumn="0" w:lastRowLastColumn="0"/>
+              <w:rPr>
+                <w:rFonts w:ascii="Times New Roman" w:hAnsi="Times New Roman" w:cs="Times New Roman"/>
+              </w:rPr>
+            </w:pPr>
+            <w:r>
+              <w:rPr>
+                <w:rFonts w:ascii="Times New Roman" w:hAnsi="Times New Roman" w:cs="Times New Roman"/>
+              </w:rPr>
+              <w:t>Yes</w:t>
+            </w:r>
+          </w:p>
+        </w:tc>
+        <w:tc>
+          <w:tcPr>
+            <w:tcW w:w="1443" w:type="dxa"/>
+          </w:tcPr>
+          <w:p>
+            <w:pPr>
+              <w:jc w:val="center"/>
+              <w:cnfStyle w:val="000000000000" w:firstRow="0" w:lastRow="0" w:firstColumn="0" w:lastColumn="0" w:oddVBand="0" w:evenVBand="0" w:oddHBand="0" w:evenHBand="0" w:firstRowFirstColumn="0" w:firstRowLastColumn="0" w:lastRowFirstColumn="0" w:lastRowLastColumn="0"/>
+              <w:rPr>
+                <w:rFonts w:ascii="Times New Roman" w:hAnsi="Times New Roman" w:cs="Times New Roman"/>
+                <w:b/>
+                <w:bCs/>
+                <w:sz w:val="32"/>
+                <w:szCs w:val="32"/>
+              </w:rPr>
+            </w:pPr>
+          </w:p>
+          <w:p>
+            <w:pPr>
+              <w:jc w:val="center"/>
+              <w:cnfStyle w:val="000000000000" w:firstRow="0" w:lastRow="0" w:firstColumn="0" w:lastColumn="0" w:oddVBand="0" w:evenVBand="0" w:oddHBand="0" w:evenHBand="0" w:firstRowFirstColumn="0" w:firstRowLastColumn="0" w:lastRowFirstColumn="0" w:lastRowLastColumn="0"/>
+              <w:rPr>
+                <w:rFonts w:ascii="Times New Roman" w:hAnsi="Times New Roman" w:cs="Times New Roman"/>
+              </w:rPr>
+            </w:pPr>
+            <w:r>
+              <w:rPr>
+                <w:rFonts w:ascii="Times New Roman" w:hAnsi="Times New Roman" w:cs="Times New Roman"/>
+              </w:rPr>
+              <w:t>Shift management system</w:t>
+            </w:r>
+          </w:p>
+        </w:tc>
+        <w:tc>
+          <w:tcPr>
+            <w:tcW w:w="1870" w:type="dxa"/>
+          </w:tcPr>
+          <w:p>
+            <w:pPr>
+              <w:jc w:val="center"/>
+              <w:cnfStyle w:val="000000000000" w:firstRow="0" w:lastRow="0" w:firstColumn="0" w:lastColumn="0" w:oddVBand="0" w:evenVBand="0" w:oddHBand="0" w:evenHBand="0" w:firstRowFirstColumn="0" w:firstRowLastColumn="0" w:lastRowFirstColumn="0" w:lastRowLastColumn="0"/>
+              <w:rPr>
+                <w:rFonts w:ascii="Times New Roman" w:hAnsi="Times New Roman" w:cs="Times New Roman"/>
+                <w:b/>
+                <w:bCs/>
+                <w:sz w:val="32"/>
+                <w:szCs w:val="32"/>
+              </w:rPr>
+            </w:pPr>
+          </w:p>
+          <w:p>
+            <w:pPr>
+              <w:jc w:val="center"/>
+              <w:cnfStyle w:val="000000000000" w:firstRow="0" w:lastRow="0" w:firstColumn="0" w:lastColumn="0" w:oddVBand="0" w:evenVBand="0" w:oddHBand="0" w:evenHBand="0" w:firstRowFirstColumn="0" w:firstRowLastColumn="0" w:lastRowFirstColumn="0" w:lastRowLastColumn="0"/>
+              <w:rPr>
+                <w:rFonts w:ascii="Times New Roman" w:hAnsi="Times New Roman" w:cs="Times New Roman"/>
+              </w:rPr>
+            </w:pPr>
+            <w:r>
+              <w:rPr>
+                <w:rFonts w:ascii="Times New Roman" w:hAnsi="Times New Roman" w:cs="Times New Roman"/>
+              </w:rPr>
+              <w:t>Needs to be unique</w:t>
+            </w:r>
+          </w:p>
+        </w:tc>
+        <w:tc>
+          <w:tcPr>
+            <w:tcW w:w="1629" w:type="dxa"/>
+          </w:tcPr>
+          <w:p>
+            <w:pPr>
+              <w:jc w:val="center"/>
+              <w:cnfStyle w:val="000000000000" w:firstRow="0" w:lastRow="0" w:firstColumn="0" w:lastColumn="0" w:oddVBand="0" w:evenVBand="0" w:oddHBand="0" w:evenHBand="0" w:firstRowFirstColumn="0" w:firstRowLastColumn="0" w:lastRowFirstColumn="0" w:lastRowLastColumn="0"/>
+              <w:rPr>
+                <w:rFonts w:ascii="Times New Roman" w:hAnsi="Times New Roman" w:cs="Times New Roman"/>
+                <w:b/>
+                <w:bCs/>
+                <w:sz w:val="28"/>
+                <w:szCs w:val="28"/>
+              </w:rPr>
+            </w:pPr>
+          </w:p>
+          <w:p>
+            <w:pPr>
+              <w:jc w:val="center"/>
+              <w:cnfStyle w:val="000000000000" w:firstRow="0" w:lastRow="0" w:firstColumn="0" w:lastColumn="0" w:oddVBand="0" w:evenVBand="0" w:oddHBand="0" w:evenHBand="0" w:firstRowFirstColumn="0" w:firstRowLastColumn="0" w:lastRowFirstColumn="0" w:lastRowLastColumn="0"/>
+              <w:rPr>
+                <w:rFonts w:ascii="Times New Roman" w:hAnsi="Times New Roman" w:cs="Times New Roman"/>
+                <w:sz w:val="28"/>
+                <w:szCs w:val="28"/>
+              </w:rPr>
+            </w:pPr>
+            <w:r>
+              <w:rPr>
+                <w:rFonts w:ascii="Times New Roman" w:hAnsi="Times New Roman" w:cs="Times New Roman"/>
+                <w:sz w:val="28"/>
+                <w:szCs w:val="28"/>
+              </w:rPr>
+              <w:t>SS-27601</w:t>
+            </w:r>
+          </w:p>
+        </w:tc>
+      </w:tr>
+      <w:tr>
+        <w:tc>
+          <w:tcPr>
+            <w:cnfStyle w:val="001000000000" w:firstRow="0" w:lastRow="0" w:firstColumn="1" w:lastColumn="0" w:oddVBand="0" w:evenVBand="0" w:oddHBand="0" w:evenHBand="0" w:firstRowFirstColumn="0" w:firstRowLastColumn="0" w:lastRowFirstColumn="0" w:lastRowLastColumn="0"/>
+            <w:tcW w:w="2887" w:type="dxa"/>
+          </w:tcPr>
+          <w:p>
+            <w:pPr>
+              <w:jc w:val="center"/>
               <w:rPr>
                 <w:rFonts w:ascii="Times New Roman" w:hAnsi="Times New Roman" w:cs="Times New Roman"/>
                 <w:b w:val="0"/>
                 <w:bCs w:val="0"/>
               </w:rPr>
-              <w:t>swap</w:t>
-            </w:r>
+            </w:pPr>
             <w:r>
               <w:rPr>
                 <w:rFonts w:ascii="Times New Roman" w:hAnsi="Times New Roman" w:cs="Times New Roman"/>
                 <w:b w:val="0"/>
                 <w:bCs w:val="0"/>
               </w:rPr>
-              <w:t>_request_id</w:t>
-            </w:r>
-            <w:proofErr w:type="spellEnd"/>
+              <w:t>requester_employee_id</w:t>
+            </w:r>
           </w:p>
         </w:tc>
         <w:tc>
@@ -227,16 +444,17 @@
           </w:tcPr>
           <w:p>
             <w:pPr>
-              <w:cnfStyle w:val="000000000000" w:firstRow="0" w:lastRow="0" w:firstColumn="0" w:lastColumn="0" w:oddVBand="0" w:evenVBand="0" w:oddHBand="0" w:evenHBand="0" w:firstRowFirstColumn="0" w:firstRowLastColumn="0" w:lastRowFirstColumn="0" w:lastRowLastColumn="0"/>
-              <w:rPr>
-                <w:rFonts w:ascii="Times New Roman" w:hAnsi="Times New Roman" w:cs="Times New Roman"/>
-              </w:rPr>
-            </w:pPr>
-            <w:r>
-              <w:rPr>
-                <w:rFonts w:ascii="Times New Roman" w:hAnsi="Times New Roman" w:cs="Times New Roman"/>
-              </w:rPr>
-              <w:t>Specific identifier for swap request</w:t>
+              <w:jc w:val="center"/>
+              <w:cnfStyle w:val="000000000000" w:firstRow="0" w:lastRow="0" w:firstColumn="0" w:lastColumn="0" w:oddVBand="0" w:evenVBand="0" w:oddHBand="0" w:evenHBand="0" w:firstRowFirstColumn="0" w:firstRowLastColumn="0" w:lastRowFirstColumn="0" w:lastRowLastColumn="0"/>
+              <w:rPr>
+                <w:rFonts w:ascii="Times New Roman" w:hAnsi="Times New Roman" w:cs="Times New Roman"/>
+              </w:rPr>
+            </w:pPr>
+            <w:r>
+              <w:rPr>
+                <w:rFonts w:ascii="Times New Roman" w:hAnsi="Times New Roman" w:cs="Times New Roman"/>
+              </w:rPr>
+              <w:t>ID of the employee who submits the shift-swap request</w:t>
             </w:r>
           </w:p>
         </w:tc>
@@ -246,41 +464,7 @@
           </w:tcPr>
           <w:p>
             <w:pPr>
-              <w:cnfStyle w:val="000000000000" w:firstRow="0" w:lastRow="0" w:firstColumn="0" w:lastColumn="0" w:oddVBand="0" w:evenVBand="0" w:oddHBand="0" w:evenHBand="0" w:firstRowFirstColumn="0" w:firstRowLastColumn="0" w:lastRowFirstColumn="0" w:lastRowLastColumn="0"/>
-              <w:rPr>
-                <w:rFonts w:ascii="Times New Roman" w:hAnsi="Times New Roman" w:cs="Times New Roman"/>
-              </w:rPr>
-            </w:pPr>
-          </w:p>
-          <w:p>
-            <w:pPr>
-              <w:cnfStyle w:val="000000000000" w:firstRow="0" w:lastRow="0" w:firstColumn="0" w:lastColumn="0" w:oddVBand="0" w:evenVBand="0" w:oddHBand="0" w:evenHBand="0" w:firstRowFirstColumn="0" w:firstRowLastColumn="0" w:lastRowFirstColumn="0" w:lastRowLastColumn="0"/>
-              <w:rPr>
-                <w:rFonts w:ascii="Times New Roman" w:hAnsi="Times New Roman" w:cs="Times New Roman"/>
-              </w:rPr>
-            </w:pPr>
-          </w:p>
-          <w:p>
-            <w:pPr>
-              <w:cnfStyle w:val="000000000000" w:firstRow="0" w:lastRow="0" w:firstColumn="0" w:lastColumn="0" w:oddVBand="0" w:evenVBand="0" w:oddHBand="0" w:evenHBand="0" w:firstRowFirstColumn="0" w:firstRowLastColumn="0" w:lastRowFirstColumn="0" w:lastRowLastColumn="0"/>
-              <w:rPr>
-                <w:rFonts w:ascii="Times New Roman" w:hAnsi="Times New Roman" w:cs="Times New Roman"/>
-              </w:rPr>
-            </w:pPr>
-            <w:r>
-              <w:rPr>
-                <w:rFonts w:ascii="Times New Roman" w:hAnsi="Times New Roman" w:cs="Times New Roman"/>
-              </w:rPr>
-              <w:t>String</w:t>
-            </w:r>
-          </w:p>
-        </w:tc>
-        <w:tc>
-          <w:tcPr>
-            <w:tcW w:w="750" w:type="dxa"/>
-          </w:tcPr>
-          <w:p>
-            <w:pPr>
+              <w:jc w:val="center"/>
               <w:cnfStyle w:val="000000000000" w:firstRow="0" w:lastRow="0" w:firstColumn="0" w:lastColumn="0" w:oddVBand="0" w:evenVBand="0" w:oddHBand="0" w:evenHBand="0" w:firstRowFirstColumn="0" w:firstRowLastColumn="0" w:lastRowFirstColumn="0" w:lastRowLastColumn="0"/>
               <w:rPr>
                 <w:rFonts w:ascii="Times New Roman" w:hAnsi="Times New Roman" w:cs="Times New Roman"/>
@@ -293,25 +477,7 @@
           </w:p>
           <w:p>
             <w:pPr>
-              <w:cnfStyle w:val="000000000000" w:firstRow="0" w:lastRow="0" w:firstColumn="0" w:lastColumn="0" w:oddVBand="0" w:evenVBand="0" w:oddHBand="0" w:evenHBand="0" w:firstRowFirstColumn="0" w:firstRowLastColumn="0" w:lastRowFirstColumn="0" w:lastRowLastColumn="0"/>
-              <w:rPr>
-                <w:rFonts w:ascii="Times New Roman" w:hAnsi="Times New Roman" w:cs="Times New Roman"/>
-              </w:rPr>
-            </w:pPr>
-            <w:r>
-              <w:rPr>
-                <w:rFonts w:ascii="Times New Roman" w:hAnsi="Times New Roman" w:cs="Times New Roman"/>
-              </w:rPr>
-              <w:t>Yes</w:t>
-            </w:r>
-          </w:p>
-        </w:tc>
-        <w:tc>
-          <w:tcPr>
-            <w:tcW w:w="1443" w:type="dxa"/>
-          </w:tcPr>
-          <w:p>
-            <w:pPr>
+              <w:jc w:val="center"/>
               <w:cnfStyle w:val="000000000000" w:firstRow="0" w:lastRow="0" w:firstColumn="0" w:lastColumn="0" w:oddVBand="0" w:evenVBand="0" w:oddHBand="0" w:evenHBand="0" w:firstRowFirstColumn="0" w:firstRowLastColumn="0" w:lastRowFirstColumn="0" w:lastRowLastColumn="0"/>
               <w:rPr>
                 <w:rFonts w:ascii="Times New Roman" w:hAnsi="Times New Roman" w:cs="Times New Roman"/>
@@ -324,25 +490,27 @@
           </w:p>
           <w:p>
             <w:pPr>
-              <w:cnfStyle w:val="000000000000" w:firstRow="0" w:lastRow="0" w:firstColumn="0" w:lastColumn="0" w:oddVBand="0" w:evenVBand="0" w:oddHBand="0" w:evenHBand="0" w:firstRowFirstColumn="0" w:firstRowLastColumn="0" w:lastRowFirstColumn="0" w:lastRowLastColumn="0"/>
-              <w:rPr>
-                <w:rFonts w:ascii="Times New Roman" w:hAnsi="Times New Roman" w:cs="Times New Roman"/>
-              </w:rPr>
-            </w:pPr>
-            <w:r>
-              <w:rPr>
-                <w:rFonts w:ascii="Times New Roman" w:hAnsi="Times New Roman" w:cs="Times New Roman"/>
-              </w:rPr>
-              <w:t>Shift management system</w:t>
-            </w:r>
-          </w:p>
-        </w:tc>
-        <w:tc>
-          <w:tcPr>
-            <w:tcW w:w="1870" w:type="dxa"/>
-          </w:tcPr>
-          <w:p>
-            <w:pPr>
+              <w:jc w:val="center"/>
+              <w:cnfStyle w:val="000000000000" w:firstRow="0" w:lastRow="0" w:firstColumn="0" w:lastColumn="0" w:oddVBand="0" w:evenVBand="0" w:oddHBand="0" w:evenHBand="0" w:firstRowFirstColumn="0" w:firstRowLastColumn="0" w:lastRowFirstColumn="0" w:lastRowLastColumn="0"/>
+              <w:rPr>
+                <w:rFonts w:ascii="Times New Roman" w:hAnsi="Times New Roman" w:cs="Times New Roman"/>
+              </w:rPr>
+            </w:pPr>
+            <w:r>
+              <w:rPr>
+                <w:rFonts w:ascii="Times New Roman" w:hAnsi="Times New Roman" w:cs="Times New Roman"/>
+              </w:rPr>
+              <w:t>String</w:t>
+            </w:r>
+          </w:p>
+        </w:tc>
+        <w:tc>
+          <w:tcPr>
+            <w:tcW w:w="750" w:type="dxa"/>
+          </w:tcPr>
+          <w:p>
+            <w:pPr>
+              <w:jc w:val="center"/>
               <w:cnfStyle w:val="000000000000" w:firstRow="0" w:lastRow="0" w:firstColumn="0" w:lastColumn="0" w:oddVBand="0" w:evenVBand="0" w:oddHBand="0" w:evenHBand="0" w:firstRowFirstColumn="0" w:firstRowLastColumn="0" w:lastRowFirstColumn="0" w:lastRowLastColumn="0"/>
               <w:rPr>
                 <w:rFonts w:ascii="Times New Roman" w:hAnsi="Times New Roman" w:cs="Times New Roman"/>
@@ -359,13 +527,125 @@
               <w:cnfStyle w:val="000000000000" w:firstRow="0" w:lastRow="0" w:firstColumn="0" w:lastColumn="0" w:oddVBand="0" w:evenVBand="0" w:oddHBand="0" w:evenHBand="0" w:firstRowFirstColumn="0" w:firstRowLastColumn="0" w:lastRowFirstColumn="0" w:lastRowLastColumn="0"/>
               <w:rPr>
                 <w:rFonts w:ascii="Times New Roman" w:hAnsi="Times New Roman" w:cs="Times New Roman"/>
-              </w:rPr>
-            </w:pPr>
-            <w:r>
-              <w:rPr>
-                <w:rFonts w:ascii="Times New Roman" w:hAnsi="Times New Roman" w:cs="Times New Roman"/>
-              </w:rPr>
-              <w:t>Needs to be unique</w:t>
+                <w:b/>
+                <w:bCs/>
+                <w:sz w:val="32"/>
+                <w:szCs w:val="32"/>
+              </w:rPr>
+            </w:pPr>
+          </w:p>
+          <w:p>
+            <w:pPr>
+              <w:jc w:val="center"/>
+              <w:cnfStyle w:val="000000000000" w:firstRow="0" w:lastRow="0" w:firstColumn="0" w:lastColumn="0" w:oddVBand="0" w:evenVBand="0" w:oddHBand="0" w:evenHBand="0" w:firstRowFirstColumn="0" w:firstRowLastColumn="0" w:lastRowFirstColumn="0" w:lastRowLastColumn="0"/>
+              <w:rPr>
+                <w:rFonts w:ascii="Times New Roman" w:hAnsi="Times New Roman" w:cs="Times New Roman"/>
+              </w:rPr>
+            </w:pPr>
+            <w:r>
+              <w:rPr>
+                <w:rFonts w:ascii="Times New Roman" w:hAnsi="Times New Roman" w:cs="Times New Roman"/>
+              </w:rPr>
+              <w:t>Yes</w:t>
+            </w:r>
+          </w:p>
+        </w:tc>
+        <w:tc>
+          <w:tcPr>
+            <w:tcW w:w="1443" w:type="dxa"/>
+          </w:tcPr>
+          <w:p>
+            <w:pPr>
+              <w:jc w:val="center"/>
+              <w:cnfStyle w:val="000000000000" w:firstRow="0" w:lastRow="0" w:firstColumn="0" w:lastColumn="0" w:oddVBand="0" w:evenVBand="0" w:oddHBand="0" w:evenHBand="0" w:firstRowFirstColumn="0" w:firstRowLastColumn="0" w:lastRowFirstColumn="0" w:lastRowLastColumn="0"/>
+              <w:rPr>
+                <w:rFonts w:ascii="Times New Roman" w:hAnsi="Times New Roman" w:cs="Times New Roman"/>
+                <w:b/>
+                <w:bCs/>
+              </w:rPr>
+            </w:pPr>
+          </w:p>
+          <w:p>
+            <w:pPr>
+              <w:jc w:val="center"/>
+              <w:cnfStyle w:val="000000000000" w:firstRow="0" w:lastRow="0" w:firstColumn="0" w:lastColumn="0" w:oddVBand="0" w:evenVBand="0" w:oddHBand="0" w:evenHBand="0" w:firstRowFirstColumn="0" w:firstRowLastColumn="0" w:lastRowFirstColumn="0" w:lastRowLastColumn="0"/>
+              <w:rPr>
+                <w:rFonts w:ascii="Times New Roman" w:hAnsi="Times New Roman" w:cs="Times New Roman"/>
+                <w:b/>
+                <w:bCs/>
+              </w:rPr>
+            </w:pPr>
+          </w:p>
+          <w:p>
+            <w:pPr>
+              <w:jc w:val="center"/>
+              <w:cnfStyle w:val="000000000000" w:firstRow="0" w:lastRow="0" w:firstColumn="0" w:lastColumn="0" w:oddVBand="0" w:evenVBand="0" w:oddHBand="0" w:evenHBand="0" w:firstRowFirstColumn="0" w:firstRowLastColumn="0" w:lastRowFirstColumn="0" w:lastRowLastColumn="0"/>
+              <w:rPr>
+                <w:rFonts w:ascii="Times New Roman" w:hAnsi="Times New Roman" w:cs="Times New Roman"/>
+                <w:b/>
+                <w:bCs/>
+              </w:rPr>
+            </w:pPr>
+          </w:p>
+          <w:p>
+            <w:pPr>
+              <w:jc w:val="center"/>
+              <w:cnfStyle w:val="000000000000" w:firstRow="0" w:lastRow="0" w:firstColumn="0" w:lastColumn="0" w:oddVBand="0" w:evenVBand="0" w:oddHBand="0" w:evenHBand="0" w:firstRowFirstColumn="0" w:firstRowLastColumn="0" w:lastRowFirstColumn="0" w:lastRowLastColumn="0"/>
+              <w:rPr>
+                <w:rFonts w:ascii="Times New Roman" w:hAnsi="Times New Roman" w:cs="Times New Roman"/>
+              </w:rPr>
+            </w:pPr>
+            <w:r>
+              <w:rPr>
+                <w:rFonts w:ascii="Times New Roman" w:hAnsi="Times New Roman" w:cs="Times New Roman"/>
+              </w:rPr>
+              <w:t>Employee system</w:t>
+            </w:r>
+          </w:p>
+        </w:tc>
+        <w:tc>
+          <w:tcPr>
+            <w:tcW w:w="1870" w:type="dxa"/>
+          </w:tcPr>
+          <w:p>
+            <w:pPr>
+              <w:jc w:val="center"/>
+              <w:cnfStyle w:val="000000000000" w:firstRow="0" w:lastRow="0" w:firstColumn="0" w:lastColumn="0" w:oddVBand="0" w:evenVBand="0" w:oddHBand="0" w:evenHBand="0" w:firstRowFirstColumn="0" w:firstRowLastColumn="0" w:lastRowFirstColumn="0" w:lastRowLastColumn="0"/>
+              <w:rPr>
+                <w:rFonts w:ascii="Times New Roman" w:hAnsi="Times New Roman" w:cs="Times New Roman"/>
+                <w:b/>
+                <w:bCs/>
+                <w:sz w:val="32"/>
+                <w:szCs w:val="32"/>
+              </w:rPr>
+            </w:pPr>
+          </w:p>
+          <w:p>
+            <w:pPr>
+              <w:jc w:val="center"/>
+              <w:cnfStyle w:val="000000000000" w:firstRow="0" w:lastRow="0" w:firstColumn="0" w:lastColumn="0" w:oddVBand="0" w:evenVBand="0" w:oddHBand="0" w:evenHBand="0" w:firstRowFirstColumn="0" w:firstRowLastColumn="0" w:lastRowFirstColumn="0" w:lastRowLastColumn="0"/>
+              <w:rPr>
+                <w:rFonts w:ascii="Times New Roman" w:hAnsi="Times New Roman" w:cs="Times New Roman"/>
+                <w:b/>
+                <w:bCs/>
+                <w:sz w:val="32"/>
+                <w:szCs w:val="32"/>
+              </w:rPr>
+            </w:pPr>
+          </w:p>
+          <w:p>
+            <w:pPr>
+              <w:jc w:val="center"/>
+              <w:cnfStyle w:val="000000000000" w:firstRow="0" w:lastRow="0" w:firstColumn="0" w:lastColumn="0" w:oddVBand="0" w:evenVBand="0" w:oddHBand="0" w:evenHBand="0" w:firstRowFirstColumn="0" w:firstRowLastColumn="0" w:lastRowFirstColumn="0" w:lastRowLastColumn="0"/>
+              <w:rPr>
+                <w:rFonts w:ascii="Times New Roman" w:hAnsi="Times New Roman" w:cs="Times New Roman"/>
+              </w:rPr>
+            </w:pPr>
+            <w:r>
+              <w:rPr>
+                <w:rFonts w:ascii="Times New Roman" w:hAnsi="Times New Roman" w:cs="Times New Roman"/>
+              </w:rPr>
+              <w:t>Must be a valid employee initiating request</w:t>
             </w:r>
           </w:p>
         </w:tc>
@@ -375,32 +655,47 @@
           </w:tcPr>
           <w:p>
             <w:pPr>
-              <w:cnfStyle w:val="000000000000" w:firstRow="0" w:lastRow="0" w:firstColumn="0" w:lastColumn="0" w:oddVBand="0" w:evenVBand="0" w:oddHBand="0" w:evenHBand="0" w:firstRowFirstColumn="0" w:firstRowLastColumn="0" w:lastRowFirstColumn="0" w:lastRowLastColumn="0"/>
-              <w:rPr>
-                <w:rFonts w:ascii="Times New Roman" w:hAnsi="Times New Roman" w:cs="Times New Roman"/>
-                <w:b/>
-                <w:bCs/>
-                <w:sz w:val="28"/>
-                <w:szCs w:val="28"/>
-              </w:rPr>
-            </w:pPr>
-          </w:p>
-          <w:p>
-            <w:pPr>
-              <w:cnfStyle w:val="000000000000" w:firstRow="0" w:lastRow="0" w:firstColumn="0" w:lastColumn="0" w:oddVBand="0" w:evenVBand="0" w:oddHBand="0" w:evenHBand="0" w:firstRowFirstColumn="0" w:firstRowLastColumn="0" w:lastRowFirstColumn="0" w:lastRowLastColumn="0"/>
-              <w:rPr>
-                <w:rFonts w:ascii="Times New Roman" w:hAnsi="Times New Roman" w:cs="Times New Roman"/>
-                <w:sz w:val="28"/>
-                <w:szCs w:val="28"/>
-              </w:rPr>
-            </w:pPr>
-            <w:r>
-              <w:rPr>
-                <w:rFonts w:ascii="Times New Roman" w:hAnsi="Times New Roman" w:cs="Times New Roman"/>
-                <w:sz w:val="28"/>
-                <w:szCs w:val="28"/>
-              </w:rPr>
-              <w:t>SS-27601</w:t>
+              <w:jc w:val="center"/>
+              <w:cnfStyle w:val="000000000000" w:firstRow="0" w:lastRow="0" w:firstColumn="0" w:lastColumn="0" w:oddVBand="0" w:evenVBand="0" w:oddHBand="0" w:evenHBand="0" w:firstRowFirstColumn="0" w:firstRowLastColumn="0" w:lastRowFirstColumn="0" w:lastRowLastColumn="0"/>
+              <w:rPr>
+                <w:rFonts w:ascii="Times New Roman" w:hAnsi="Times New Roman" w:cs="Times New Roman"/>
+                <w:b/>
+                <w:bCs/>
+                <w:sz w:val="28"/>
+                <w:szCs w:val="28"/>
+              </w:rPr>
+            </w:pPr>
+          </w:p>
+          <w:p>
+            <w:pPr>
+              <w:jc w:val="center"/>
+              <w:cnfStyle w:val="000000000000" w:firstRow="0" w:lastRow="0" w:firstColumn="0" w:lastColumn="0" w:oddVBand="0" w:evenVBand="0" w:oddHBand="0" w:evenHBand="0" w:firstRowFirstColumn="0" w:firstRowLastColumn="0" w:lastRowFirstColumn="0" w:lastRowLastColumn="0"/>
+              <w:rPr>
+                <w:rFonts w:ascii="Times New Roman" w:hAnsi="Times New Roman" w:cs="Times New Roman"/>
+                <w:b/>
+                <w:bCs/>
+                <w:sz w:val="28"/>
+                <w:szCs w:val="28"/>
+              </w:rPr>
+            </w:pPr>
+          </w:p>
+          <w:p>
+            <w:pPr>
+              <w:jc w:val="center"/>
+              <w:cnfStyle w:val="000000000000" w:firstRow="0" w:lastRow="0" w:firstColumn="0" w:lastColumn="0" w:oddVBand="0" w:evenVBand="0" w:oddHBand="0" w:evenHBand="0" w:firstRowFirstColumn="0" w:firstRowLastColumn="0" w:lastRowFirstColumn="0" w:lastRowLastColumn="0"/>
+              <w:rPr>
+                <w:rFonts w:ascii="Times New Roman" w:hAnsi="Times New Roman" w:cs="Times New Roman"/>
+                <w:sz w:val="28"/>
+                <w:szCs w:val="28"/>
+              </w:rPr>
+            </w:pPr>
+            <w:r>
+              <w:rPr>
+                <w:rFonts w:ascii="Times New Roman" w:hAnsi="Times New Roman" w:cs="Times New Roman"/>
+                <w:sz w:val="28"/>
+                <w:szCs w:val="28"/>
+              </w:rPr>
+              <w:t>EMP-64412</w:t>
             </w:r>
           </w:p>
         </w:tc>
@@ -413,22 +708,21 @@
           </w:tcPr>
           <w:p>
             <w:pPr>
+              <w:jc w:val="center"/>
               <w:rPr>
                 <w:rFonts w:ascii="Times New Roman" w:hAnsi="Times New Roman" w:cs="Times New Roman"/>
                 <w:b w:val="0"/>
                 <w:bCs w:val="0"/>
               </w:rPr>
             </w:pPr>
-            <w:proofErr w:type="spellStart"/>
             <w:r>
               <w:rPr>
                 <w:rFonts w:ascii="Times New Roman" w:hAnsi="Times New Roman" w:cs="Times New Roman"/>
                 <w:b w:val="0"/>
                 <w:bCs w:val="0"/>
               </w:rPr>
-              <w:t>requester_employee_id</w:t>
-            </w:r>
-            <w:proofErr w:type="spellEnd"/>
+              <w:t>target_employee_id</w:t>
+            </w:r>
           </w:p>
         </w:tc>
         <w:tc>
@@ -437,16 +731,17 @@
           </w:tcPr>
           <w:p>
             <w:pPr>
-              <w:cnfStyle w:val="000000000000" w:firstRow="0" w:lastRow="0" w:firstColumn="0" w:lastColumn="0" w:oddVBand="0" w:evenVBand="0" w:oddHBand="0" w:evenHBand="0" w:firstRowFirstColumn="0" w:firstRowLastColumn="0" w:lastRowFirstColumn="0" w:lastRowLastColumn="0"/>
-              <w:rPr>
-                <w:rFonts w:ascii="Times New Roman" w:hAnsi="Times New Roman" w:cs="Times New Roman"/>
-              </w:rPr>
-            </w:pPr>
-            <w:r>
-              <w:rPr>
-                <w:rFonts w:ascii="Times New Roman" w:hAnsi="Times New Roman" w:cs="Times New Roman"/>
-              </w:rPr>
-              <w:t>The shift the initiating employee wants to swap</w:t>
+              <w:jc w:val="center"/>
+              <w:cnfStyle w:val="000000000000" w:firstRow="0" w:lastRow="0" w:firstColumn="0" w:lastColumn="0" w:oddVBand="0" w:evenVBand="0" w:oddHBand="0" w:evenHBand="0" w:firstRowFirstColumn="0" w:firstRowLastColumn="0" w:lastRowFirstColumn="0" w:lastRowLastColumn="0"/>
+              <w:rPr>
+                <w:rFonts w:ascii="Times New Roman" w:hAnsi="Times New Roman" w:cs="Times New Roman"/>
+              </w:rPr>
+            </w:pPr>
+            <w:r>
+              <w:rPr>
+                <w:rFonts w:ascii="Times New Roman" w:hAnsi="Times New Roman" w:cs="Times New Roman"/>
+              </w:rPr>
+              <w:t>ID of the employee asked to swap shifts with the requester</w:t>
             </w:r>
           </w:p>
         </w:tc>
@@ -456,6 +751,7 @@
           </w:tcPr>
           <w:p>
             <w:pPr>
+              <w:jc w:val="center"/>
               <w:cnfStyle w:val="000000000000" w:firstRow="0" w:lastRow="0" w:firstColumn="0" w:lastColumn="0" w:oddVBand="0" w:evenVBand="0" w:oddHBand="0" w:evenHBand="0" w:firstRowFirstColumn="0" w:firstRowLastColumn="0" w:lastRowFirstColumn="0" w:lastRowLastColumn="0"/>
               <w:rPr>
                 <w:rFonts w:ascii="Times New Roman" w:hAnsi="Times New Roman" w:cs="Times New Roman"/>
@@ -468,6 +764,27 @@
           </w:p>
           <w:p>
             <w:pPr>
+              <w:jc w:val="center"/>
+              <w:cnfStyle w:val="000000000000" w:firstRow="0" w:lastRow="0" w:firstColumn="0" w:lastColumn="0" w:oddVBand="0" w:evenVBand="0" w:oddHBand="0" w:evenHBand="0" w:firstRowFirstColumn="0" w:firstRowLastColumn="0" w:lastRowFirstColumn="0" w:lastRowLastColumn="0"/>
+              <w:rPr>
+                <w:rFonts w:ascii="Times New Roman" w:hAnsi="Times New Roman" w:cs="Times New Roman"/>
+              </w:rPr>
+            </w:pPr>
+            <w:r>
+              <w:rPr>
+                <w:rFonts w:ascii="Times New Roman" w:hAnsi="Times New Roman" w:cs="Times New Roman"/>
+              </w:rPr>
+              <w:t>String</w:t>
+            </w:r>
+          </w:p>
+        </w:tc>
+        <w:tc>
+          <w:tcPr>
+            <w:tcW w:w="750" w:type="dxa"/>
+          </w:tcPr>
+          <w:p>
+            <w:pPr>
+              <w:jc w:val="center"/>
               <w:cnfStyle w:val="000000000000" w:firstRow="0" w:lastRow="0" w:firstColumn="0" w:lastColumn="0" w:oddVBand="0" w:evenVBand="0" w:oddHBand="0" w:evenHBand="0" w:firstRowFirstColumn="0" w:firstRowLastColumn="0" w:lastRowFirstColumn="0" w:lastRowLastColumn="0"/>
               <w:rPr>
                 <w:rFonts w:ascii="Times New Roman" w:hAnsi="Times New Roman" w:cs="Times New Roman"/>
@@ -480,25 +797,27 @@
           </w:p>
           <w:p>
             <w:pPr>
-              <w:cnfStyle w:val="000000000000" w:firstRow="0" w:lastRow="0" w:firstColumn="0" w:lastColumn="0" w:oddVBand="0" w:evenVBand="0" w:oddHBand="0" w:evenHBand="0" w:firstRowFirstColumn="0" w:firstRowLastColumn="0" w:lastRowFirstColumn="0" w:lastRowLastColumn="0"/>
-              <w:rPr>
-                <w:rFonts w:ascii="Times New Roman" w:hAnsi="Times New Roman" w:cs="Times New Roman"/>
-              </w:rPr>
-            </w:pPr>
-            <w:r>
-              <w:rPr>
-                <w:rFonts w:ascii="Times New Roman" w:hAnsi="Times New Roman" w:cs="Times New Roman"/>
-              </w:rPr>
-              <w:t>String</w:t>
-            </w:r>
-          </w:p>
-        </w:tc>
-        <w:tc>
-          <w:tcPr>
-            <w:tcW w:w="750" w:type="dxa"/>
-          </w:tcPr>
-          <w:p>
-            <w:pPr>
+              <w:jc w:val="center"/>
+              <w:cnfStyle w:val="000000000000" w:firstRow="0" w:lastRow="0" w:firstColumn="0" w:lastColumn="0" w:oddVBand="0" w:evenVBand="0" w:oddHBand="0" w:evenHBand="0" w:firstRowFirstColumn="0" w:firstRowLastColumn="0" w:lastRowFirstColumn="0" w:lastRowLastColumn="0"/>
+              <w:rPr>
+                <w:rFonts w:ascii="Times New Roman" w:hAnsi="Times New Roman" w:cs="Times New Roman"/>
+              </w:rPr>
+            </w:pPr>
+            <w:r>
+              <w:rPr>
+                <w:rFonts w:ascii="Times New Roman" w:hAnsi="Times New Roman" w:cs="Times New Roman"/>
+              </w:rPr>
+              <w:t>Yes</w:t>
+            </w:r>
+          </w:p>
+        </w:tc>
+        <w:tc>
+          <w:tcPr>
+            <w:tcW w:w="1443" w:type="dxa"/>
+          </w:tcPr>
+          <w:p>
+            <w:pPr>
+              <w:jc w:val="center"/>
               <w:cnfStyle w:val="000000000000" w:firstRow="0" w:lastRow="0" w:firstColumn="0" w:lastColumn="0" w:oddVBand="0" w:evenVBand="0" w:oddHBand="0" w:evenHBand="0" w:firstRowFirstColumn="0" w:firstRowLastColumn="0" w:lastRowFirstColumn="0" w:lastRowLastColumn="0"/>
               <w:rPr>
                 <w:rFonts w:ascii="Times New Roman" w:hAnsi="Times New Roman" w:cs="Times New Roman"/>
@@ -511,6 +830,27 @@
           </w:p>
           <w:p>
             <w:pPr>
+              <w:jc w:val="center"/>
+              <w:cnfStyle w:val="000000000000" w:firstRow="0" w:lastRow="0" w:firstColumn="0" w:lastColumn="0" w:oddVBand="0" w:evenVBand="0" w:oddHBand="0" w:evenHBand="0" w:firstRowFirstColumn="0" w:firstRowLastColumn="0" w:lastRowFirstColumn="0" w:lastRowLastColumn="0"/>
+              <w:rPr>
+                <w:rFonts w:ascii="Times New Roman" w:hAnsi="Times New Roman" w:cs="Times New Roman"/>
+              </w:rPr>
+            </w:pPr>
+            <w:r>
+              <w:rPr>
+                <w:rFonts w:ascii="Times New Roman" w:hAnsi="Times New Roman" w:cs="Times New Roman"/>
+              </w:rPr>
+              <w:t>Employee system</w:t>
+            </w:r>
+          </w:p>
+        </w:tc>
+        <w:tc>
+          <w:tcPr>
+            <w:tcW w:w="1870" w:type="dxa"/>
+          </w:tcPr>
+          <w:p>
+            <w:pPr>
+              <w:jc w:val="center"/>
               <w:cnfStyle w:val="000000000000" w:firstRow="0" w:lastRow="0" w:firstColumn="0" w:lastColumn="0" w:oddVBand="0" w:evenVBand="0" w:oddHBand="0" w:evenHBand="0" w:firstRowFirstColumn="0" w:firstRowLastColumn="0" w:lastRowFirstColumn="0" w:lastRowLastColumn="0"/>
               <w:rPr>
                 <w:rFonts w:ascii="Times New Roman" w:hAnsi="Times New Roman" w:cs="Times New Roman"/>
@@ -523,6 +863,117 @@
           </w:p>
           <w:p>
             <w:pPr>
+              <w:jc w:val="center"/>
+              <w:cnfStyle w:val="000000000000" w:firstRow="0" w:lastRow="0" w:firstColumn="0" w:lastColumn="0" w:oddVBand="0" w:evenVBand="0" w:oddHBand="0" w:evenHBand="0" w:firstRowFirstColumn="0" w:firstRowLastColumn="0" w:lastRowFirstColumn="0" w:lastRowLastColumn="0"/>
+              <w:rPr>
+                <w:rFonts w:ascii="Times New Roman" w:hAnsi="Times New Roman" w:cs="Times New Roman"/>
+              </w:rPr>
+            </w:pPr>
+            <w:r>
+              <w:rPr>
+                <w:rFonts w:ascii="Times New Roman" w:hAnsi="Times New Roman" w:cs="Times New Roman"/>
+              </w:rPr>
+              <w:t>Must be an active employee and eligible for swap</w:t>
+            </w:r>
+          </w:p>
+        </w:tc>
+        <w:tc>
+          <w:tcPr>
+            <w:tcW w:w="1629" w:type="dxa"/>
+          </w:tcPr>
+          <w:p>
+            <w:pPr>
+              <w:jc w:val="center"/>
+              <w:cnfStyle w:val="000000000000" w:firstRow="0" w:lastRow="0" w:firstColumn="0" w:lastColumn="0" w:oddVBand="0" w:evenVBand="0" w:oddHBand="0" w:evenHBand="0" w:firstRowFirstColumn="0" w:firstRowLastColumn="0" w:lastRowFirstColumn="0" w:lastRowLastColumn="0"/>
+              <w:rPr>
+                <w:rFonts w:ascii="Times New Roman" w:hAnsi="Times New Roman" w:cs="Times New Roman"/>
+                <w:sz w:val="28"/>
+                <w:szCs w:val="28"/>
+              </w:rPr>
+            </w:pPr>
+            <w:r>
+              <w:rPr>
+                <w:rFonts w:ascii="Times New Roman" w:hAnsi="Times New Roman" w:cs="Times New Roman"/>
+                <w:sz w:val="28"/>
+                <w:szCs w:val="28"/>
+              </w:rPr>
+              <w:t>EMP- 58826</w:t>
+            </w:r>
+          </w:p>
+        </w:tc>
+      </w:tr>
+      <w:tr>
+        <w:tc>
+          <w:tcPr>
+            <w:cnfStyle w:val="001000000000" w:firstRow="0" w:lastRow="0" w:firstColumn="1" w:lastColumn="0" w:oddVBand="0" w:evenVBand="0" w:oddHBand="0" w:evenHBand="0" w:firstRowFirstColumn="0" w:firstRowLastColumn="0" w:lastRowFirstColumn="0" w:lastRowLastColumn="0"/>
+            <w:tcW w:w="2887" w:type="dxa"/>
+          </w:tcPr>
+          <w:p>
+            <w:pPr>
+              <w:jc w:val="center"/>
+              <w:rPr>
+                <w:rFonts w:ascii="Times New Roman" w:hAnsi="Times New Roman" w:cs="Times New Roman"/>
+                <w:b w:val="0"/>
+                <w:bCs w:val="0"/>
+              </w:rPr>
+            </w:pPr>
+            <w:r>
+              <w:rPr>
+                <w:rFonts w:ascii="Times New Roman" w:hAnsi="Times New Roman" w:cs="Times New Roman"/>
+                <w:b w:val="0"/>
+                <w:bCs w:val="0"/>
+              </w:rPr>
+              <w:t>requester_shift_start</w:t>
+            </w:r>
+          </w:p>
+        </w:tc>
+        <w:tc>
+          <w:tcPr>
+            <w:tcW w:w="1376" w:type="dxa"/>
+          </w:tcPr>
+          <w:p>
+            <w:pPr>
+              <w:jc w:val="center"/>
+              <w:cnfStyle w:val="000000000000" w:firstRow="0" w:lastRow="0" w:firstColumn="0" w:lastColumn="0" w:oddVBand="0" w:evenVBand="0" w:oddHBand="0" w:evenHBand="0" w:firstRowFirstColumn="0" w:firstRowLastColumn="0" w:lastRowFirstColumn="0" w:lastRowLastColumn="0"/>
+              <w:rPr>
+                <w:rFonts w:ascii="Times New Roman" w:hAnsi="Times New Roman" w:cs="Times New Roman"/>
+              </w:rPr>
+            </w:pPr>
+            <w:r>
+              <w:rPr>
+                <w:rFonts w:ascii="Times New Roman" w:hAnsi="Times New Roman" w:cs="Times New Roman"/>
+              </w:rPr>
+              <w:t>Time that the shift started</w:t>
+            </w:r>
+          </w:p>
+        </w:tc>
+        <w:tc>
+          <w:tcPr>
+            <w:tcW w:w="1168" w:type="dxa"/>
+          </w:tcPr>
+          <w:p>
+            <w:pPr>
+              <w:jc w:val="center"/>
+              <w:cnfStyle w:val="000000000000" w:firstRow="0" w:lastRow="0" w:firstColumn="0" w:lastColumn="0" w:oddVBand="0" w:evenVBand="0" w:oddHBand="0" w:evenHBand="0" w:firstRowFirstColumn="0" w:firstRowLastColumn="0" w:lastRowFirstColumn="0" w:lastRowLastColumn="0"/>
+              <w:rPr>
+                <w:rFonts w:ascii="Times New Roman" w:hAnsi="Times New Roman" w:cs="Times New Roman"/>
+              </w:rPr>
+            </w:pPr>
+            <w:r>
+              <w:rPr>
+                <w:rFonts w:ascii="Times New Roman" w:hAnsi="Times New Roman" w:cs="Times New Roman"/>
+              </w:rPr>
+              <w:t>DateTime</w:t>
+            </w:r>
+          </w:p>
+        </w:tc>
+        <w:tc>
+          <w:tcPr>
+            <w:tcW w:w="750" w:type="dxa"/>
+          </w:tcPr>
+          <w:p>
+            <w:pPr>
+              <w:jc w:val="center"/>
               <w:cnfStyle w:val="000000000000" w:firstRow="0" w:lastRow="0" w:firstColumn="0" w:lastColumn="0" w:oddVBand="0" w:evenVBand="0" w:oddHBand="0" w:evenHBand="0" w:firstRowFirstColumn="0" w:firstRowLastColumn="0" w:lastRowFirstColumn="0" w:lastRowLastColumn="0"/>
               <w:rPr>
                 <w:rFonts w:ascii="Times New Roman" w:hAnsi="Times New Roman" w:cs="Times New Roman"/>
@@ -542,47 +993,17 @@
           </w:tcPr>
           <w:p>
             <w:pPr>
-              <w:cnfStyle w:val="000000000000" w:firstRow="0" w:lastRow="0" w:firstColumn="0" w:lastColumn="0" w:oddVBand="0" w:evenVBand="0" w:oddHBand="0" w:evenHBand="0" w:firstRowFirstColumn="0" w:firstRowLastColumn="0" w:lastRowFirstColumn="0" w:lastRowLastColumn="0"/>
-              <w:rPr>
-                <w:rFonts w:ascii="Times New Roman" w:hAnsi="Times New Roman" w:cs="Times New Roman"/>
-                <w:b/>
-                <w:bCs/>
-              </w:rPr>
-            </w:pPr>
-          </w:p>
-          <w:p>
-            <w:pPr>
-              <w:cnfStyle w:val="000000000000" w:firstRow="0" w:lastRow="0" w:firstColumn="0" w:lastColumn="0" w:oddVBand="0" w:evenVBand="0" w:oddHBand="0" w:evenHBand="0" w:firstRowFirstColumn="0" w:firstRowLastColumn="0" w:lastRowFirstColumn="0" w:lastRowLastColumn="0"/>
-              <w:rPr>
-                <w:rFonts w:ascii="Times New Roman" w:hAnsi="Times New Roman" w:cs="Times New Roman"/>
-                <w:b/>
-                <w:bCs/>
-              </w:rPr>
-            </w:pPr>
-          </w:p>
-          <w:p>
-            <w:pPr>
-              <w:cnfStyle w:val="000000000000" w:firstRow="0" w:lastRow="0" w:firstColumn="0" w:lastColumn="0" w:oddVBand="0" w:evenVBand="0" w:oddHBand="0" w:evenHBand="0" w:firstRowFirstColumn="0" w:firstRowLastColumn="0" w:lastRowFirstColumn="0" w:lastRowLastColumn="0"/>
-              <w:rPr>
-                <w:rFonts w:ascii="Times New Roman" w:hAnsi="Times New Roman" w:cs="Times New Roman"/>
-                <w:b/>
-                <w:bCs/>
-              </w:rPr>
-            </w:pPr>
-          </w:p>
-          <w:p>
-            <w:pPr>
-              <w:jc w:val="center"/>
-              <w:cnfStyle w:val="000000000000" w:firstRow="0" w:lastRow="0" w:firstColumn="0" w:lastColumn="0" w:oddVBand="0" w:evenVBand="0" w:oddHBand="0" w:evenHBand="0" w:firstRowFirstColumn="0" w:firstRowLastColumn="0" w:lastRowFirstColumn="0" w:lastRowLastColumn="0"/>
-              <w:rPr>
-                <w:rFonts w:ascii="Times New Roman" w:hAnsi="Times New Roman" w:cs="Times New Roman"/>
-              </w:rPr>
-            </w:pPr>
-            <w:r>
-              <w:rPr>
-                <w:rFonts w:ascii="Times New Roman" w:hAnsi="Times New Roman" w:cs="Times New Roman"/>
-              </w:rPr>
-              <w:t>Employee system</w:t>
+              <w:jc w:val="center"/>
+              <w:cnfStyle w:val="000000000000" w:firstRow="0" w:lastRow="0" w:firstColumn="0" w:lastColumn="0" w:oddVBand="0" w:evenVBand="0" w:oddHBand="0" w:evenHBand="0" w:firstRowFirstColumn="0" w:firstRowLastColumn="0" w:lastRowFirstColumn="0" w:lastRowLastColumn="0"/>
+              <w:rPr>
+                <w:rFonts w:ascii="Times New Roman" w:hAnsi="Times New Roman" w:cs="Times New Roman"/>
+              </w:rPr>
+            </w:pPr>
+            <w:r>
+              <w:rPr>
+                <w:rFonts w:ascii="Times New Roman" w:hAnsi="Times New Roman" w:cs="Times New Roman"/>
+              </w:rPr>
+              <w:t>Schedule management system</w:t>
             </w:r>
           </w:p>
         </w:tc>
@@ -592,6 +1013,291 @@
           </w:tcPr>
           <w:p>
             <w:pPr>
+              <w:jc w:val="center"/>
+              <w:cnfStyle w:val="000000000000" w:firstRow="0" w:lastRow="0" w:firstColumn="0" w:lastColumn="0" w:oddVBand="0" w:evenVBand="0" w:oddHBand="0" w:evenHBand="0" w:firstRowFirstColumn="0" w:firstRowLastColumn="0" w:lastRowFirstColumn="0" w:lastRowLastColumn="0"/>
+              <w:rPr>
+                <w:rFonts w:ascii="Times New Roman" w:hAnsi="Times New Roman" w:cs="Times New Roman"/>
+              </w:rPr>
+            </w:pPr>
+            <w:r>
+              <w:rPr>
+                <w:rFonts w:ascii="Times New Roman" w:hAnsi="Times New Roman" w:cs="Times New Roman"/>
+              </w:rPr>
+              <w:t>Needs to be before the end time of the shift</w:t>
+            </w:r>
+          </w:p>
+        </w:tc>
+        <w:tc>
+          <w:tcPr>
+            <w:tcW w:w="1629" w:type="dxa"/>
+          </w:tcPr>
+          <w:p>
+            <w:pPr>
+              <w:jc w:val="center"/>
+              <w:cnfStyle w:val="000000000000" w:firstRow="0" w:lastRow="0" w:firstColumn="0" w:lastColumn="0" w:oddVBand="0" w:evenVBand="0" w:oddHBand="0" w:evenHBand="0" w:firstRowFirstColumn="0" w:firstRowLastColumn="0" w:lastRowFirstColumn="0" w:lastRowLastColumn="0"/>
+              <w:rPr>
+                <w:rFonts w:ascii="Times New Roman" w:hAnsi="Times New Roman" w:cs="Times New Roman"/>
+                <w:sz w:val="28"/>
+                <w:szCs w:val="28"/>
+              </w:rPr>
+            </w:pPr>
+            <w:r>
+              <w:rPr>
+                <w:rFonts w:ascii="Times New Roman" w:hAnsi="Times New Roman" w:cs="Times New Roman"/>
+                <w:sz w:val="28"/>
+                <w:szCs w:val="28"/>
+              </w:rPr>
+              <w:t>2026-09</w:t>
+            </w:r>
+            <w:r>
+              <w:rPr>
+                <w:rFonts w:ascii="Times New Roman" w:hAnsi="Times New Roman" w:cs="Times New Roman"/>
+                <w:sz w:val="28"/>
+                <w:szCs w:val="28"/>
+              </w:rPr>
+              <w:t>-</w:t>
+            </w:r>
+            <w:r>
+              <w:rPr>
+                <w:rFonts w:ascii="Times New Roman" w:hAnsi="Times New Roman" w:cs="Times New Roman"/>
+                <w:sz w:val="28"/>
+                <w:szCs w:val="28"/>
+              </w:rPr>
+              <w:t>19</w:t>
+            </w:r>
+          </w:p>
+          <w:p>
+            <w:pPr>
+              <w:jc w:val="center"/>
+              <w:cnfStyle w:val="000000000000" w:firstRow="0" w:lastRow="0" w:firstColumn="0" w:lastColumn="0" w:oddVBand="0" w:evenVBand="0" w:oddHBand="0" w:evenHBand="0" w:firstRowFirstColumn="0" w:firstRowLastColumn="0" w:lastRowFirstColumn="0" w:lastRowLastColumn="0"/>
+              <w:rPr>
+                <w:rFonts w:ascii="Times New Roman" w:hAnsi="Times New Roman" w:cs="Times New Roman"/>
+                <w:sz w:val="28"/>
+                <w:szCs w:val="28"/>
+              </w:rPr>
+            </w:pPr>
+            <w:r>
+              <w:rPr>
+                <w:rFonts w:ascii="Times New Roman" w:hAnsi="Times New Roman" w:cs="Times New Roman"/>
+                <w:sz w:val="28"/>
+                <w:szCs w:val="28"/>
+              </w:rPr>
+              <w:t>09:00</w:t>
+            </w:r>
+          </w:p>
+        </w:tc>
+      </w:tr>
+      <w:tr>
+        <w:tc>
+          <w:tcPr>
+            <w:cnfStyle w:val="001000000000" w:firstRow="0" w:lastRow="0" w:firstColumn="1" w:lastColumn="0" w:oddVBand="0" w:evenVBand="0" w:oddHBand="0" w:evenHBand="0" w:firstRowFirstColumn="0" w:firstRowLastColumn="0" w:lastRowFirstColumn="0" w:lastRowLastColumn="0"/>
+            <w:tcW w:w="2887" w:type="dxa"/>
+          </w:tcPr>
+          <w:p>
+            <w:pPr>
+              <w:jc w:val="center"/>
+              <w:rPr>
+                <w:rFonts w:ascii="Times New Roman" w:hAnsi="Times New Roman" w:cs="Times New Roman"/>
+                <w:b w:val="0"/>
+                <w:bCs w:val="0"/>
+              </w:rPr>
+            </w:pPr>
+            <w:r>
+              <w:rPr>
+                <w:rFonts w:ascii="Times New Roman" w:hAnsi="Times New Roman" w:cs="Times New Roman"/>
+                <w:b w:val="0"/>
+                <w:bCs w:val="0"/>
+              </w:rPr>
+              <w:t>requester_shift_end</w:t>
+            </w:r>
+          </w:p>
+        </w:tc>
+        <w:tc>
+          <w:tcPr>
+            <w:tcW w:w="1376" w:type="dxa"/>
+          </w:tcPr>
+          <w:p>
+            <w:pPr>
+              <w:jc w:val="center"/>
+              <w:cnfStyle w:val="000000000000" w:firstRow="0" w:lastRow="0" w:firstColumn="0" w:lastColumn="0" w:oddVBand="0" w:evenVBand="0" w:oddHBand="0" w:evenHBand="0" w:firstRowFirstColumn="0" w:firstRowLastColumn="0" w:lastRowFirstColumn="0" w:lastRowLastColumn="0"/>
+              <w:rPr>
+                <w:rFonts w:ascii="Times New Roman" w:hAnsi="Times New Roman" w:cs="Times New Roman"/>
+              </w:rPr>
+            </w:pPr>
+            <w:r>
+              <w:rPr>
+                <w:rFonts w:ascii="Times New Roman" w:hAnsi="Times New Roman" w:cs="Times New Roman"/>
+              </w:rPr>
+              <w:t>Time that the shift ends</w:t>
+            </w:r>
+          </w:p>
+        </w:tc>
+        <w:tc>
+          <w:tcPr>
+            <w:tcW w:w="1168" w:type="dxa"/>
+          </w:tcPr>
+          <w:p>
+            <w:pPr>
+              <w:jc w:val="center"/>
+              <w:cnfStyle w:val="000000000000" w:firstRow="0" w:lastRow="0" w:firstColumn="0" w:lastColumn="0" w:oddVBand="0" w:evenVBand="0" w:oddHBand="0" w:evenHBand="0" w:firstRowFirstColumn="0" w:firstRowLastColumn="0" w:lastRowFirstColumn="0" w:lastRowLastColumn="0"/>
+              <w:rPr>
+                <w:rFonts w:ascii="Times New Roman" w:hAnsi="Times New Roman" w:cs="Times New Roman"/>
+              </w:rPr>
+            </w:pPr>
+            <w:r>
+              <w:rPr>
+                <w:rFonts w:ascii="Times New Roman" w:hAnsi="Times New Roman" w:cs="Times New Roman"/>
+              </w:rPr>
+              <w:t>DateTime</w:t>
+            </w:r>
+          </w:p>
+        </w:tc>
+        <w:tc>
+          <w:tcPr>
+            <w:tcW w:w="750" w:type="dxa"/>
+          </w:tcPr>
+          <w:p>
+            <w:pPr>
+              <w:jc w:val="center"/>
+              <w:cnfStyle w:val="000000000000" w:firstRow="0" w:lastRow="0" w:firstColumn="0" w:lastColumn="0" w:oddVBand="0" w:evenVBand="0" w:oddHBand="0" w:evenHBand="0" w:firstRowFirstColumn="0" w:firstRowLastColumn="0" w:lastRowFirstColumn="0" w:lastRowLastColumn="0"/>
+              <w:rPr>
+                <w:rFonts w:ascii="Times New Roman" w:hAnsi="Times New Roman" w:cs="Times New Roman"/>
+              </w:rPr>
+            </w:pPr>
+          </w:p>
+          <w:p>
+            <w:pPr>
+              <w:jc w:val="center"/>
+              <w:cnfStyle w:val="000000000000" w:firstRow="0" w:lastRow="0" w:firstColumn="0" w:lastColumn="0" w:oddVBand="0" w:evenVBand="0" w:oddHBand="0" w:evenHBand="0" w:firstRowFirstColumn="0" w:firstRowLastColumn="0" w:lastRowFirstColumn="0" w:lastRowLastColumn="0"/>
+              <w:rPr>
+                <w:rFonts w:ascii="Times New Roman" w:hAnsi="Times New Roman" w:cs="Times New Roman"/>
+              </w:rPr>
+            </w:pPr>
+            <w:r>
+              <w:rPr>
+                <w:rFonts w:ascii="Times New Roman" w:hAnsi="Times New Roman" w:cs="Times New Roman"/>
+              </w:rPr>
+              <w:t>Yes</w:t>
+            </w:r>
+          </w:p>
+        </w:tc>
+        <w:tc>
+          <w:tcPr>
+            <w:tcW w:w="1443" w:type="dxa"/>
+          </w:tcPr>
+          <w:p>
+            <w:pPr>
+              <w:jc w:val="center"/>
+              <w:cnfStyle w:val="000000000000" w:firstRow="0" w:lastRow="0" w:firstColumn="0" w:lastColumn="0" w:oddVBand="0" w:evenVBand="0" w:oddHBand="0" w:evenHBand="0" w:firstRowFirstColumn="0" w:firstRowLastColumn="0" w:lastRowFirstColumn="0" w:lastRowLastColumn="0"/>
+              <w:rPr>
+                <w:rFonts w:ascii="Times New Roman" w:hAnsi="Times New Roman" w:cs="Times New Roman"/>
+              </w:rPr>
+            </w:pPr>
+            <w:r>
+              <w:rPr>
+                <w:rFonts w:ascii="Times New Roman" w:hAnsi="Times New Roman" w:cs="Times New Roman"/>
+              </w:rPr>
+              <w:t>Schedule management system</w:t>
+            </w:r>
+          </w:p>
+        </w:tc>
+        <w:tc>
+          <w:tcPr>
+            <w:tcW w:w="1870" w:type="dxa"/>
+          </w:tcPr>
+          <w:p>
+            <w:pPr>
+              <w:jc w:val="center"/>
+              <w:cnfStyle w:val="000000000000" w:firstRow="0" w:lastRow="0" w:firstColumn="0" w:lastColumn="0" w:oddVBand="0" w:evenVBand="0" w:oddHBand="0" w:evenHBand="0" w:firstRowFirstColumn="0" w:firstRowLastColumn="0" w:lastRowFirstColumn="0" w:lastRowLastColumn="0"/>
+              <w:rPr>
+                <w:rFonts w:ascii="Times New Roman" w:hAnsi="Times New Roman" w:cs="Times New Roman"/>
+              </w:rPr>
+            </w:pPr>
+            <w:r>
+              <w:rPr>
+                <w:rFonts w:ascii="Times New Roman" w:hAnsi="Times New Roman" w:cs="Times New Roman"/>
+              </w:rPr>
+              <w:t>Needs to be after the start time of the shift</w:t>
+            </w:r>
+          </w:p>
+        </w:tc>
+        <w:tc>
+          <w:tcPr>
+            <w:tcW w:w="1629" w:type="dxa"/>
+          </w:tcPr>
+          <w:p>
+            <w:pPr>
+              <w:jc w:val="center"/>
+              <w:cnfStyle w:val="000000000000" w:firstRow="0" w:lastRow="0" w:firstColumn="0" w:lastColumn="0" w:oddVBand="0" w:evenVBand="0" w:oddHBand="0" w:evenHBand="0" w:firstRowFirstColumn="0" w:firstRowLastColumn="0" w:lastRowFirstColumn="0" w:lastRowLastColumn="0"/>
+              <w:rPr>
+                <w:rFonts w:ascii="Times New Roman" w:hAnsi="Times New Roman" w:cs="Times New Roman"/>
+                <w:sz w:val="28"/>
+                <w:szCs w:val="28"/>
+              </w:rPr>
+            </w:pPr>
+            <w:r>
+              <w:rPr>
+                <w:rFonts w:ascii="Times New Roman" w:hAnsi="Times New Roman" w:cs="Times New Roman"/>
+                <w:sz w:val="28"/>
+                <w:szCs w:val="28"/>
+              </w:rPr>
+              <w:t>2026-09-19 16:00</w:t>
+            </w:r>
+          </w:p>
+        </w:tc>
+      </w:tr>
+      <w:tr>
+        <w:tc>
+          <w:tcPr>
+            <w:cnfStyle w:val="001000000000" w:firstRow="0" w:lastRow="0" w:firstColumn="1" w:lastColumn="0" w:oddVBand="0" w:evenVBand="0" w:oddHBand="0" w:evenHBand="0" w:firstRowFirstColumn="0" w:firstRowLastColumn="0" w:lastRowFirstColumn="0" w:lastRowLastColumn="0"/>
+            <w:tcW w:w="2887" w:type="dxa"/>
+          </w:tcPr>
+          <w:p>
+            <w:pPr>
+              <w:jc w:val="center"/>
+              <w:rPr>
+                <w:rFonts w:ascii="Times New Roman" w:hAnsi="Times New Roman" w:cs="Times New Roman"/>
+                <w:b w:val="0"/>
+                <w:bCs w:val="0"/>
+              </w:rPr>
+            </w:pPr>
+            <w:r>
+              <w:rPr>
+                <w:rFonts w:ascii="Times New Roman" w:hAnsi="Times New Roman" w:cs="Times New Roman"/>
+                <w:b w:val="0"/>
+                <w:bCs w:val="0"/>
+              </w:rPr>
+              <w:t>approval_by</w:t>
+            </w:r>
+          </w:p>
+        </w:tc>
+        <w:tc>
+          <w:tcPr>
+            <w:tcW w:w="1376" w:type="dxa"/>
+          </w:tcPr>
+          <w:p>
+            <w:pPr>
+              <w:jc w:val="center"/>
+              <w:cnfStyle w:val="000000000000" w:firstRow="0" w:lastRow="0" w:firstColumn="0" w:lastColumn="0" w:oddVBand="0" w:evenVBand="0" w:oddHBand="0" w:evenHBand="0" w:firstRowFirstColumn="0" w:firstRowLastColumn="0" w:lastRowFirstColumn="0" w:lastRowLastColumn="0"/>
+              <w:rPr>
+                <w:rFonts w:ascii="Times New Roman" w:hAnsi="Times New Roman" w:cs="Times New Roman"/>
+              </w:rPr>
+            </w:pPr>
+            <w:r>
+              <w:rPr>
+                <w:rFonts w:ascii="Times New Roman" w:hAnsi="Times New Roman" w:cs="Times New Roman"/>
+              </w:rPr>
+              <w:t>Authorizer or manager that approved request</w:t>
+            </w:r>
+          </w:p>
+        </w:tc>
+        <w:tc>
+          <w:tcPr>
+            <w:tcW w:w="1168" w:type="dxa"/>
+          </w:tcPr>
+          <w:p>
+            <w:pPr>
+              <w:jc w:val="center"/>
               <w:cnfStyle w:val="000000000000" w:firstRow="0" w:lastRow="0" w:firstColumn="0" w:lastColumn="0" w:oddVBand="0" w:evenVBand="0" w:oddHBand="0" w:evenHBand="0" w:firstRowFirstColumn="0" w:firstRowLastColumn="0" w:lastRowFirstColumn="0" w:lastRowLastColumn="0"/>
               <w:rPr>
                 <w:rFonts w:ascii="Times New Roman" w:hAnsi="Times New Roman" w:cs="Times New Roman"/>
@@ -604,6 +1310,7 @@
           </w:p>
           <w:p>
             <w:pPr>
+              <w:jc w:val="center"/>
               <w:cnfStyle w:val="000000000000" w:firstRow="0" w:lastRow="0" w:firstColumn="0" w:lastColumn="0" w:oddVBand="0" w:evenVBand="0" w:oddHBand="0" w:evenHBand="0" w:firstRowFirstColumn="0" w:firstRowLastColumn="0" w:lastRowFirstColumn="0" w:lastRowLastColumn="0"/>
               <w:rPr>
                 <w:rFonts w:ascii="Times New Roman" w:hAnsi="Times New Roman" w:cs="Times New Roman"/>
@@ -626,7 +1333,93 @@
               <w:rPr>
                 <w:rFonts w:ascii="Times New Roman" w:hAnsi="Times New Roman" w:cs="Times New Roman"/>
               </w:rPr>
-              <w:t>Must be a valid employee initiating request</w:t>
+              <w:t>String</w:t>
+            </w:r>
+          </w:p>
+        </w:tc>
+        <w:tc>
+          <w:tcPr>
+            <w:tcW w:w="750" w:type="dxa"/>
+          </w:tcPr>
+          <w:p>
+            <w:pPr>
+              <w:jc w:val="center"/>
+              <w:cnfStyle w:val="000000000000" w:firstRow="0" w:lastRow="0" w:firstColumn="0" w:lastColumn="0" w:oddVBand="0" w:evenVBand="0" w:oddHBand="0" w:evenHBand="0" w:firstRowFirstColumn="0" w:firstRowLastColumn="0" w:lastRowFirstColumn="0" w:lastRowLastColumn="0"/>
+              <w:rPr>
+                <w:rFonts w:ascii="Times New Roman" w:hAnsi="Times New Roman" w:cs="Times New Roman"/>
+                <w:b/>
+                <w:bCs/>
+                <w:sz w:val="32"/>
+                <w:szCs w:val="32"/>
+              </w:rPr>
+            </w:pPr>
+          </w:p>
+          <w:p>
+            <w:pPr>
+              <w:jc w:val="center"/>
+              <w:cnfStyle w:val="000000000000" w:firstRow="0" w:lastRow="0" w:firstColumn="0" w:lastColumn="0" w:oddVBand="0" w:evenVBand="0" w:oddHBand="0" w:evenHBand="0" w:firstRowFirstColumn="0" w:firstRowLastColumn="0" w:lastRowFirstColumn="0" w:lastRowLastColumn="0"/>
+              <w:rPr>
+                <w:rFonts w:ascii="Times New Roman" w:hAnsi="Times New Roman" w:cs="Times New Roman"/>
+                <w:b/>
+                <w:bCs/>
+                <w:sz w:val="32"/>
+                <w:szCs w:val="32"/>
+              </w:rPr>
+            </w:pPr>
+          </w:p>
+          <w:p>
+            <w:pPr>
+              <w:jc w:val="center"/>
+              <w:cnfStyle w:val="000000000000" w:firstRow="0" w:lastRow="0" w:firstColumn="0" w:lastColumn="0" w:oddVBand="0" w:evenVBand="0" w:oddHBand="0" w:evenHBand="0" w:firstRowFirstColumn="0" w:firstRowLastColumn="0" w:lastRowFirstColumn="0" w:lastRowLastColumn="0"/>
+              <w:rPr>
+                <w:rFonts w:ascii="Times New Roman" w:hAnsi="Times New Roman" w:cs="Times New Roman"/>
+              </w:rPr>
+            </w:pPr>
+            <w:r>
+              <w:rPr>
+                <w:rFonts w:ascii="Times New Roman" w:hAnsi="Times New Roman" w:cs="Times New Roman"/>
+              </w:rPr>
+              <w:t>No</w:t>
+            </w:r>
+          </w:p>
+        </w:tc>
+        <w:tc>
+          <w:tcPr>
+            <w:tcW w:w="1443" w:type="dxa"/>
+          </w:tcPr>
+          <w:p>
+            <w:pPr>
+              <w:jc w:val="center"/>
+              <w:cnfStyle w:val="000000000000" w:firstRow="0" w:lastRow="0" w:firstColumn="0" w:lastColumn="0" w:oddVBand="0" w:evenVBand="0" w:oddHBand="0" w:evenHBand="0" w:firstRowFirstColumn="0" w:firstRowLastColumn="0" w:lastRowFirstColumn="0" w:lastRowLastColumn="0"/>
+              <w:rPr>
+                <w:rFonts w:ascii="Times New Roman" w:hAnsi="Times New Roman" w:cs="Times New Roman"/>
+              </w:rPr>
+            </w:pPr>
+            <w:r>
+              <w:rPr>
+                <w:rFonts w:ascii="Times New Roman" w:hAnsi="Times New Roman" w:cs="Times New Roman"/>
+              </w:rPr>
+              <w:t>Employee schedule management system</w:t>
+            </w:r>
+          </w:p>
+        </w:tc>
+        <w:tc>
+          <w:tcPr>
+            <w:tcW w:w="1870" w:type="dxa"/>
+          </w:tcPr>
+          <w:p>
+            <w:pPr>
+              <w:jc w:val="center"/>
+              <w:cnfStyle w:val="000000000000" w:firstRow="0" w:lastRow="0" w:firstColumn="0" w:lastColumn="0" w:oddVBand="0" w:evenVBand="0" w:oddHBand="0" w:evenHBand="0" w:firstRowFirstColumn="0" w:firstRowLastColumn="0" w:lastRowFirstColumn="0" w:lastRowLastColumn="0"/>
+              <w:rPr>
+                <w:rFonts w:ascii="Times New Roman" w:hAnsi="Times New Roman" w:cs="Times New Roman"/>
+              </w:rPr>
+            </w:pPr>
+            <w:r>
+              <w:rPr>
+                <w:rFonts w:ascii="Times New Roman" w:hAnsi="Times New Roman" w:cs="Times New Roman"/>
+              </w:rPr>
+              <w:t>Request will need approval from an authorizer</w:t>
             </w:r>
           </w:p>
         </w:tc>
@@ -636,45 +1429,47 @@
           </w:tcPr>
           <w:p>
             <w:pPr>
-              <w:cnfStyle w:val="000000000000" w:firstRow="0" w:lastRow="0" w:firstColumn="0" w:lastColumn="0" w:oddVBand="0" w:evenVBand="0" w:oddHBand="0" w:evenHBand="0" w:firstRowFirstColumn="0" w:firstRowLastColumn="0" w:lastRowFirstColumn="0" w:lastRowLastColumn="0"/>
-              <w:rPr>
-                <w:rFonts w:ascii="Times New Roman" w:hAnsi="Times New Roman" w:cs="Times New Roman"/>
-                <w:b/>
-                <w:bCs/>
-                <w:sz w:val="28"/>
-                <w:szCs w:val="28"/>
-              </w:rPr>
-            </w:pPr>
-          </w:p>
-          <w:p>
-            <w:pPr>
-              <w:cnfStyle w:val="000000000000" w:firstRow="0" w:lastRow="0" w:firstColumn="0" w:lastColumn="0" w:oddVBand="0" w:evenVBand="0" w:oddHBand="0" w:evenHBand="0" w:firstRowFirstColumn="0" w:firstRowLastColumn="0" w:lastRowFirstColumn="0" w:lastRowLastColumn="0"/>
-              <w:rPr>
-                <w:rFonts w:ascii="Times New Roman" w:hAnsi="Times New Roman" w:cs="Times New Roman"/>
-                <w:b/>
-                <w:bCs/>
-                <w:sz w:val="28"/>
-                <w:szCs w:val="28"/>
-              </w:rPr>
-            </w:pPr>
-          </w:p>
-          <w:p>
-            <w:pPr>
-              <w:ind w:firstLine="720"/>
-              <w:cnfStyle w:val="000000000000" w:firstRow="0" w:lastRow="0" w:firstColumn="0" w:lastColumn="0" w:oddVBand="0" w:evenVBand="0" w:oddHBand="0" w:evenHBand="0" w:firstRowFirstColumn="0" w:firstRowLastColumn="0" w:lastRowFirstColumn="0" w:lastRowLastColumn="0"/>
-              <w:rPr>
-                <w:rFonts w:ascii="Times New Roman" w:hAnsi="Times New Roman" w:cs="Times New Roman"/>
-                <w:sz w:val="28"/>
-                <w:szCs w:val="28"/>
-              </w:rPr>
-            </w:pPr>
-            <w:r>
-              <w:rPr>
-                <w:rFonts w:ascii="Times New Roman" w:hAnsi="Times New Roman" w:cs="Times New Roman"/>
-                <w:sz w:val="28"/>
-                <w:szCs w:val="28"/>
-              </w:rPr>
-              <w:t>EMP-64412</w:t>
+              <w:jc w:val="center"/>
+              <w:cnfStyle w:val="000000000000" w:firstRow="0" w:lastRow="0" w:firstColumn="0" w:lastColumn="0" w:oddVBand="0" w:evenVBand="0" w:oddHBand="0" w:evenHBand="0" w:firstRowFirstColumn="0" w:firstRowLastColumn="0" w:lastRowFirstColumn="0" w:lastRowLastColumn="0"/>
+              <w:rPr>
+                <w:rFonts w:ascii="Times New Roman" w:hAnsi="Times New Roman" w:cs="Times New Roman"/>
+                <w:b/>
+                <w:bCs/>
+                <w:sz w:val="32"/>
+                <w:szCs w:val="32"/>
+              </w:rPr>
+            </w:pPr>
+          </w:p>
+          <w:p>
+            <w:pPr>
+              <w:jc w:val="center"/>
+              <w:cnfStyle w:val="000000000000" w:firstRow="0" w:lastRow="0" w:firstColumn="0" w:lastColumn="0" w:oddVBand="0" w:evenVBand="0" w:oddHBand="0" w:evenHBand="0" w:firstRowFirstColumn="0" w:firstRowLastColumn="0" w:lastRowFirstColumn="0" w:lastRowLastColumn="0"/>
+              <w:rPr>
+                <w:rFonts w:ascii="Times New Roman" w:hAnsi="Times New Roman" w:cs="Times New Roman"/>
+                <w:b/>
+                <w:bCs/>
+                <w:sz w:val="32"/>
+                <w:szCs w:val="32"/>
+              </w:rPr>
+            </w:pPr>
+          </w:p>
+          <w:p>
+            <w:pPr>
+              <w:jc w:val="center"/>
+              <w:cnfStyle w:val="000000000000" w:firstRow="0" w:lastRow="0" w:firstColumn="0" w:lastColumn="0" w:oddVBand="0" w:evenVBand="0" w:oddHBand="0" w:evenHBand="0" w:firstRowFirstColumn="0" w:firstRowLastColumn="0" w:lastRowFirstColumn="0" w:lastRowLastColumn="0"/>
+              <w:rPr>
+                <w:rFonts w:ascii="Times New Roman" w:hAnsi="Times New Roman" w:cs="Times New Roman"/>
+                <w:sz w:val="28"/>
+                <w:szCs w:val="28"/>
+              </w:rPr>
+            </w:pPr>
+            <w:r>
+              <w:rPr>
+                <w:rFonts w:ascii="Times New Roman" w:hAnsi="Times New Roman" w:cs="Times New Roman"/>
+                <w:sz w:val="28"/>
+                <w:szCs w:val="28"/>
+              </w:rPr>
+              <w:t>MGR-017</w:t>
             </w:r>
           </w:p>
         </w:tc>
@@ -687,22 +1482,21 @@
           </w:tcPr>
           <w:p>
             <w:pPr>
+              <w:jc w:val="center"/>
               <w:rPr>
                 <w:rFonts w:ascii="Times New Roman" w:hAnsi="Times New Roman" w:cs="Times New Roman"/>
                 <w:b w:val="0"/>
                 <w:bCs w:val="0"/>
               </w:rPr>
             </w:pPr>
-            <w:proofErr w:type="spellStart"/>
             <w:r>
               <w:rPr>
                 <w:rFonts w:ascii="Times New Roman" w:hAnsi="Times New Roman" w:cs="Times New Roman"/>
                 <w:b w:val="0"/>
                 <w:bCs w:val="0"/>
               </w:rPr>
-              <w:t>target_employee_id</w:t>
-            </w:r>
-            <w:proofErr w:type="spellEnd"/>
+              <w:t>approval_required</w:t>
+            </w:r>
           </w:p>
         </w:tc>
         <w:tc>
@@ -711,38 +1505,29 @@
           </w:tcPr>
           <w:p>
             <w:pPr>
-              <w:cnfStyle w:val="000000000000" w:firstRow="0" w:lastRow="0" w:firstColumn="0" w:lastColumn="0" w:oddVBand="0" w:evenVBand="0" w:oddHBand="0" w:evenHBand="0" w:firstRowFirstColumn="0" w:firstRowLastColumn="0" w:lastRowFirstColumn="0" w:lastRowLastColumn="0"/>
-              <w:rPr>
-                <w:rFonts w:ascii="Times New Roman" w:hAnsi="Times New Roman" w:cs="Times New Roman"/>
-              </w:rPr>
-            </w:pPr>
-            <w:proofErr w:type="gramStart"/>
-            <w:r>
-              <w:rPr>
-                <w:rFonts w:ascii="Times New Roman" w:hAnsi="Times New Roman" w:cs="Times New Roman"/>
-              </w:rPr>
-              <w:t>Employee</w:t>
-            </w:r>
-            <w:proofErr w:type="gramEnd"/>
-            <w:r>
-              <w:rPr>
-                <w:rFonts w:ascii="Times New Roman" w:hAnsi="Times New Roman" w:cs="Times New Roman"/>
-              </w:rPr>
-              <w:t xml:space="preserve"> being </w:t>
-            </w:r>
-            <w:proofErr w:type="gramStart"/>
-            <w:r>
-              <w:rPr>
-                <w:rFonts w:ascii="Times New Roman" w:hAnsi="Times New Roman" w:cs="Times New Roman"/>
-              </w:rPr>
-              <w:t>ask</w:t>
-            </w:r>
-            <w:proofErr w:type="gramEnd"/>
-            <w:r>
-              <w:rPr>
-                <w:rFonts w:ascii="Times New Roman" w:hAnsi="Times New Roman" w:cs="Times New Roman"/>
-              </w:rPr>
-              <w:t xml:space="preserve"> to swap shift</w:t>
+              <w:jc w:val="center"/>
+              <w:cnfStyle w:val="000000000000" w:firstRow="0" w:lastRow="0" w:firstColumn="0" w:lastColumn="0" w:oddVBand="0" w:evenVBand="0" w:oddHBand="0" w:evenHBand="0" w:firstRowFirstColumn="0" w:firstRowLastColumn="0" w:lastRowFirstColumn="0" w:lastRowLastColumn="0"/>
+              <w:rPr>
+                <w:rFonts w:ascii="Times New Roman" w:hAnsi="Times New Roman" w:cs="Times New Roman"/>
+              </w:rPr>
+            </w:pPr>
+            <w:r>
+              <w:rPr>
+                <w:rFonts w:ascii="Times New Roman" w:hAnsi="Times New Roman" w:cs="Times New Roman"/>
+              </w:rPr>
+              <w:t>Request shows there needs to be</w:t>
+            </w:r>
+            <w:r>
+              <w:rPr>
+                <w:rFonts w:ascii="Times New Roman" w:hAnsi="Times New Roman" w:cs="Times New Roman"/>
+              </w:rPr>
+              <w:t xml:space="preserve"> </w:t>
+            </w:r>
+            <w:r>
+              <w:rPr>
+                <w:rFonts w:ascii="Times New Roman" w:hAnsi="Times New Roman" w:cs="Times New Roman"/>
+              </w:rPr>
+              <w:t>an authorized approval</w:t>
             </w:r>
           </w:p>
         </w:tc>
@@ -752,6 +1537,7 @@
           </w:tcPr>
           <w:p>
             <w:pPr>
+              <w:jc w:val="center"/>
               <w:cnfStyle w:val="000000000000" w:firstRow="0" w:lastRow="0" w:firstColumn="0" w:lastColumn="0" w:oddVBand="0" w:evenVBand="0" w:oddHBand="0" w:evenHBand="0" w:firstRowFirstColumn="0" w:firstRowLastColumn="0" w:lastRowFirstColumn="0" w:lastRowLastColumn="0"/>
               <w:rPr>
                 <w:rFonts w:ascii="Times New Roman" w:hAnsi="Times New Roman" w:cs="Times New Roman"/>
@@ -764,25 +1550,7 @@
           </w:p>
           <w:p>
             <w:pPr>
-              <w:cnfStyle w:val="000000000000" w:firstRow="0" w:lastRow="0" w:firstColumn="0" w:lastColumn="0" w:oddVBand="0" w:evenVBand="0" w:oddHBand="0" w:evenHBand="0" w:firstRowFirstColumn="0" w:firstRowLastColumn="0" w:lastRowFirstColumn="0" w:lastRowLastColumn="0"/>
-              <w:rPr>
-                <w:rFonts w:ascii="Times New Roman" w:hAnsi="Times New Roman" w:cs="Times New Roman"/>
-              </w:rPr>
-            </w:pPr>
-            <w:r>
-              <w:rPr>
-                <w:rFonts w:ascii="Times New Roman" w:hAnsi="Times New Roman" w:cs="Times New Roman"/>
-              </w:rPr>
-              <w:t>String</w:t>
-            </w:r>
-          </w:p>
-        </w:tc>
-        <w:tc>
-          <w:tcPr>
-            <w:tcW w:w="750" w:type="dxa"/>
-          </w:tcPr>
-          <w:p>
-            <w:pPr>
+              <w:jc w:val="center"/>
               <w:cnfStyle w:val="000000000000" w:firstRow="0" w:lastRow="0" w:firstColumn="0" w:lastColumn="0" w:oddVBand="0" w:evenVBand="0" w:oddHBand="0" w:evenHBand="0" w:firstRowFirstColumn="0" w:firstRowLastColumn="0" w:lastRowFirstColumn="0" w:lastRowLastColumn="0"/>
               <w:rPr>
                 <w:rFonts w:ascii="Times New Roman" w:hAnsi="Times New Roman" w:cs="Times New Roman"/>
@@ -795,25 +1563,38 @@
           </w:p>
           <w:p>
             <w:pPr>
-              <w:cnfStyle w:val="000000000000" w:firstRow="0" w:lastRow="0" w:firstColumn="0" w:lastColumn="0" w:oddVBand="0" w:evenVBand="0" w:oddHBand="0" w:evenHBand="0" w:firstRowFirstColumn="0" w:firstRowLastColumn="0" w:lastRowFirstColumn="0" w:lastRowLastColumn="0"/>
-              <w:rPr>
-                <w:rFonts w:ascii="Times New Roman" w:hAnsi="Times New Roman" w:cs="Times New Roman"/>
-              </w:rPr>
-            </w:pPr>
-            <w:r>
-              <w:rPr>
-                <w:rFonts w:ascii="Times New Roman" w:hAnsi="Times New Roman" w:cs="Times New Roman"/>
-              </w:rPr>
-              <w:t>Yes</w:t>
-            </w:r>
-          </w:p>
-        </w:tc>
-        <w:tc>
-          <w:tcPr>
-            <w:tcW w:w="1443" w:type="dxa"/>
-          </w:tcPr>
-          <w:p>
-            <w:pPr>
+              <w:jc w:val="center"/>
+              <w:cnfStyle w:val="000000000000" w:firstRow="0" w:lastRow="0" w:firstColumn="0" w:lastColumn="0" w:oddVBand="0" w:evenVBand="0" w:oddHBand="0" w:evenHBand="0" w:firstRowFirstColumn="0" w:firstRowLastColumn="0" w:lastRowFirstColumn="0" w:lastRowLastColumn="0"/>
+              <w:rPr>
+                <w:rFonts w:ascii="Times New Roman" w:hAnsi="Times New Roman" w:cs="Times New Roman"/>
+                <w:b/>
+                <w:bCs/>
+              </w:rPr>
+            </w:pPr>
+          </w:p>
+          <w:p>
+            <w:pPr>
+              <w:jc w:val="center"/>
+              <w:cnfStyle w:val="000000000000" w:firstRow="0" w:lastRow="0" w:firstColumn="0" w:lastColumn="0" w:oddVBand="0" w:evenVBand="0" w:oddHBand="0" w:evenHBand="0" w:firstRowFirstColumn="0" w:firstRowLastColumn="0" w:lastRowFirstColumn="0" w:lastRowLastColumn="0"/>
+              <w:rPr>
+                <w:rFonts w:ascii="Times New Roman" w:hAnsi="Times New Roman" w:cs="Times New Roman"/>
+              </w:rPr>
+            </w:pPr>
+            <w:r>
+              <w:rPr>
+                <w:rFonts w:ascii="Times New Roman" w:hAnsi="Times New Roman" w:cs="Times New Roman"/>
+              </w:rPr>
+              <w:t>Boolean</w:t>
+            </w:r>
+          </w:p>
+        </w:tc>
+        <w:tc>
+          <w:tcPr>
+            <w:tcW w:w="750" w:type="dxa"/>
+          </w:tcPr>
+          <w:p>
+            <w:pPr>
+              <w:jc w:val="center"/>
               <w:cnfStyle w:val="000000000000" w:firstRow="0" w:lastRow="0" w:firstColumn="0" w:lastColumn="0" w:oddVBand="0" w:evenVBand="0" w:oddHBand="0" w:evenHBand="0" w:firstRowFirstColumn="0" w:firstRowLastColumn="0" w:lastRowFirstColumn="0" w:lastRowLastColumn="0"/>
               <w:rPr>
                 <w:rFonts w:ascii="Times New Roman" w:hAnsi="Times New Roman" w:cs="Times New Roman"/>
@@ -826,25 +1607,7 @@
           </w:p>
           <w:p>
             <w:pPr>
-              <w:cnfStyle w:val="000000000000" w:firstRow="0" w:lastRow="0" w:firstColumn="0" w:lastColumn="0" w:oddVBand="0" w:evenVBand="0" w:oddHBand="0" w:evenHBand="0" w:firstRowFirstColumn="0" w:firstRowLastColumn="0" w:lastRowFirstColumn="0" w:lastRowLastColumn="0"/>
-              <w:rPr>
-                <w:rFonts w:ascii="Times New Roman" w:hAnsi="Times New Roman" w:cs="Times New Roman"/>
-              </w:rPr>
-            </w:pPr>
-            <w:r>
-              <w:rPr>
-                <w:rFonts w:ascii="Times New Roman" w:hAnsi="Times New Roman" w:cs="Times New Roman"/>
-              </w:rPr>
-              <w:t>Employee system</w:t>
-            </w:r>
-          </w:p>
-        </w:tc>
-        <w:tc>
-          <w:tcPr>
-            <w:tcW w:w="1870" w:type="dxa"/>
-          </w:tcPr>
-          <w:p>
-            <w:pPr>
+              <w:jc w:val="center"/>
               <w:cnfStyle w:val="000000000000" w:firstRow="0" w:lastRow="0" w:firstColumn="0" w:lastColumn="0" w:oddVBand="0" w:evenVBand="0" w:oddHBand="0" w:evenHBand="0" w:firstRowFirstColumn="0" w:firstRowLastColumn="0" w:lastRowFirstColumn="0" w:lastRowLastColumn="0"/>
               <w:rPr>
                 <w:rFonts w:ascii="Times New Roman" w:hAnsi="Times New Roman" w:cs="Times New Roman"/>
@@ -861,457 +1624,6 @@
               <w:cnfStyle w:val="000000000000" w:firstRow="0" w:lastRow="0" w:firstColumn="0" w:lastColumn="0" w:oddVBand="0" w:evenVBand="0" w:oddHBand="0" w:evenHBand="0" w:firstRowFirstColumn="0" w:firstRowLastColumn="0" w:lastRowFirstColumn="0" w:lastRowLastColumn="0"/>
               <w:rPr>
                 <w:rFonts w:ascii="Times New Roman" w:hAnsi="Times New Roman" w:cs="Times New Roman"/>
-              </w:rPr>
-            </w:pPr>
-            <w:r>
-              <w:rPr>
-                <w:rFonts w:ascii="Times New Roman" w:hAnsi="Times New Roman" w:cs="Times New Roman"/>
-              </w:rPr>
-              <w:t>Must be an active employee and eligible for swap</w:t>
-            </w:r>
-          </w:p>
-        </w:tc>
-        <w:tc>
-          <w:tcPr>
-            <w:tcW w:w="1629" w:type="dxa"/>
-          </w:tcPr>
-          <w:p>
-            <w:pPr>
-              <w:cnfStyle w:val="000000000000" w:firstRow="0" w:lastRow="0" w:firstColumn="0" w:lastColumn="0" w:oddVBand="0" w:evenVBand="0" w:oddHBand="0" w:evenHBand="0" w:firstRowFirstColumn="0" w:firstRowLastColumn="0" w:lastRowFirstColumn="0" w:lastRowLastColumn="0"/>
-              <w:rPr>
-                <w:rFonts w:ascii="Times New Roman" w:hAnsi="Times New Roman" w:cs="Times New Roman"/>
-                <w:b/>
-                <w:bCs/>
-                <w:sz w:val="28"/>
-                <w:szCs w:val="28"/>
-              </w:rPr>
-            </w:pPr>
-          </w:p>
-          <w:p>
-            <w:pPr>
-              <w:cnfStyle w:val="000000000000" w:firstRow="0" w:lastRow="0" w:firstColumn="0" w:lastColumn="0" w:oddVBand="0" w:evenVBand="0" w:oddHBand="0" w:evenHBand="0" w:firstRowFirstColumn="0" w:firstRowLastColumn="0" w:lastRowFirstColumn="0" w:lastRowLastColumn="0"/>
-              <w:rPr>
-                <w:rFonts w:ascii="Times New Roman" w:hAnsi="Times New Roman" w:cs="Times New Roman"/>
-                <w:b/>
-                <w:bCs/>
-                <w:sz w:val="28"/>
-                <w:szCs w:val="28"/>
-              </w:rPr>
-            </w:pPr>
-          </w:p>
-          <w:p>
-            <w:pPr>
-              <w:jc w:val="center"/>
-              <w:cnfStyle w:val="000000000000" w:firstRow="0" w:lastRow="0" w:firstColumn="0" w:lastColumn="0" w:oddVBand="0" w:evenVBand="0" w:oddHBand="0" w:evenHBand="0" w:firstRowFirstColumn="0" w:firstRowLastColumn="0" w:lastRowFirstColumn="0" w:lastRowLastColumn="0"/>
-              <w:rPr>
-                <w:rFonts w:ascii="Times New Roman" w:hAnsi="Times New Roman" w:cs="Times New Roman"/>
-                <w:sz w:val="28"/>
-                <w:szCs w:val="28"/>
-              </w:rPr>
-            </w:pPr>
-            <w:r>
-              <w:rPr>
-                <w:rFonts w:ascii="Times New Roman" w:hAnsi="Times New Roman" w:cs="Times New Roman"/>
-                <w:sz w:val="28"/>
-                <w:szCs w:val="28"/>
-              </w:rPr>
-              <w:t>EMP- 58826</w:t>
-            </w:r>
-          </w:p>
-        </w:tc>
-      </w:tr>
-      <w:tr>
-        <w:tc>
-          <w:tcPr>
-            <w:cnfStyle w:val="001000000000" w:firstRow="0" w:lastRow="0" w:firstColumn="1" w:lastColumn="0" w:oddVBand="0" w:evenVBand="0" w:oddHBand="0" w:evenHBand="0" w:firstRowFirstColumn="0" w:firstRowLastColumn="0" w:lastRowFirstColumn="0" w:lastRowLastColumn="0"/>
-            <w:tcW w:w="2887" w:type="dxa"/>
-          </w:tcPr>
-          <w:p>
-            <w:pPr>
-              <w:rPr>
-                <w:rFonts w:ascii="Times New Roman" w:hAnsi="Times New Roman" w:cs="Times New Roman"/>
-                <w:b w:val="0"/>
-                <w:bCs w:val="0"/>
-              </w:rPr>
-            </w:pPr>
-            <w:proofErr w:type="spellStart"/>
-            <w:r>
-              <w:rPr>
-                <w:rFonts w:ascii="Times New Roman" w:hAnsi="Times New Roman" w:cs="Times New Roman"/>
-                <w:b w:val="0"/>
-                <w:bCs w:val="0"/>
-              </w:rPr>
-              <w:t>requester_shift_start</w:t>
-            </w:r>
-            <w:proofErr w:type="spellEnd"/>
-          </w:p>
-        </w:tc>
-        <w:tc>
-          <w:tcPr>
-            <w:tcW w:w="1376" w:type="dxa"/>
-          </w:tcPr>
-          <w:p>
-            <w:pPr>
-              <w:cnfStyle w:val="000000000000" w:firstRow="0" w:lastRow="0" w:firstColumn="0" w:lastColumn="0" w:oddVBand="0" w:evenVBand="0" w:oddHBand="0" w:evenHBand="0" w:firstRowFirstColumn="0" w:firstRowLastColumn="0" w:lastRowFirstColumn="0" w:lastRowLastColumn="0"/>
-              <w:rPr>
-                <w:rFonts w:ascii="Times New Roman" w:hAnsi="Times New Roman" w:cs="Times New Roman"/>
-              </w:rPr>
-            </w:pPr>
-            <w:r>
-              <w:rPr>
-                <w:rFonts w:ascii="Times New Roman" w:hAnsi="Times New Roman" w:cs="Times New Roman"/>
-              </w:rPr>
-              <w:t>Time that the shift started</w:t>
-            </w:r>
-          </w:p>
-        </w:tc>
-        <w:tc>
-          <w:tcPr>
-            <w:tcW w:w="1168" w:type="dxa"/>
-          </w:tcPr>
-          <w:p>
-            <w:pPr>
-              <w:cnfStyle w:val="000000000000" w:firstRow="0" w:lastRow="0" w:firstColumn="0" w:lastColumn="0" w:oddVBand="0" w:evenVBand="0" w:oddHBand="0" w:evenHBand="0" w:firstRowFirstColumn="0" w:firstRowLastColumn="0" w:lastRowFirstColumn="0" w:lastRowLastColumn="0"/>
-              <w:rPr>
-                <w:rFonts w:ascii="Times New Roman" w:hAnsi="Times New Roman" w:cs="Times New Roman"/>
-              </w:rPr>
-            </w:pPr>
-            <w:proofErr w:type="spellStart"/>
-            <w:r>
-              <w:rPr>
-                <w:rFonts w:ascii="Times New Roman" w:hAnsi="Times New Roman" w:cs="Times New Roman"/>
-              </w:rPr>
-              <w:t>DateTime</w:t>
-            </w:r>
-            <w:proofErr w:type="spellEnd"/>
-          </w:p>
-        </w:tc>
-        <w:tc>
-          <w:tcPr>
-            <w:tcW w:w="750" w:type="dxa"/>
-          </w:tcPr>
-          <w:p>
-            <w:pPr>
-              <w:cnfStyle w:val="000000000000" w:firstRow="0" w:lastRow="0" w:firstColumn="0" w:lastColumn="0" w:oddVBand="0" w:evenVBand="0" w:oddHBand="0" w:evenHBand="0" w:firstRowFirstColumn="0" w:firstRowLastColumn="0" w:lastRowFirstColumn="0" w:lastRowLastColumn="0"/>
-              <w:rPr>
-                <w:rFonts w:ascii="Times New Roman" w:hAnsi="Times New Roman" w:cs="Times New Roman"/>
-              </w:rPr>
-            </w:pPr>
-            <w:r>
-              <w:rPr>
-                <w:rFonts w:ascii="Times New Roman" w:hAnsi="Times New Roman" w:cs="Times New Roman"/>
-              </w:rPr>
-              <w:t>Yes</w:t>
-            </w:r>
-          </w:p>
-        </w:tc>
-        <w:tc>
-          <w:tcPr>
-            <w:tcW w:w="1443" w:type="dxa"/>
-          </w:tcPr>
-          <w:p>
-            <w:pPr>
-              <w:cnfStyle w:val="000000000000" w:firstRow="0" w:lastRow="0" w:firstColumn="0" w:lastColumn="0" w:oddVBand="0" w:evenVBand="0" w:oddHBand="0" w:evenHBand="0" w:firstRowFirstColumn="0" w:firstRowLastColumn="0" w:lastRowFirstColumn="0" w:lastRowLastColumn="0"/>
-              <w:rPr>
-                <w:rFonts w:ascii="Times New Roman" w:hAnsi="Times New Roman" w:cs="Times New Roman"/>
-              </w:rPr>
-            </w:pPr>
-            <w:r>
-              <w:rPr>
-                <w:rFonts w:ascii="Times New Roman" w:hAnsi="Times New Roman" w:cs="Times New Roman"/>
-              </w:rPr>
-              <w:t>Schedule management system</w:t>
-            </w:r>
-          </w:p>
-        </w:tc>
-        <w:tc>
-          <w:tcPr>
-            <w:tcW w:w="1870" w:type="dxa"/>
-          </w:tcPr>
-          <w:p>
-            <w:pPr>
-              <w:jc w:val="center"/>
-              <w:cnfStyle w:val="000000000000" w:firstRow="0" w:lastRow="0" w:firstColumn="0" w:lastColumn="0" w:oddVBand="0" w:evenVBand="0" w:oddHBand="0" w:evenHBand="0" w:firstRowFirstColumn="0" w:firstRowLastColumn="0" w:lastRowFirstColumn="0" w:lastRowLastColumn="0"/>
-              <w:rPr>
-                <w:rFonts w:ascii="Times New Roman" w:hAnsi="Times New Roman" w:cs="Times New Roman"/>
-              </w:rPr>
-            </w:pPr>
-            <w:r>
-              <w:rPr>
-                <w:rFonts w:ascii="Times New Roman" w:hAnsi="Times New Roman" w:cs="Times New Roman"/>
-              </w:rPr>
-              <w:t>Needs to be before the end time of the shift</w:t>
-            </w:r>
-          </w:p>
-        </w:tc>
-        <w:tc>
-          <w:tcPr>
-            <w:tcW w:w="1629" w:type="dxa"/>
-          </w:tcPr>
-          <w:p>
-            <w:pPr>
-              <w:cnfStyle w:val="000000000000" w:firstRow="0" w:lastRow="0" w:firstColumn="0" w:lastColumn="0" w:oddVBand="0" w:evenVBand="0" w:oddHBand="0" w:evenHBand="0" w:firstRowFirstColumn="0" w:firstRowLastColumn="0" w:lastRowFirstColumn="0" w:lastRowLastColumn="0"/>
-              <w:rPr>
-                <w:rFonts w:ascii="Times New Roman" w:hAnsi="Times New Roman" w:cs="Times New Roman"/>
-                <w:sz w:val="28"/>
-                <w:szCs w:val="28"/>
-              </w:rPr>
-            </w:pPr>
-            <w:r>
-              <w:rPr>
-                <w:rFonts w:ascii="Times New Roman" w:hAnsi="Times New Roman" w:cs="Times New Roman"/>
-                <w:sz w:val="28"/>
-                <w:szCs w:val="28"/>
-              </w:rPr>
-              <w:t>2026-09</w:t>
-            </w:r>
-            <w:r>
-              <w:rPr>
-                <w:rFonts w:ascii="Times New Roman" w:hAnsi="Times New Roman" w:cs="Times New Roman"/>
-                <w:sz w:val="28"/>
-                <w:szCs w:val="28"/>
-              </w:rPr>
-              <w:t>-</w:t>
-            </w:r>
-            <w:r>
-              <w:rPr>
-                <w:rFonts w:ascii="Times New Roman" w:hAnsi="Times New Roman" w:cs="Times New Roman"/>
-                <w:sz w:val="28"/>
-                <w:szCs w:val="28"/>
-              </w:rPr>
-              <w:t>19</w:t>
-            </w:r>
-          </w:p>
-          <w:p>
-            <w:pPr>
-              <w:jc w:val="center"/>
-              <w:cnfStyle w:val="000000000000" w:firstRow="0" w:lastRow="0" w:firstColumn="0" w:lastColumn="0" w:oddVBand="0" w:evenVBand="0" w:oddHBand="0" w:evenHBand="0" w:firstRowFirstColumn="0" w:firstRowLastColumn="0" w:lastRowFirstColumn="0" w:lastRowLastColumn="0"/>
-              <w:rPr>
-                <w:rFonts w:ascii="Times New Roman" w:hAnsi="Times New Roman" w:cs="Times New Roman"/>
-                <w:sz w:val="28"/>
-                <w:szCs w:val="28"/>
-              </w:rPr>
-            </w:pPr>
-            <w:r>
-              <w:rPr>
-                <w:rFonts w:ascii="Times New Roman" w:hAnsi="Times New Roman" w:cs="Times New Roman"/>
-                <w:sz w:val="28"/>
-                <w:szCs w:val="28"/>
-              </w:rPr>
-              <w:t xml:space="preserve">09:00 </w:t>
-            </w:r>
-          </w:p>
-        </w:tc>
-      </w:tr>
-      <w:tr>
-        <w:tc>
-          <w:tcPr>
-            <w:cnfStyle w:val="001000000000" w:firstRow="0" w:lastRow="0" w:firstColumn="1" w:lastColumn="0" w:oddVBand="0" w:evenVBand="0" w:oddHBand="0" w:evenHBand="0" w:firstRowFirstColumn="0" w:firstRowLastColumn="0" w:lastRowFirstColumn="0" w:lastRowLastColumn="0"/>
-            <w:tcW w:w="2887" w:type="dxa"/>
-          </w:tcPr>
-          <w:p>
-            <w:pPr>
-              <w:rPr>
-                <w:rFonts w:ascii="Times New Roman" w:hAnsi="Times New Roman" w:cs="Times New Roman"/>
-                <w:b w:val="0"/>
-                <w:bCs w:val="0"/>
-              </w:rPr>
-            </w:pPr>
-            <w:proofErr w:type="spellStart"/>
-            <w:r>
-              <w:rPr>
-                <w:rFonts w:ascii="Times New Roman" w:hAnsi="Times New Roman" w:cs="Times New Roman"/>
-                <w:b w:val="0"/>
-                <w:bCs w:val="0"/>
-              </w:rPr>
-              <w:t>requester_shift_end</w:t>
-            </w:r>
-            <w:proofErr w:type="spellEnd"/>
-          </w:p>
-        </w:tc>
-        <w:tc>
-          <w:tcPr>
-            <w:tcW w:w="1376" w:type="dxa"/>
-          </w:tcPr>
-          <w:p>
-            <w:pPr>
-              <w:cnfStyle w:val="000000000000" w:firstRow="0" w:lastRow="0" w:firstColumn="0" w:lastColumn="0" w:oddVBand="0" w:evenVBand="0" w:oddHBand="0" w:evenHBand="0" w:firstRowFirstColumn="0" w:firstRowLastColumn="0" w:lastRowFirstColumn="0" w:lastRowLastColumn="0"/>
-              <w:rPr>
-                <w:rFonts w:ascii="Times New Roman" w:hAnsi="Times New Roman" w:cs="Times New Roman"/>
-              </w:rPr>
-            </w:pPr>
-            <w:r>
-              <w:rPr>
-                <w:rFonts w:ascii="Times New Roman" w:hAnsi="Times New Roman" w:cs="Times New Roman"/>
-              </w:rPr>
-              <w:t>Time that the shift ends</w:t>
-            </w:r>
-          </w:p>
-        </w:tc>
-        <w:tc>
-          <w:tcPr>
-            <w:tcW w:w="1168" w:type="dxa"/>
-          </w:tcPr>
-          <w:p>
-            <w:pPr>
-              <w:cnfStyle w:val="000000000000" w:firstRow="0" w:lastRow="0" w:firstColumn="0" w:lastColumn="0" w:oddVBand="0" w:evenVBand="0" w:oddHBand="0" w:evenHBand="0" w:firstRowFirstColumn="0" w:firstRowLastColumn="0" w:lastRowFirstColumn="0" w:lastRowLastColumn="0"/>
-              <w:rPr>
-                <w:rFonts w:ascii="Times New Roman" w:hAnsi="Times New Roman" w:cs="Times New Roman"/>
-              </w:rPr>
-            </w:pPr>
-            <w:proofErr w:type="spellStart"/>
-            <w:r>
-              <w:rPr>
-                <w:rFonts w:ascii="Times New Roman" w:hAnsi="Times New Roman" w:cs="Times New Roman"/>
-              </w:rPr>
-              <w:t>DateTime</w:t>
-            </w:r>
-            <w:proofErr w:type="spellEnd"/>
-          </w:p>
-        </w:tc>
-        <w:tc>
-          <w:tcPr>
-            <w:tcW w:w="750" w:type="dxa"/>
-          </w:tcPr>
-          <w:p>
-            <w:pPr>
-              <w:cnfStyle w:val="000000000000" w:firstRow="0" w:lastRow="0" w:firstColumn="0" w:lastColumn="0" w:oddVBand="0" w:evenVBand="0" w:oddHBand="0" w:evenHBand="0" w:firstRowFirstColumn="0" w:firstRowLastColumn="0" w:lastRowFirstColumn="0" w:lastRowLastColumn="0"/>
-              <w:rPr>
-                <w:rFonts w:ascii="Times New Roman" w:hAnsi="Times New Roman" w:cs="Times New Roman"/>
-              </w:rPr>
-            </w:pPr>
-          </w:p>
-          <w:p>
-            <w:pPr>
-              <w:cnfStyle w:val="000000000000" w:firstRow="0" w:lastRow="0" w:firstColumn="0" w:lastColumn="0" w:oddVBand="0" w:evenVBand="0" w:oddHBand="0" w:evenHBand="0" w:firstRowFirstColumn="0" w:firstRowLastColumn="0" w:lastRowFirstColumn="0" w:lastRowLastColumn="0"/>
-              <w:rPr>
-                <w:rFonts w:ascii="Times New Roman" w:hAnsi="Times New Roman" w:cs="Times New Roman"/>
-              </w:rPr>
-            </w:pPr>
-            <w:r>
-              <w:rPr>
-                <w:rFonts w:ascii="Times New Roman" w:hAnsi="Times New Roman" w:cs="Times New Roman"/>
-              </w:rPr>
-              <w:t>Yes</w:t>
-            </w:r>
-          </w:p>
-        </w:tc>
-        <w:tc>
-          <w:tcPr>
-            <w:tcW w:w="1443" w:type="dxa"/>
-          </w:tcPr>
-          <w:p>
-            <w:pPr>
-              <w:cnfStyle w:val="000000000000" w:firstRow="0" w:lastRow="0" w:firstColumn="0" w:lastColumn="0" w:oddVBand="0" w:evenVBand="0" w:oddHBand="0" w:evenHBand="0" w:firstRowFirstColumn="0" w:firstRowLastColumn="0" w:lastRowFirstColumn="0" w:lastRowLastColumn="0"/>
-              <w:rPr>
-                <w:rFonts w:ascii="Times New Roman" w:hAnsi="Times New Roman" w:cs="Times New Roman"/>
-              </w:rPr>
-            </w:pPr>
-            <w:r>
-              <w:rPr>
-                <w:rFonts w:ascii="Times New Roman" w:hAnsi="Times New Roman" w:cs="Times New Roman"/>
-              </w:rPr>
-              <w:t>Schedule management system</w:t>
-            </w:r>
-          </w:p>
-        </w:tc>
-        <w:tc>
-          <w:tcPr>
-            <w:tcW w:w="1870" w:type="dxa"/>
-          </w:tcPr>
-          <w:p>
-            <w:pPr>
-              <w:cnfStyle w:val="000000000000" w:firstRow="0" w:lastRow="0" w:firstColumn="0" w:lastColumn="0" w:oddVBand="0" w:evenVBand="0" w:oddHBand="0" w:evenHBand="0" w:firstRowFirstColumn="0" w:firstRowLastColumn="0" w:lastRowFirstColumn="0" w:lastRowLastColumn="0"/>
-              <w:rPr>
-                <w:rFonts w:ascii="Times New Roman" w:hAnsi="Times New Roman" w:cs="Times New Roman"/>
-              </w:rPr>
-            </w:pPr>
-            <w:r>
-              <w:rPr>
-                <w:rFonts w:ascii="Times New Roman" w:hAnsi="Times New Roman" w:cs="Times New Roman"/>
-              </w:rPr>
-              <w:t>Needs to be after the start time of the shift</w:t>
-            </w:r>
-          </w:p>
-        </w:tc>
-        <w:tc>
-          <w:tcPr>
-            <w:tcW w:w="1629" w:type="dxa"/>
-          </w:tcPr>
-          <w:p>
-            <w:pPr>
-              <w:cnfStyle w:val="000000000000" w:firstRow="0" w:lastRow="0" w:firstColumn="0" w:lastColumn="0" w:oddVBand="0" w:evenVBand="0" w:oddHBand="0" w:evenHBand="0" w:firstRowFirstColumn="0" w:firstRowLastColumn="0" w:lastRowFirstColumn="0" w:lastRowLastColumn="0"/>
-              <w:rPr>
-                <w:rFonts w:ascii="Times New Roman" w:hAnsi="Times New Roman" w:cs="Times New Roman"/>
-                <w:sz w:val="28"/>
-                <w:szCs w:val="28"/>
-              </w:rPr>
-            </w:pPr>
-            <w:r>
-              <w:rPr>
-                <w:rFonts w:ascii="Times New Roman" w:hAnsi="Times New Roman" w:cs="Times New Roman"/>
-                <w:sz w:val="28"/>
-                <w:szCs w:val="28"/>
-              </w:rPr>
-              <w:t>2026-09-19 16:00</w:t>
-            </w:r>
-          </w:p>
-        </w:tc>
-      </w:tr>
-      <w:tr>
-        <w:tc>
-          <w:tcPr>
-            <w:cnfStyle w:val="001000000000" w:firstRow="0" w:lastRow="0" w:firstColumn="1" w:lastColumn="0" w:oddVBand="0" w:evenVBand="0" w:oddHBand="0" w:evenHBand="0" w:firstRowFirstColumn="0" w:firstRowLastColumn="0" w:lastRowFirstColumn="0" w:lastRowLastColumn="0"/>
-            <w:tcW w:w="2887" w:type="dxa"/>
-          </w:tcPr>
-          <w:p>
-            <w:pPr>
-              <w:rPr>
-                <w:rFonts w:ascii="Times New Roman" w:hAnsi="Times New Roman" w:cs="Times New Roman"/>
-                <w:b w:val="0"/>
-                <w:bCs w:val="0"/>
-              </w:rPr>
-            </w:pPr>
-            <w:proofErr w:type="spellStart"/>
-            <w:r>
-              <w:rPr>
-                <w:rFonts w:ascii="Times New Roman" w:hAnsi="Times New Roman" w:cs="Times New Roman"/>
-                <w:b w:val="0"/>
-                <w:bCs w:val="0"/>
-              </w:rPr>
-              <w:t>approval_by</w:t>
-            </w:r>
-            <w:proofErr w:type="spellEnd"/>
-          </w:p>
-        </w:tc>
-        <w:tc>
-          <w:tcPr>
-            <w:tcW w:w="1376" w:type="dxa"/>
-          </w:tcPr>
-          <w:p>
-            <w:pPr>
-              <w:cnfStyle w:val="000000000000" w:firstRow="0" w:lastRow="0" w:firstColumn="0" w:lastColumn="0" w:oddVBand="0" w:evenVBand="0" w:oddHBand="0" w:evenHBand="0" w:firstRowFirstColumn="0" w:firstRowLastColumn="0" w:lastRowFirstColumn="0" w:lastRowLastColumn="0"/>
-              <w:rPr>
-                <w:rFonts w:ascii="Times New Roman" w:hAnsi="Times New Roman" w:cs="Times New Roman"/>
-              </w:rPr>
-            </w:pPr>
-            <w:r>
-              <w:rPr>
-                <w:rFonts w:ascii="Times New Roman" w:hAnsi="Times New Roman" w:cs="Times New Roman"/>
-              </w:rPr>
-              <w:t>Authorizer or manager that approved request</w:t>
-            </w:r>
-          </w:p>
-        </w:tc>
-        <w:tc>
-          <w:tcPr>
-            <w:tcW w:w="1168" w:type="dxa"/>
-          </w:tcPr>
-          <w:p>
-            <w:pPr>
-              <w:cnfStyle w:val="000000000000" w:firstRow="0" w:lastRow="0" w:firstColumn="0" w:lastColumn="0" w:oddVBand="0" w:evenVBand="0" w:oddHBand="0" w:evenHBand="0" w:firstRowFirstColumn="0" w:firstRowLastColumn="0" w:lastRowFirstColumn="0" w:lastRowLastColumn="0"/>
-              <w:rPr>
-                <w:rFonts w:ascii="Times New Roman" w:hAnsi="Times New Roman" w:cs="Times New Roman"/>
                 <w:b/>
                 <w:bCs/>
                 <w:sz w:val="32"/>
@@ -1321,11 +1633,30 @@
           </w:p>
           <w:p>
             <w:pPr>
-              <w:cnfStyle w:val="000000000000" w:firstRow="0" w:lastRow="0" w:firstColumn="0" w:lastColumn="0" w:oddVBand="0" w:evenVBand="0" w:oddHBand="0" w:evenHBand="0" w:firstRowFirstColumn="0" w:firstRowLastColumn="0" w:lastRowFirstColumn="0" w:lastRowLastColumn="0"/>
-              <w:rPr>
-                <w:rFonts w:ascii="Times New Roman" w:hAnsi="Times New Roman" w:cs="Times New Roman"/>
-                <w:b/>
-                <w:bCs/>
+              <w:jc w:val="center"/>
+              <w:cnfStyle w:val="000000000000" w:firstRow="0" w:lastRow="0" w:firstColumn="0" w:lastColumn="0" w:oddVBand="0" w:evenVBand="0" w:oddHBand="0" w:evenHBand="0" w:firstRowFirstColumn="0" w:firstRowLastColumn="0" w:lastRowFirstColumn="0" w:lastRowLastColumn="0"/>
+              <w:rPr>
+                <w:rFonts w:ascii="Times New Roman" w:hAnsi="Times New Roman" w:cs="Times New Roman"/>
+              </w:rPr>
+            </w:pPr>
+            <w:r>
+              <w:rPr>
+                <w:rFonts w:ascii="Times New Roman" w:hAnsi="Times New Roman" w:cs="Times New Roman"/>
+              </w:rPr>
+              <w:t>Yes</w:t>
+            </w:r>
+          </w:p>
+        </w:tc>
+        <w:tc>
+          <w:tcPr>
+            <w:tcW w:w="1443" w:type="dxa"/>
+          </w:tcPr>
+          <w:p>
+            <w:pPr>
+              <w:jc w:val="center"/>
+              <w:cnfStyle w:val="000000000000" w:firstRow="0" w:lastRow="0" w:firstColumn="0" w:lastColumn="0" w:oddVBand="0" w:evenVBand="0" w:oddHBand="0" w:evenHBand="0" w:firstRowFirstColumn="0" w:firstRowLastColumn="0" w:lastRowFirstColumn="0" w:lastRowLastColumn="0"/>
+              <w:rPr>
+                <w:rFonts w:ascii="Times New Roman" w:hAnsi="Times New Roman" w:cs="Times New Roman"/>
                 <w:sz w:val="32"/>
                 <w:szCs w:val="32"/>
               </w:rPr>
@@ -1333,30 +1664,10 @@
           </w:p>
           <w:p>
             <w:pPr>
-              <w:cnfStyle w:val="000000000000" w:firstRow="0" w:lastRow="0" w:firstColumn="0" w:lastColumn="0" w:oddVBand="0" w:evenVBand="0" w:oddHBand="0" w:evenHBand="0" w:firstRowFirstColumn="0" w:firstRowLastColumn="0" w:lastRowFirstColumn="0" w:lastRowLastColumn="0"/>
-              <w:rPr>
-                <w:rFonts w:ascii="Times New Roman" w:hAnsi="Times New Roman" w:cs="Times New Roman"/>
-              </w:rPr>
-            </w:pPr>
-            <w:r>
-              <w:rPr>
-                <w:rFonts w:ascii="Times New Roman" w:hAnsi="Times New Roman" w:cs="Times New Roman"/>
-              </w:rPr>
-              <w:t>String</w:t>
-            </w:r>
-          </w:p>
-        </w:tc>
-        <w:tc>
-          <w:tcPr>
-            <w:tcW w:w="750" w:type="dxa"/>
-          </w:tcPr>
-          <w:p>
-            <w:pPr>
-              <w:cnfStyle w:val="000000000000" w:firstRow="0" w:lastRow="0" w:firstColumn="0" w:lastColumn="0" w:oddVBand="0" w:evenVBand="0" w:oddHBand="0" w:evenHBand="0" w:firstRowFirstColumn="0" w:firstRowLastColumn="0" w:lastRowFirstColumn="0" w:lastRowLastColumn="0"/>
-              <w:rPr>
-                <w:rFonts w:ascii="Times New Roman" w:hAnsi="Times New Roman" w:cs="Times New Roman"/>
-                <w:b/>
-                <w:bCs/>
+              <w:jc w:val="center"/>
+              <w:cnfStyle w:val="000000000000" w:firstRow="0" w:lastRow="0" w:firstColumn="0" w:lastColumn="0" w:oddVBand="0" w:evenVBand="0" w:oddHBand="0" w:evenHBand="0" w:firstRowFirstColumn="0" w:firstRowLastColumn="0" w:lastRowFirstColumn="0" w:lastRowLastColumn="0"/>
+              <w:rPr>
+                <w:rFonts w:ascii="Times New Roman" w:hAnsi="Times New Roman" w:cs="Times New Roman"/>
                 <w:sz w:val="32"/>
                 <w:szCs w:val="32"/>
               </w:rPr>
@@ -1364,6 +1675,27 @@
           </w:p>
           <w:p>
             <w:pPr>
+              <w:jc w:val="center"/>
+              <w:cnfStyle w:val="000000000000" w:firstRow="0" w:lastRow="0" w:firstColumn="0" w:lastColumn="0" w:oddVBand="0" w:evenVBand="0" w:oddHBand="0" w:evenHBand="0" w:firstRowFirstColumn="0" w:firstRowLastColumn="0" w:lastRowFirstColumn="0" w:lastRowLastColumn="0"/>
+              <w:rPr>
+                <w:rFonts w:ascii="Times New Roman" w:hAnsi="Times New Roman" w:cs="Times New Roman"/>
+              </w:rPr>
+            </w:pPr>
+            <w:r>
+              <w:rPr>
+                <w:rFonts w:ascii="Times New Roman" w:hAnsi="Times New Roman" w:cs="Times New Roman"/>
+              </w:rPr>
+              <w:t>Business rules</w:t>
+            </w:r>
+          </w:p>
+        </w:tc>
+        <w:tc>
+          <w:tcPr>
+            <w:tcW w:w="1870" w:type="dxa"/>
+          </w:tcPr>
+          <w:p>
+            <w:pPr>
+              <w:jc w:val="center"/>
               <w:cnfStyle w:val="000000000000" w:firstRow="0" w:lastRow="0" w:firstColumn="0" w:lastColumn="0" w:oddVBand="0" w:evenVBand="0" w:oddHBand="0" w:evenHBand="0" w:firstRowFirstColumn="0" w:firstRowLastColumn="0" w:lastRowFirstColumn="0" w:lastRowLastColumn="0"/>
               <w:rPr>
                 <w:rFonts w:ascii="Times New Roman" w:hAnsi="Times New Roman" w:cs="Times New Roman"/>
@@ -1373,57 +1705,17 @@
                 <w:szCs w:val="32"/>
               </w:rPr>
             </w:pPr>
-          </w:p>
-          <w:p>
-            <w:pPr>
-              <w:cnfStyle w:val="000000000000" w:firstRow="0" w:lastRow="0" w:firstColumn="0" w:lastColumn="0" w:oddVBand="0" w:evenVBand="0" w:oddHBand="0" w:evenHBand="0" w:firstRowFirstColumn="0" w:firstRowLastColumn="0" w:lastRowFirstColumn="0" w:lastRowLastColumn="0"/>
-              <w:rPr>
-                <w:rFonts w:ascii="Times New Roman" w:hAnsi="Times New Roman" w:cs="Times New Roman"/>
-              </w:rPr>
-            </w:pPr>
-            <w:r>
-              <w:rPr>
-                <w:rFonts w:ascii="Times New Roman" w:hAnsi="Times New Roman" w:cs="Times New Roman"/>
-              </w:rPr>
-              <w:t>No</w:t>
-            </w:r>
-          </w:p>
-        </w:tc>
-        <w:tc>
-          <w:tcPr>
-            <w:tcW w:w="1443" w:type="dxa"/>
-          </w:tcPr>
-          <w:p>
-            <w:pPr>
-              <w:cnfStyle w:val="000000000000" w:firstRow="0" w:lastRow="0" w:firstColumn="0" w:lastColumn="0" w:oddVBand="0" w:evenVBand="0" w:oddHBand="0" w:evenHBand="0" w:firstRowFirstColumn="0" w:firstRowLastColumn="0" w:lastRowFirstColumn="0" w:lastRowLastColumn="0"/>
-              <w:rPr>
-                <w:rFonts w:ascii="Times New Roman" w:hAnsi="Times New Roman" w:cs="Times New Roman"/>
-              </w:rPr>
-            </w:pPr>
-            <w:r>
-              <w:rPr>
-                <w:rFonts w:ascii="Times New Roman" w:hAnsi="Times New Roman" w:cs="Times New Roman"/>
-              </w:rPr>
-              <w:t>Employee schedule management system</w:t>
-            </w:r>
-          </w:p>
-        </w:tc>
-        <w:tc>
-          <w:tcPr>
-            <w:tcW w:w="1870" w:type="dxa"/>
-          </w:tcPr>
-          <w:p>
-            <w:pPr>
-              <w:cnfStyle w:val="000000000000" w:firstRow="0" w:lastRow="0" w:firstColumn="0" w:lastColumn="0" w:oddVBand="0" w:evenVBand="0" w:oddHBand="0" w:evenHBand="0" w:firstRowFirstColumn="0" w:firstRowLastColumn="0" w:lastRowFirstColumn="0" w:lastRowLastColumn="0"/>
-              <w:rPr>
-                <w:rFonts w:ascii="Times New Roman" w:hAnsi="Times New Roman" w:cs="Times New Roman"/>
-              </w:rPr>
-            </w:pPr>
-            <w:r>
-              <w:rPr>
-                <w:rFonts w:ascii="Times New Roman" w:hAnsi="Times New Roman" w:cs="Times New Roman"/>
-              </w:rPr>
-              <w:t>Request will need approval from an authorizer</w:t>
+            <w:r>
+              <w:rPr>
+                <w:rFonts w:ascii="Times New Roman" w:hAnsi="Times New Roman" w:cs="Times New Roman"/>
+              </w:rPr>
+              <w:t>If</w:t>
+            </w:r>
+            <w:r>
+              <w:rPr>
+                <w:rFonts w:ascii="Times New Roman" w:hAnsi="Times New Roman" w:cs="Times New Roman"/>
+              </w:rPr>
+              <w:t xml:space="preserve"> true, a manager must review the request before it can move to APPROVED</w:t>
             </w:r>
           </w:p>
         </w:tc>
@@ -1433,6 +1725,7 @@
           </w:tcPr>
           <w:p>
             <w:pPr>
+              <w:jc w:val="center"/>
               <w:cnfStyle w:val="000000000000" w:firstRow="0" w:lastRow="0" w:firstColumn="0" w:lastColumn="0" w:oddVBand="0" w:evenVBand="0" w:oddHBand="0" w:evenHBand="0" w:firstRowFirstColumn="0" w:firstRowLastColumn="0" w:lastRowFirstColumn="0" w:lastRowLastColumn="0"/>
               <w:rPr>
                 <w:rFonts w:ascii="Times New Roman" w:hAnsi="Times New Roman" w:cs="Times New Roman"/>
@@ -1445,6 +1738,7 @@
           </w:p>
           <w:p>
             <w:pPr>
+              <w:jc w:val="center"/>
               <w:cnfStyle w:val="000000000000" w:firstRow="0" w:lastRow="0" w:firstColumn="0" w:lastColumn="0" w:oddVBand="0" w:evenVBand="0" w:oddHBand="0" w:evenHBand="0" w:firstRowFirstColumn="0" w:firstRowLastColumn="0" w:lastRowFirstColumn="0" w:lastRowLastColumn="0"/>
               <w:rPr>
                 <w:rFonts w:ascii="Times New Roman" w:hAnsi="Times New Roman" w:cs="Times New Roman"/>
@@ -1461,317 +1755,17 @@
               <w:cnfStyle w:val="000000000000" w:firstRow="0" w:lastRow="0" w:firstColumn="0" w:lastColumn="0" w:oddVBand="0" w:evenVBand="0" w:oddHBand="0" w:evenHBand="0" w:firstRowFirstColumn="0" w:firstRowLastColumn="0" w:lastRowFirstColumn="0" w:lastRowLastColumn="0"/>
               <w:rPr>
                 <w:rFonts w:ascii="Times New Roman" w:hAnsi="Times New Roman" w:cs="Times New Roman"/>
-                <w:sz w:val="32"/>
-                <w:szCs w:val="32"/>
-              </w:rPr>
-            </w:pPr>
-            <w:r>
-              <w:rPr>
-                <w:rFonts w:ascii="Times New Roman" w:hAnsi="Times New Roman" w:cs="Times New Roman"/>
-                <w:sz w:val="32"/>
-                <w:szCs w:val="32"/>
-              </w:rPr>
-              <w:t>MGR-017</w:t>
-            </w:r>
-          </w:p>
-        </w:tc>
-      </w:tr>
-      <w:tr>
-        <w:tc>
-          <w:tcPr>
-            <w:cnfStyle w:val="001000000000" w:firstRow="0" w:lastRow="0" w:firstColumn="1" w:lastColumn="0" w:oddVBand="0" w:evenVBand="0" w:oddHBand="0" w:evenHBand="0" w:firstRowFirstColumn="0" w:firstRowLastColumn="0" w:lastRowFirstColumn="0" w:lastRowLastColumn="0"/>
-            <w:tcW w:w="2887" w:type="dxa"/>
-          </w:tcPr>
-          <w:p>
-            <w:pPr>
-              <w:rPr>
-                <w:rFonts w:ascii="Times New Roman" w:hAnsi="Times New Roman" w:cs="Times New Roman"/>
-                <w:b w:val="0"/>
-                <w:bCs w:val="0"/>
-              </w:rPr>
-            </w:pPr>
-            <w:proofErr w:type="spellStart"/>
-            <w:r>
-              <w:rPr>
-                <w:rFonts w:ascii="Times New Roman" w:hAnsi="Times New Roman" w:cs="Times New Roman"/>
-                <w:b w:val="0"/>
-                <w:bCs w:val="0"/>
-              </w:rPr>
-              <w:t>approval_required</w:t>
-            </w:r>
-            <w:proofErr w:type="spellEnd"/>
-          </w:p>
-        </w:tc>
-        <w:tc>
-          <w:tcPr>
-            <w:tcW w:w="1376" w:type="dxa"/>
-          </w:tcPr>
-          <w:p>
-            <w:pPr>
-              <w:cnfStyle w:val="000000000000" w:firstRow="0" w:lastRow="0" w:firstColumn="0" w:lastColumn="0" w:oddVBand="0" w:evenVBand="0" w:oddHBand="0" w:evenHBand="0" w:firstRowFirstColumn="0" w:firstRowLastColumn="0" w:lastRowFirstColumn="0" w:lastRowLastColumn="0"/>
-              <w:rPr>
-                <w:rFonts w:ascii="Times New Roman" w:hAnsi="Times New Roman" w:cs="Times New Roman"/>
-              </w:rPr>
-            </w:pPr>
-            <w:r>
-              <w:rPr>
-                <w:rFonts w:ascii="Times New Roman" w:hAnsi="Times New Roman" w:cs="Times New Roman"/>
-              </w:rPr>
-              <w:t>Request shows there needs to be</w:t>
-            </w:r>
-            <w:r>
-              <w:rPr>
-                <w:rFonts w:ascii="Times New Roman" w:hAnsi="Times New Roman" w:cs="Times New Roman"/>
-              </w:rPr>
-              <w:t xml:space="preserve"> </w:t>
-            </w:r>
-            <w:r>
-              <w:rPr>
-                <w:rFonts w:ascii="Times New Roman" w:hAnsi="Times New Roman" w:cs="Times New Roman"/>
-              </w:rPr>
-              <w:t>an authorized approval</w:t>
-            </w:r>
-          </w:p>
-        </w:tc>
-        <w:tc>
-          <w:tcPr>
-            <w:tcW w:w="1168" w:type="dxa"/>
-          </w:tcPr>
-          <w:p>
-            <w:pPr>
-              <w:cnfStyle w:val="000000000000" w:firstRow="0" w:lastRow="0" w:firstColumn="0" w:lastColumn="0" w:oddVBand="0" w:evenVBand="0" w:oddHBand="0" w:evenHBand="0" w:firstRowFirstColumn="0" w:firstRowLastColumn="0" w:lastRowFirstColumn="0" w:lastRowLastColumn="0"/>
-              <w:rPr>
-                <w:rFonts w:ascii="Times New Roman" w:hAnsi="Times New Roman" w:cs="Times New Roman"/>
-                <w:b/>
-                <w:bCs/>
-                <w:sz w:val="32"/>
-                <w:szCs w:val="32"/>
-              </w:rPr>
-            </w:pPr>
-          </w:p>
-          <w:p>
-            <w:pPr>
-              <w:cnfStyle w:val="000000000000" w:firstRow="0" w:lastRow="0" w:firstColumn="0" w:lastColumn="0" w:oddVBand="0" w:evenVBand="0" w:oddHBand="0" w:evenHBand="0" w:firstRowFirstColumn="0" w:firstRowLastColumn="0" w:lastRowFirstColumn="0" w:lastRowLastColumn="0"/>
-              <w:rPr>
-                <w:rFonts w:ascii="Times New Roman" w:hAnsi="Times New Roman" w:cs="Times New Roman"/>
-                <w:b/>
-                <w:bCs/>
-                <w:sz w:val="32"/>
-                <w:szCs w:val="32"/>
-              </w:rPr>
-            </w:pPr>
-          </w:p>
-          <w:p>
-            <w:pPr>
-              <w:cnfStyle w:val="000000000000" w:firstRow="0" w:lastRow="0" w:firstColumn="0" w:lastColumn="0" w:oddVBand="0" w:evenVBand="0" w:oddHBand="0" w:evenHBand="0" w:firstRowFirstColumn="0" w:firstRowLastColumn="0" w:lastRowFirstColumn="0" w:lastRowLastColumn="0"/>
-              <w:rPr>
-                <w:rFonts w:ascii="Times New Roman" w:hAnsi="Times New Roman" w:cs="Times New Roman"/>
-                <w:b/>
-                <w:bCs/>
-              </w:rPr>
-            </w:pPr>
-          </w:p>
-          <w:p>
-            <w:pPr>
-              <w:cnfStyle w:val="000000000000" w:firstRow="0" w:lastRow="0" w:firstColumn="0" w:lastColumn="0" w:oddVBand="0" w:evenVBand="0" w:oddHBand="0" w:evenHBand="0" w:firstRowFirstColumn="0" w:firstRowLastColumn="0" w:lastRowFirstColumn="0" w:lastRowLastColumn="0"/>
-              <w:rPr>
-                <w:rFonts w:ascii="Times New Roman" w:hAnsi="Times New Roman" w:cs="Times New Roman"/>
-              </w:rPr>
-            </w:pPr>
-            <w:r>
-              <w:rPr>
-                <w:rFonts w:ascii="Times New Roman" w:hAnsi="Times New Roman" w:cs="Times New Roman"/>
-              </w:rPr>
-              <w:t>Boolean</w:t>
-            </w:r>
-          </w:p>
-        </w:tc>
-        <w:tc>
-          <w:tcPr>
-            <w:tcW w:w="750" w:type="dxa"/>
-          </w:tcPr>
-          <w:p>
-            <w:pPr>
-              <w:cnfStyle w:val="000000000000" w:firstRow="0" w:lastRow="0" w:firstColumn="0" w:lastColumn="0" w:oddVBand="0" w:evenVBand="0" w:oddHBand="0" w:evenHBand="0" w:firstRowFirstColumn="0" w:firstRowLastColumn="0" w:lastRowFirstColumn="0" w:lastRowLastColumn="0"/>
-              <w:rPr>
-                <w:rFonts w:ascii="Times New Roman" w:hAnsi="Times New Roman" w:cs="Times New Roman"/>
-                <w:b/>
-                <w:bCs/>
-                <w:sz w:val="32"/>
-                <w:szCs w:val="32"/>
-              </w:rPr>
-            </w:pPr>
-          </w:p>
-          <w:p>
-            <w:pPr>
-              <w:cnfStyle w:val="000000000000" w:firstRow="0" w:lastRow="0" w:firstColumn="0" w:lastColumn="0" w:oddVBand="0" w:evenVBand="0" w:oddHBand="0" w:evenHBand="0" w:firstRowFirstColumn="0" w:firstRowLastColumn="0" w:lastRowFirstColumn="0" w:lastRowLastColumn="0"/>
-              <w:rPr>
-                <w:rFonts w:ascii="Times New Roman" w:hAnsi="Times New Roman" w:cs="Times New Roman"/>
-                <w:b/>
-                <w:bCs/>
-                <w:sz w:val="32"/>
-                <w:szCs w:val="32"/>
-              </w:rPr>
-            </w:pPr>
-          </w:p>
-          <w:p>
-            <w:pPr>
-              <w:cnfStyle w:val="000000000000" w:firstRow="0" w:lastRow="0" w:firstColumn="0" w:lastColumn="0" w:oddVBand="0" w:evenVBand="0" w:oddHBand="0" w:evenHBand="0" w:firstRowFirstColumn="0" w:firstRowLastColumn="0" w:lastRowFirstColumn="0" w:lastRowLastColumn="0"/>
-              <w:rPr>
-                <w:rFonts w:ascii="Times New Roman" w:hAnsi="Times New Roman" w:cs="Times New Roman"/>
-                <w:b/>
-                <w:bCs/>
-                <w:sz w:val="32"/>
-                <w:szCs w:val="32"/>
-              </w:rPr>
-            </w:pPr>
-          </w:p>
-          <w:p>
-            <w:pPr>
-              <w:cnfStyle w:val="000000000000" w:firstRow="0" w:lastRow="0" w:firstColumn="0" w:lastColumn="0" w:oddVBand="0" w:evenVBand="0" w:oddHBand="0" w:evenHBand="0" w:firstRowFirstColumn="0" w:firstRowLastColumn="0" w:lastRowFirstColumn="0" w:lastRowLastColumn="0"/>
-              <w:rPr>
-                <w:rFonts w:ascii="Times New Roman" w:hAnsi="Times New Roman" w:cs="Times New Roman"/>
-              </w:rPr>
-            </w:pPr>
-            <w:r>
-              <w:rPr>
-                <w:rFonts w:ascii="Times New Roman" w:hAnsi="Times New Roman" w:cs="Times New Roman"/>
-              </w:rPr>
-              <w:t>Yes</w:t>
-            </w:r>
-          </w:p>
-        </w:tc>
-        <w:tc>
-          <w:tcPr>
-            <w:tcW w:w="1443" w:type="dxa"/>
-          </w:tcPr>
-          <w:p>
-            <w:pPr>
-              <w:cnfStyle w:val="000000000000" w:firstRow="0" w:lastRow="0" w:firstColumn="0" w:lastColumn="0" w:oddVBand="0" w:evenVBand="0" w:oddHBand="0" w:evenHBand="0" w:firstRowFirstColumn="0" w:firstRowLastColumn="0" w:lastRowFirstColumn="0" w:lastRowLastColumn="0"/>
-              <w:rPr>
-                <w:rFonts w:ascii="Times New Roman" w:hAnsi="Times New Roman" w:cs="Times New Roman"/>
-                <w:sz w:val="32"/>
-                <w:szCs w:val="32"/>
-              </w:rPr>
-            </w:pPr>
-          </w:p>
-          <w:p>
-            <w:pPr>
-              <w:cnfStyle w:val="000000000000" w:firstRow="0" w:lastRow="0" w:firstColumn="0" w:lastColumn="0" w:oddVBand="0" w:evenVBand="0" w:oddHBand="0" w:evenHBand="0" w:firstRowFirstColumn="0" w:firstRowLastColumn="0" w:lastRowFirstColumn="0" w:lastRowLastColumn="0"/>
-              <w:rPr>
-                <w:rFonts w:ascii="Times New Roman" w:hAnsi="Times New Roman" w:cs="Times New Roman"/>
-                <w:sz w:val="32"/>
-                <w:szCs w:val="32"/>
-              </w:rPr>
-            </w:pPr>
-          </w:p>
-          <w:p>
-            <w:pPr>
-              <w:cnfStyle w:val="000000000000" w:firstRow="0" w:lastRow="0" w:firstColumn="0" w:lastColumn="0" w:oddVBand="0" w:evenVBand="0" w:oddHBand="0" w:evenHBand="0" w:firstRowFirstColumn="0" w:firstRowLastColumn="0" w:lastRowFirstColumn="0" w:lastRowLastColumn="0"/>
-              <w:rPr>
-                <w:rFonts w:ascii="Times New Roman" w:hAnsi="Times New Roman" w:cs="Times New Roman"/>
-              </w:rPr>
-            </w:pPr>
-            <w:r>
-              <w:rPr>
-                <w:rFonts w:ascii="Times New Roman" w:hAnsi="Times New Roman" w:cs="Times New Roman"/>
-              </w:rPr>
-              <w:t>Business rules</w:t>
-            </w:r>
-          </w:p>
-        </w:tc>
-        <w:tc>
-          <w:tcPr>
-            <w:tcW w:w="1870" w:type="dxa"/>
-          </w:tcPr>
-          <w:p>
-            <w:pPr>
-              <w:cnfStyle w:val="000000000000" w:firstRow="0" w:lastRow="0" w:firstColumn="0" w:lastColumn="0" w:oddVBand="0" w:evenVBand="0" w:oddHBand="0" w:evenHBand="0" w:firstRowFirstColumn="0" w:firstRowLastColumn="0" w:lastRowFirstColumn="0" w:lastRowLastColumn="0"/>
-              <w:rPr>
-                <w:rFonts w:ascii="Times New Roman" w:hAnsi="Times New Roman" w:cs="Times New Roman"/>
-                <w:b/>
-                <w:bCs/>
-                <w:sz w:val="32"/>
-                <w:szCs w:val="32"/>
-              </w:rPr>
-            </w:pPr>
-            <w:r>
-              <w:rPr>
-                <w:rFonts w:ascii="Times New Roman" w:hAnsi="Times New Roman" w:cs="Times New Roman"/>
-              </w:rPr>
-              <w:t xml:space="preserve">Request must </w:t>
-            </w:r>
-            <w:proofErr w:type="spellStart"/>
-            <w:proofErr w:type="gramStart"/>
-            <w:r>
-              <w:rPr>
-                <w:rFonts w:ascii="Times New Roman" w:hAnsi="Times New Roman" w:cs="Times New Roman"/>
-              </w:rPr>
-              <w:t>pend</w:t>
-            </w:r>
-            <w:proofErr w:type="spellEnd"/>
-            <w:proofErr w:type="gramEnd"/>
-            <w:r>
-              <w:rPr>
-                <w:rFonts w:ascii="Times New Roman" w:hAnsi="Times New Roman" w:cs="Times New Roman"/>
-              </w:rPr>
-              <w:t xml:space="preserve"> review from authorizer for approval</w:t>
-            </w:r>
-          </w:p>
-        </w:tc>
-        <w:tc>
-          <w:tcPr>
-            <w:tcW w:w="1629" w:type="dxa"/>
-          </w:tcPr>
-          <w:p>
-            <w:pPr>
-              <w:cnfStyle w:val="000000000000" w:firstRow="0" w:lastRow="0" w:firstColumn="0" w:lastColumn="0" w:oddVBand="0" w:evenVBand="0" w:oddHBand="0" w:evenHBand="0" w:firstRowFirstColumn="0" w:firstRowLastColumn="0" w:lastRowFirstColumn="0" w:lastRowLastColumn="0"/>
-              <w:rPr>
-                <w:rFonts w:ascii="Times New Roman" w:hAnsi="Times New Roman" w:cs="Times New Roman"/>
-                <w:b/>
-                <w:bCs/>
-                <w:sz w:val="32"/>
-                <w:szCs w:val="32"/>
-              </w:rPr>
-            </w:pPr>
-          </w:p>
-          <w:p>
-            <w:pPr>
-              <w:cnfStyle w:val="000000000000" w:firstRow="0" w:lastRow="0" w:firstColumn="0" w:lastColumn="0" w:oddVBand="0" w:evenVBand="0" w:oddHBand="0" w:evenHBand="0" w:firstRowFirstColumn="0" w:firstRowLastColumn="0" w:lastRowFirstColumn="0" w:lastRowLastColumn="0"/>
-              <w:rPr>
-                <w:rFonts w:ascii="Times New Roman" w:hAnsi="Times New Roman" w:cs="Times New Roman"/>
-                <w:b/>
-                <w:bCs/>
-                <w:sz w:val="32"/>
-                <w:szCs w:val="32"/>
-              </w:rPr>
-            </w:pPr>
-          </w:p>
-          <w:p>
-            <w:pPr>
-              <w:jc w:val="center"/>
-              <w:cnfStyle w:val="000000000000" w:firstRow="0" w:lastRow="0" w:firstColumn="0" w:lastColumn="0" w:oddVBand="0" w:evenVBand="0" w:oddHBand="0" w:evenHBand="0" w:firstRowFirstColumn="0" w:firstRowLastColumn="0" w:lastRowFirstColumn="0" w:lastRowLastColumn="0"/>
-              <w:rPr>
-                <w:rFonts w:ascii="Times New Roman" w:hAnsi="Times New Roman" w:cs="Times New Roman"/>
-                <w:sz w:val="28"/>
-                <w:szCs w:val="28"/>
-              </w:rPr>
-            </w:pPr>
-            <w:r>
-              <w:rPr>
-                <w:rFonts w:ascii="Times New Roman" w:hAnsi="Times New Roman" w:cs="Times New Roman"/>
-                <w:sz w:val="28"/>
-                <w:szCs w:val="28"/>
-              </w:rPr>
-              <w:t>MGR-</w:t>
-            </w:r>
-            <w:r>
-              <w:rPr>
-                <w:rFonts w:ascii="Times New Roman" w:hAnsi="Times New Roman" w:cs="Times New Roman"/>
-                <w:sz w:val="28"/>
-                <w:szCs w:val="28"/>
-              </w:rPr>
-              <w:t>002</w:t>
+                <w:sz w:val="28"/>
+                <w:szCs w:val="28"/>
+              </w:rPr>
+            </w:pPr>
+            <w:r>
+              <w:rPr>
+                <w:rFonts w:ascii="Times New Roman" w:hAnsi="Times New Roman" w:cs="Times New Roman"/>
+                <w:sz w:val="28"/>
+                <w:szCs w:val="28"/>
+              </w:rPr>
+              <w:t>TRUE</w:t>
             </w:r>
           </w:p>
         </w:tc>
@@ -1787,19 +1781,20 @@
           </w:tcPr>
           <w:p>
             <w:pPr>
+              <w:jc w:val="center"/>
               <w:rPr>
                 <w:rFonts w:ascii="Times New Roman" w:hAnsi="Times New Roman" w:cs="Times New Roman"/>
                 <w:b w:val="0"/>
                 <w:bCs w:val="0"/>
               </w:rPr>
             </w:pPr>
-            <w:proofErr w:type="spellStart"/>
             <w:r>
               <w:rPr>
                 <w:rFonts w:ascii="Times New Roman" w:hAnsi="Times New Roman" w:cs="Times New Roman"/>
                 <w:b w:val="0"/>
                 <w:bCs w:val="0"/>
               </w:rPr>
+              <w:lastRenderedPageBreak/>
               <w:t>a</w:t>
             </w:r>
             <w:r>
@@ -1810,7 +1805,6 @@
               </w:rPr>
               <w:t>pproved_at</w:t>
             </w:r>
-            <w:proofErr w:type="spellEnd"/>
           </w:p>
         </w:tc>
         <w:tc>
@@ -1819,6 +1813,7 @@
           </w:tcPr>
           <w:p>
             <w:pPr>
+              <w:jc w:val="center"/>
               <w:cnfStyle w:val="000000000000" w:firstRow="0" w:lastRow="0" w:firstColumn="0" w:lastColumn="0" w:oddVBand="0" w:evenVBand="0" w:oddHBand="0" w:evenHBand="0" w:firstRowFirstColumn="0" w:firstRowLastColumn="0" w:lastRowFirstColumn="0" w:lastRowLastColumn="0"/>
               <w:rPr>
                 <w:rFonts w:ascii="Times New Roman" w:hAnsi="Times New Roman" w:cs="Times New Roman"/>
@@ -1838,6 +1833,7 @@
           </w:tcPr>
           <w:p>
             <w:pPr>
+              <w:jc w:val="center"/>
               <w:cnfStyle w:val="000000000000" w:firstRow="0" w:lastRow="0" w:firstColumn="0" w:lastColumn="0" w:oddVBand="0" w:evenVBand="0" w:oddHBand="0" w:evenHBand="0" w:firstRowFirstColumn="0" w:firstRowLastColumn="0" w:lastRowFirstColumn="0" w:lastRowLastColumn="0"/>
               <w:rPr>
                 <w:rFonts w:ascii="Times New Roman" w:hAnsi="Times New Roman" w:cs="Times New Roman"/>
@@ -1850,6 +1846,7 @@
           </w:p>
           <w:p>
             <w:pPr>
+              <w:jc w:val="center"/>
               <w:cnfStyle w:val="000000000000" w:firstRow="0" w:lastRow="0" w:firstColumn="0" w:lastColumn="0" w:oddVBand="0" w:evenVBand="0" w:oddHBand="0" w:evenHBand="0" w:firstRowFirstColumn="0" w:firstRowLastColumn="0" w:lastRowFirstColumn="0" w:lastRowLastColumn="0"/>
               <w:rPr>
                 <w:rFonts w:ascii="Times New Roman" w:hAnsi="Times New Roman" w:cs="Times New Roman"/>
@@ -1862,19 +1859,18 @@
           </w:p>
           <w:p>
             <w:pPr>
-              <w:cnfStyle w:val="000000000000" w:firstRow="0" w:lastRow="0" w:firstColumn="0" w:lastColumn="0" w:oddVBand="0" w:evenVBand="0" w:oddHBand="0" w:evenHBand="0" w:firstRowFirstColumn="0" w:firstRowLastColumn="0" w:lastRowFirstColumn="0" w:lastRowLastColumn="0"/>
-              <w:rPr>
-                <w:rFonts w:ascii="Times New Roman" w:hAnsi="Times New Roman" w:cs="Times New Roman"/>
-              </w:rPr>
-            </w:pPr>
-            <w:proofErr w:type="spellStart"/>
+              <w:jc w:val="center"/>
+              <w:cnfStyle w:val="000000000000" w:firstRow="0" w:lastRow="0" w:firstColumn="0" w:lastColumn="0" w:oddVBand="0" w:evenVBand="0" w:oddHBand="0" w:evenHBand="0" w:firstRowFirstColumn="0" w:firstRowLastColumn="0" w:lastRowFirstColumn="0" w:lastRowLastColumn="0"/>
+              <w:rPr>
+                <w:rFonts w:ascii="Times New Roman" w:hAnsi="Times New Roman" w:cs="Times New Roman"/>
+              </w:rPr>
+            </w:pPr>
             <w:r>
               <w:rPr>
                 <w:rFonts w:ascii="Times New Roman" w:hAnsi="Times New Roman" w:cs="Times New Roman"/>
               </w:rPr>
               <w:t>DateTime</w:t>
             </w:r>
-            <w:proofErr w:type="spellEnd"/>
           </w:p>
         </w:tc>
         <w:tc>
@@ -1883,6 +1879,7 @@
           </w:tcPr>
           <w:p>
             <w:pPr>
+              <w:jc w:val="center"/>
               <w:cnfStyle w:val="000000000000" w:firstRow="0" w:lastRow="0" w:firstColumn="0" w:lastColumn="0" w:oddVBand="0" w:evenVBand="0" w:oddHBand="0" w:evenHBand="0" w:firstRowFirstColumn="0" w:firstRowLastColumn="0" w:lastRowFirstColumn="0" w:lastRowLastColumn="0"/>
               <w:rPr>
                 <w:rFonts w:ascii="Times New Roman" w:hAnsi="Times New Roman" w:cs="Times New Roman"/>
@@ -1895,6 +1892,7 @@
           </w:p>
           <w:p>
             <w:pPr>
+              <w:jc w:val="center"/>
               <w:cnfStyle w:val="000000000000" w:firstRow="0" w:lastRow="0" w:firstColumn="0" w:lastColumn="0" w:oddVBand="0" w:evenVBand="0" w:oddHBand="0" w:evenHBand="0" w:firstRowFirstColumn="0" w:firstRowLastColumn="0" w:lastRowFirstColumn="0" w:lastRowLastColumn="0"/>
               <w:rPr>
                 <w:rFonts w:ascii="Times New Roman" w:hAnsi="Times New Roman" w:cs="Times New Roman"/>
@@ -1907,6 +1905,7 @@
           </w:p>
           <w:p>
             <w:pPr>
+              <w:jc w:val="center"/>
               <w:cnfStyle w:val="000000000000" w:firstRow="0" w:lastRow="0" w:firstColumn="0" w:lastColumn="0" w:oddVBand="0" w:evenVBand="0" w:oddHBand="0" w:evenHBand="0" w:firstRowFirstColumn="0" w:firstRowLastColumn="0" w:lastRowFirstColumn="0" w:lastRowLastColumn="0"/>
               <w:rPr>
                 <w:rFonts w:ascii="Times New Roman" w:hAnsi="Times New Roman" w:cs="Times New Roman"/>
@@ -1926,6 +1925,7 @@
           </w:tcPr>
           <w:p>
             <w:pPr>
+              <w:jc w:val="center"/>
               <w:cnfStyle w:val="000000000000" w:firstRow="0" w:lastRow="0" w:firstColumn="0" w:lastColumn="0" w:oddVBand="0" w:evenVBand="0" w:oddHBand="0" w:evenHBand="0" w:firstRowFirstColumn="0" w:firstRowLastColumn="0" w:lastRowFirstColumn="0" w:lastRowLastColumn="0"/>
               <w:rPr>
                 <w:rFonts w:ascii="Times New Roman" w:hAnsi="Times New Roman" w:cs="Times New Roman"/>
@@ -1938,6 +1938,7 @@
           </w:p>
           <w:p>
             <w:pPr>
+              <w:jc w:val="center"/>
               <w:cnfStyle w:val="000000000000" w:firstRow="0" w:lastRow="0" w:firstColumn="0" w:lastColumn="0" w:oddVBand="0" w:evenVBand="0" w:oddHBand="0" w:evenHBand="0" w:firstRowFirstColumn="0" w:firstRowLastColumn="0" w:lastRowFirstColumn="0" w:lastRowLastColumn="0"/>
               <w:rPr>
                 <w:rFonts w:ascii="Times New Roman" w:hAnsi="Times New Roman" w:cs="Times New Roman"/>
@@ -1950,6 +1951,7 @@
           </w:p>
           <w:p>
             <w:pPr>
+              <w:jc w:val="center"/>
               <w:cnfStyle w:val="000000000000" w:firstRow="0" w:lastRow="0" w:firstColumn="0" w:lastColumn="0" w:oddVBand="0" w:evenVBand="0" w:oddHBand="0" w:evenHBand="0" w:firstRowFirstColumn="0" w:firstRowLastColumn="0" w:lastRowFirstColumn="0" w:lastRowLastColumn="0"/>
               <w:rPr>
                 <w:rFonts w:ascii="Times New Roman" w:hAnsi="Times New Roman" w:cs="Times New Roman"/>
@@ -1969,16 +1971,17 @@
           </w:tcPr>
           <w:p>
             <w:pPr>
-              <w:cnfStyle w:val="000000000000" w:firstRow="0" w:lastRow="0" w:firstColumn="0" w:lastColumn="0" w:oddVBand="0" w:evenVBand="0" w:oddHBand="0" w:evenHBand="0" w:firstRowFirstColumn="0" w:firstRowLastColumn="0" w:lastRowFirstColumn="0" w:lastRowLastColumn="0"/>
-              <w:rPr>
-                <w:rFonts w:ascii="Times New Roman" w:hAnsi="Times New Roman" w:cs="Times New Roman"/>
-              </w:rPr>
-            </w:pPr>
-            <w:r>
-              <w:rPr>
-                <w:rFonts w:ascii="Times New Roman" w:hAnsi="Times New Roman" w:cs="Times New Roman"/>
-              </w:rPr>
-              <w:t>Only necessary if further approval is required</w:t>
+              <w:jc w:val="center"/>
+              <w:cnfStyle w:val="000000000000" w:firstRow="0" w:lastRow="0" w:firstColumn="0" w:lastColumn="0" w:oddVBand="0" w:evenVBand="0" w:oddHBand="0" w:evenHBand="0" w:firstRowFirstColumn="0" w:firstRowLastColumn="0" w:lastRowFirstColumn="0" w:lastRowLastColumn="0"/>
+              <w:rPr>
+                <w:rFonts w:ascii="Times New Roman" w:hAnsi="Times New Roman" w:cs="Times New Roman"/>
+              </w:rPr>
+            </w:pPr>
+            <w:r>
+              <w:rPr>
+                <w:rFonts w:ascii="Times New Roman" w:hAnsi="Times New Roman" w:cs="Times New Roman"/>
+              </w:rPr>
+              <w:t>Record a date and time only after the manager approves the request</w:t>
             </w:r>
           </w:p>
         </w:tc>
@@ -1988,6 +1991,7 @@
           </w:tcPr>
           <w:p>
             <w:pPr>
+              <w:jc w:val="center"/>
               <w:cnfStyle w:val="000000000000" w:firstRow="0" w:lastRow="0" w:firstColumn="0" w:lastColumn="0" w:oddVBand="0" w:evenVBand="0" w:oddHBand="0" w:evenHBand="0" w:firstRowFirstColumn="0" w:firstRowLastColumn="0" w:lastRowFirstColumn="0" w:lastRowLastColumn="0"/>
               <w:rPr>
                 <w:rFonts w:ascii="Times New Roman" w:hAnsi="Times New Roman" w:cs="Times New Roman"/>
@@ -2000,6 +2004,7 @@
           </w:p>
           <w:p>
             <w:pPr>
+              <w:jc w:val="center"/>
               <w:cnfStyle w:val="000000000000" w:firstRow="0" w:lastRow="0" w:firstColumn="0" w:lastColumn="0" w:oddVBand="0" w:evenVBand="0" w:oddHBand="0" w:evenHBand="0" w:firstRowFirstColumn="0" w:firstRowLastColumn="0" w:lastRowFirstColumn="0" w:lastRowLastColumn="0"/>
               <w:rPr>
                 <w:rFonts w:ascii="Times New Roman" w:hAnsi="Times New Roman" w:cs="Times New Roman"/>
@@ -2061,21 +2066,20 @@
           </w:tcPr>
           <w:p>
             <w:pPr>
+              <w:jc w:val="center"/>
               <w:rPr>
                 <w:rFonts w:ascii="Times New Roman" w:hAnsi="Times New Roman" w:cs="Times New Roman"/>
                 <w:b w:val="0"/>
                 <w:bCs w:val="0"/>
               </w:rPr>
             </w:pPr>
-            <w:proofErr w:type="spellStart"/>
             <w:r>
               <w:rPr>
                 <w:rFonts w:ascii="Times New Roman" w:hAnsi="Times New Roman" w:cs="Times New Roman"/>
                 <w:b w:val="0"/>
                 <w:bCs w:val="0"/>
               </w:rPr>
-              <w:lastRenderedPageBreak/>
-              <w:t>c</w:t>
+              <w:t>accepted</w:t>
             </w:r>
             <w:r>
               <w:rPr>
@@ -2083,9 +2087,8 @@
                 <w:b w:val="0"/>
                 <w:bCs w:val="0"/>
               </w:rPr>
-              <w:t>ancelled_at</w:t>
-            </w:r>
-            <w:proofErr w:type="spellEnd"/>
+              <w:t>_at</w:t>
+            </w:r>
           </w:p>
         </w:tc>
         <w:tc>
@@ -2094,36 +2097,17 @@
           </w:tcPr>
           <w:p>
             <w:pPr>
-              <w:cnfStyle w:val="000000000000" w:firstRow="0" w:lastRow="0" w:firstColumn="0" w:lastColumn="0" w:oddVBand="0" w:evenVBand="0" w:oddHBand="0" w:evenHBand="0" w:firstRowFirstColumn="0" w:firstRowLastColumn="0" w:lastRowFirstColumn="0" w:lastRowLastColumn="0"/>
-              <w:rPr>
-                <w:rFonts w:ascii="Times New Roman" w:hAnsi="Times New Roman" w:cs="Times New Roman"/>
-              </w:rPr>
-            </w:pPr>
-            <w:r>
-              <w:rPr>
-                <w:rFonts w:ascii="Times New Roman" w:hAnsi="Times New Roman" w:cs="Times New Roman"/>
-              </w:rPr>
-              <w:t xml:space="preserve">Date/time </w:t>
-            </w:r>
-            <w:r>
-              <w:rPr>
-                <w:rFonts w:ascii="Times New Roman" w:hAnsi="Times New Roman" w:cs="Times New Roman"/>
-              </w:rPr>
-              <w:t xml:space="preserve">of when the cancellation </w:t>
-            </w:r>
-            <w:proofErr w:type="spellStart"/>
-            <w:r>
-              <w:rPr>
-                <w:rFonts w:ascii="Times New Roman" w:hAnsi="Times New Roman" w:cs="Times New Roman"/>
-              </w:rPr>
-              <w:t>occured</w:t>
-            </w:r>
-            <w:proofErr w:type="spellEnd"/>
-            <w:r>
-              <w:rPr>
-                <w:rFonts w:ascii="Times New Roman" w:hAnsi="Times New Roman" w:cs="Times New Roman"/>
-              </w:rPr>
-              <w:t xml:space="preserve"> </w:t>
+              <w:jc w:val="center"/>
+              <w:cnfStyle w:val="000000000000" w:firstRow="0" w:lastRow="0" w:firstColumn="0" w:lastColumn="0" w:oddVBand="0" w:evenVBand="0" w:oddHBand="0" w:evenHBand="0" w:firstRowFirstColumn="0" w:firstRowLastColumn="0" w:lastRowFirstColumn="0" w:lastRowLastColumn="0"/>
+              <w:rPr>
+                <w:rFonts w:ascii="Times New Roman" w:hAnsi="Times New Roman" w:cs="Times New Roman"/>
+              </w:rPr>
+            </w:pPr>
+            <w:r>
+              <w:rPr>
+                <w:rFonts w:ascii="Times New Roman" w:hAnsi="Times New Roman" w:cs="Times New Roman"/>
+              </w:rPr>
+              <w:t>Date and time the receiving employee accepted the swap</w:t>
             </w:r>
           </w:p>
         </w:tc>
@@ -2133,6 +2117,138 @@
           </w:tcPr>
           <w:p>
             <w:pPr>
+              <w:jc w:val="center"/>
+              <w:cnfStyle w:val="000000000000" w:firstRow="0" w:lastRow="0" w:firstColumn="0" w:lastColumn="0" w:oddVBand="0" w:evenVBand="0" w:oddHBand="0" w:evenHBand="0" w:firstRowFirstColumn="0" w:firstRowLastColumn="0" w:lastRowFirstColumn="0" w:lastRowLastColumn="0"/>
+              <w:rPr>
+                <w:rFonts w:ascii="Times New Roman" w:hAnsi="Times New Roman" w:cs="Times New Roman"/>
+                <w:b/>
+                <w:bCs/>
+              </w:rPr>
+            </w:pPr>
+          </w:p>
+          <w:p>
+            <w:pPr>
+              <w:jc w:val="center"/>
+              <w:cnfStyle w:val="000000000000" w:firstRow="0" w:lastRow="0" w:firstColumn="0" w:lastColumn="0" w:oddVBand="0" w:evenVBand="0" w:oddHBand="0" w:evenHBand="0" w:firstRowFirstColumn="0" w:firstRowLastColumn="0" w:lastRowFirstColumn="0" w:lastRowLastColumn="0"/>
+              <w:rPr>
+                <w:rFonts w:ascii="Times New Roman" w:hAnsi="Times New Roman" w:cs="Times New Roman"/>
+              </w:rPr>
+            </w:pPr>
+            <w:r>
+              <w:rPr>
+                <w:rFonts w:ascii="Times New Roman" w:hAnsi="Times New Roman" w:cs="Times New Roman"/>
+              </w:rPr>
+              <w:t>DateTime</w:t>
+            </w:r>
+          </w:p>
+        </w:tc>
+        <w:tc>
+          <w:tcPr>
+            <w:tcW w:w="750" w:type="dxa"/>
+          </w:tcPr>
+          <w:p>
+            <w:pPr>
+              <w:jc w:val="center"/>
+              <w:cnfStyle w:val="000000000000" w:firstRow="0" w:lastRow="0" w:firstColumn="0" w:lastColumn="0" w:oddVBand="0" w:evenVBand="0" w:oddHBand="0" w:evenHBand="0" w:firstRowFirstColumn="0" w:firstRowLastColumn="0" w:lastRowFirstColumn="0" w:lastRowLastColumn="0"/>
+              <w:rPr>
+                <w:rFonts w:ascii="Times New Roman" w:hAnsi="Times New Roman" w:cs="Times New Roman"/>
+              </w:rPr>
+            </w:pPr>
+          </w:p>
+          <w:p>
+            <w:pPr>
+              <w:jc w:val="center"/>
+              <w:cnfStyle w:val="000000000000" w:firstRow="0" w:lastRow="0" w:firstColumn="0" w:lastColumn="0" w:oddVBand="0" w:evenVBand="0" w:oddHBand="0" w:evenHBand="0" w:firstRowFirstColumn="0" w:firstRowLastColumn="0" w:lastRowFirstColumn="0" w:lastRowLastColumn="0"/>
+              <w:rPr>
+                <w:rFonts w:ascii="Times New Roman" w:hAnsi="Times New Roman" w:cs="Times New Roman"/>
+              </w:rPr>
+            </w:pPr>
+          </w:p>
+          <w:p>
+            <w:pPr>
+              <w:jc w:val="center"/>
+              <w:cnfStyle w:val="000000000000" w:firstRow="0" w:lastRow="0" w:firstColumn="0" w:lastColumn="0" w:oddVBand="0" w:evenVBand="0" w:oddHBand="0" w:evenHBand="0" w:firstRowFirstColumn="0" w:firstRowLastColumn="0" w:lastRowFirstColumn="0" w:lastRowLastColumn="0"/>
+              <w:rPr>
+                <w:rFonts w:ascii="Times New Roman" w:hAnsi="Times New Roman" w:cs="Times New Roman"/>
+              </w:rPr>
+            </w:pPr>
+            <w:r>
+              <w:rPr>
+                <w:rFonts w:ascii="Times New Roman" w:hAnsi="Times New Roman" w:cs="Times New Roman"/>
+              </w:rPr>
+              <w:t>No</w:t>
+            </w:r>
+          </w:p>
+        </w:tc>
+        <w:tc>
+          <w:tcPr>
+            <w:tcW w:w="1443" w:type="dxa"/>
+          </w:tcPr>
+          <w:p>
+            <w:pPr>
+              <w:jc w:val="center"/>
+              <w:cnfStyle w:val="000000000000" w:firstRow="0" w:lastRow="0" w:firstColumn="0" w:lastColumn="0" w:oddVBand="0" w:evenVBand="0" w:oddHBand="0" w:evenHBand="0" w:firstRowFirstColumn="0" w:firstRowLastColumn="0" w:lastRowFirstColumn="0" w:lastRowLastColumn="0"/>
+              <w:rPr>
+                <w:rFonts w:ascii="Times New Roman" w:hAnsi="Times New Roman" w:cs="Times New Roman"/>
+                <w:b/>
+                <w:bCs/>
+              </w:rPr>
+            </w:pPr>
+          </w:p>
+          <w:p>
+            <w:pPr>
+              <w:jc w:val="center"/>
+              <w:cnfStyle w:val="000000000000" w:firstRow="0" w:lastRow="0" w:firstColumn="0" w:lastColumn="0" w:oddVBand="0" w:evenVBand="0" w:oddHBand="0" w:evenHBand="0" w:firstRowFirstColumn="0" w:firstRowLastColumn="0" w:lastRowFirstColumn="0" w:lastRowLastColumn="0"/>
+              <w:rPr>
+                <w:rFonts w:ascii="Times New Roman" w:hAnsi="Times New Roman" w:cs="Times New Roman"/>
+              </w:rPr>
+            </w:pPr>
+            <w:r>
+              <w:rPr>
+                <w:rFonts w:ascii="Times New Roman" w:hAnsi="Times New Roman" w:cs="Times New Roman"/>
+              </w:rPr>
+              <w:t>Shift-swap processing service</w:t>
+            </w:r>
+          </w:p>
+        </w:tc>
+        <w:tc>
+          <w:tcPr>
+            <w:tcW w:w="1870" w:type="dxa"/>
+          </w:tcPr>
+          <w:p>
+            <w:pPr>
+              <w:jc w:val="center"/>
+              <w:cnfStyle w:val="000000000000" w:firstRow="0" w:lastRow="0" w:firstColumn="0" w:lastColumn="0" w:oddVBand="0" w:evenVBand="0" w:oddHBand="0" w:evenHBand="0" w:firstRowFirstColumn="0" w:firstRowLastColumn="0" w:lastRowFirstColumn="0" w:lastRowLastColumn="0"/>
+              <w:rPr>
+                <w:rFonts w:ascii="Times New Roman" w:hAnsi="Times New Roman" w:cs="Times New Roman"/>
+                <w:b/>
+                <w:bCs/>
+              </w:rPr>
+            </w:pPr>
+          </w:p>
+          <w:p>
+            <w:pPr>
+              <w:jc w:val="center"/>
+              <w:cnfStyle w:val="000000000000" w:firstRow="0" w:lastRow="0" w:firstColumn="0" w:lastColumn="0" w:oddVBand="0" w:evenVBand="0" w:oddHBand="0" w:evenHBand="0" w:firstRowFirstColumn="0" w:firstRowLastColumn="0" w:lastRowFirstColumn="0" w:lastRowLastColumn="0"/>
+              <w:rPr>
+                <w:rFonts w:ascii="Times New Roman" w:hAnsi="Times New Roman" w:cs="Times New Roman"/>
+              </w:rPr>
+            </w:pPr>
+            <w:r>
+              <w:rPr>
+                <w:rFonts w:ascii="Times New Roman" w:hAnsi="Times New Roman" w:cs="Times New Roman"/>
+              </w:rPr>
+              <w:t>Record only when the receiving employee accepts</w:t>
+            </w:r>
+          </w:p>
+        </w:tc>
+        <w:tc>
+          <w:tcPr>
+            <w:tcW w:w="1629" w:type="dxa"/>
+          </w:tcPr>
+          <w:p>
+            <w:pPr>
+              <w:jc w:val="center"/>
               <w:cnfStyle w:val="000000000000" w:firstRow="0" w:lastRow="0" w:firstColumn="0" w:lastColumn="0" w:oddVBand="0" w:evenVBand="0" w:oddHBand="0" w:evenHBand="0" w:firstRowFirstColumn="0" w:firstRowLastColumn="0" w:lastRowFirstColumn="0" w:lastRowLastColumn="0"/>
               <w:rPr>
                 <w:rFonts w:ascii="Times New Roman" w:hAnsi="Times New Roman" w:cs="Times New Roman"/>
@@ -2145,163 +2261,70 @@
           </w:p>
           <w:p>
             <w:pPr>
-              <w:cnfStyle w:val="000000000000" w:firstRow="0" w:lastRow="0" w:firstColumn="0" w:lastColumn="0" w:oddVBand="0" w:evenVBand="0" w:oddHBand="0" w:evenHBand="0" w:firstRowFirstColumn="0" w:firstRowLastColumn="0" w:lastRowFirstColumn="0" w:lastRowLastColumn="0"/>
-              <w:rPr>
-                <w:rFonts w:ascii="Times New Roman" w:hAnsi="Times New Roman" w:cs="Times New Roman"/>
-              </w:rPr>
-            </w:pPr>
-            <w:proofErr w:type="spellStart"/>
-            <w:r>
-              <w:rPr>
-                <w:rFonts w:ascii="Times New Roman" w:hAnsi="Times New Roman" w:cs="Times New Roman"/>
-              </w:rPr>
-              <w:t>DateTime</w:t>
-            </w:r>
-            <w:proofErr w:type="spellEnd"/>
-          </w:p>
-        </w:tc>
-        <w:tc>
-          <w:tcPr>
-            <w:tcW w:w="750" w:type="dxa"/>
-          </w:tcPr>
-          <w:p>
-            <w:pPr>
-              <w:cnfStyle w:val="000000000000" w:firstRow="0" w:lastRow="0" w:firstColumn="0" w:lastColumn="0" w:oddVBand="0" w:evenVBand="0" w:oddHBand="0" w:evenHBand="0" w:firstRowFirstColumn="0" w:firstRowLastColumn="0" w:lastRowFirstColumn="0" w:lastRowLastColumn="0"/>
-              <w:rPr>
-                <w:rFonts w:ascii="Times New Roman" w:hAnsi="Times New Roman" w:cs="Times New Roman"/>
-              </w:rPr>
-            </w:pPr>
-          </w:p>
-          <w:p>
-            <w:pPr>
-              <w:cnfStyle w:val="000000000000" w:firstRow="0" w:lastRow="0" w:firstColumn="0" w:lastColumn="0" w:oddVBand="0" w:evenVBand="0" w:oddHBand="0" w:evenHBand="0" w:firstRowFirstColumn="0" w:firstRowLastColumn="0" w:lastRowFirstColumn="0" w:lastRowLastColumn="0"/>
-              <w:rPr>
-                <w:rFonts w:ascii="Times New Roman" w:hAnsi="Times New Roman" w:cs="Times New Roman"/>
-              </w:rPr>
-            </w:pPr>
-          </w:p>
-          <w:p>
-            <w:pPr>
-              <w:cnfStyle w:val="000000000000" w:firstRow="0" w:lastRow="0" w:firstColumn="0" w:lastColumn="0" w:oddVBand="0" w:evenVBand="0" w:oddHBand="0" w:evenHBand="0" w:firstRowFirstColumn="0" w:firstRowLastColumn="0" w:lastRowFirstColumn="0" w:lastRowLastColumn="0"/>
-              <w:rPr>
-                <w:rFonts w:ascii="Times New Roman" w:hAnsi="Times New Roman" w:cs="Times New Roman"/>
-              </w:rPr>
-            </w:pPr>
-            <w:r>
-              <w:rPr>
-                <w:rFonts w:ascii="Times New Roman" w:hAnsi="Times New Roman" w:cs="Times New Roman"/>
-              </w:rPr>
-              <w:t>No</w:t>
-            </w:r>
-          </w:p>
-        </w:tc>
-        <w:tc>
-          <w:tcPr>
-            <w:tcW w:w="1443" w:type="dxa"/>
-          </w:tcPr>
-          <w:p>
-            <w:pPr>
-              <w:cnfStyle w:val="000000000000" w:firstRow="0" w:lastRow="0" w:firstColumn="0" w:lastColumn="0" w:oddVBand="0" w:evenVBand="0" w:oddHBand="0" w:evenHBand="0" w:firstRowFirstColumn="0" w:firstRowLastColumn="0" w:lastRowFirstColumn="0" w:lastRowLastColumn="0"/>
-              <w:rPr>
-                <w:rFonts w:ascii="Times New Roman" w:hAnsi="Times New Roman" w:cs="Times New Roman"/>
-                <w:b/>
-                <w:bCs/>
-                <w:sz w:val="32"/>
-                <w:szCs w:val="32"/>
-              </w:rPr>
-            </w:pPr>
-          </w:p>
-          <w:p>
-            <w:pPr>
-              <w:cnfStyle w:val="000000000000" w:firstRow="0" w:lastRow="0" w:firstColumn="0" w:lastColumn="0" w:oddVBand="0" w:evenVBand="0" w:oddHBand="0" w:evenHBand="0" w:firstRowFirstColumn="0" w:firstRowLastColumn="0" w:lastRowFirstColumn="0" w:lastRowLastColumn="0"/>
-              <w:rPr>
-                <w:rFonts w:ascii="Times New Roman" w:hAnsi="Times New Roman" w:cs="Times New Roman"/>
-              </w:rPr>
-            </w:pPr>
-            <w:r>
-              <w:rPr>
-                <w:rFonts w:ascii="Times New Roman" w:hAnsi="Times New Roman" w:cs="Times New Roman"/>
-              </w:rPr>
-              <w:t>Shift management system</w:t>
-            </w:r>
-          </w:p>
-        </w:tc>
-        <w:tc>
-          <w:tcPr>
-            <w:tcW w:w="1870" w:type="dxa"/>
-          </w:tcPr>
-          <w:p>
-            <w:pPr>
-              <w:cnfStyle w:val="000000000000" w:firstRow="0" w:lastRow="0" w:firstColumn="0" w:lastColumn="0" w:oddVBand="0" w:evenVBand="0" w:oddHBand="0" w:evenHBand="0" w:firstRowFirstColumn="0" w:firstRowLastColumn="0" w:lastRowFirstColumn="0" w:lastRowLastColumn="0"/>
-              <w:rPr>
-                <w:rFonts w:ascii="Times New Roman" w:hAnsi="Times New Roman" w:cs="Times New Roman"/>
-                <w:b/>
-                <w:bCs/>
-                <w:sz w:val="32"/>
-                <w:szCs w:val="32"/>
-              </w:rPr>
-            </w:pPr>
-          </w:p>
-          <w:p>
-            <w:pPr>
-              <w:jc w:val="center"/>
-              <w:cnfStyle w:val="000000000000" w:firstRow="0" w:lastRow="0" w:firstColumn="0" w:lastColumn="0" w:oddVBand="0" w:evenVBand="0" w:oddHBand="0" w:evenHBand="0" w:firstRowFirstColumn="0" w:firstRowLastColumn="0" w:lastRowFirstColumn="0" w:lastRowLastColumn="0"/>
-              <w:rPr>
-                <w:rFonts w:ascii="Times New Roman" w:hAnsi="Times New Roman" w:cs="Times New Roman"/>
-              </w:rPr>
-            </w:pPr>
-            <w:r>
-              <w:rPr>
-                <w:rFonts w:ascii="Times New Roman" w:hAnsi="Times New Roman" w:cs="Times New Roman"/>
-              </w:rPr>
-              <w:t>Only made when a cancellation occurs</w:t>
-            </w:r>
-          </w:p>
-        </w:tc>
-        <w:tc>
-          <w:tcPr>
-            <w:tcW w:w="1629" w:type="dxa"/>
-          </w:tcPr>
-          <w:p>
-            <w:pPr>
-              <w:cnfStyle w:val="000000000000" w:firstRow="0" w:lastRow="0" w:firstColumn="0" w:lastColumn="0" w:oddVBand="0" w:evenVBand="0" w:oddHBand="0" w:evenHBand="0" w:firstRowFirstColumn="0" w:firstRowLastColumn="0" w:lastRowFirstColumn="0" w:lastRowLastColumn="0"/>
-              <w:rPr>
-                <w:rFonts w:ascii="Times New Roman" w:hAnsi="Times New Roman" w:cs="Times New Roman"/>
-                <w:b/>
-                <w:bCs/>
-                <w:sz w:val="32"/>
-                <w:szCs w:val="32"/>
-              </w:rPr>
-            </w:pPr>
-          </w:p>
-          <w:p>
-            <w:pPr>
-              <w:jc w:val="center"/>
-              <w:cnfStyle w:val="000000000000" w:firstRow="0" w:lastRow="0" w:firstColumn="0" w:lastColumn="0" w:oddVBand="0" w:evenVBand="0" w:oddHBand="0" w:evenHBand="0" w:firstRowFirstColumn="0" w:firstRowLastColumn="0" w:lastRowFirstColumn="0" w:lastRowLastColumn="0"/>
-              <w:rPr>
-                <w:rFonts w:ascii="Times New Roman" w:hAnsi="Times New Roman" w:cs="Times New Roman"/>
-              </w:rPr>
-            </w:pPr>
-            <w:r>
-              <w:rPr>
-                <w:rFonts w:ascii="Times New Roman" w:hAnsi="Times New Roman" w:cs="Times New Roman"/>
-              </w:rPr>
-              <w:t>2026-09-25</w:t>
-            </w:r>
-          </w:p>
-          <w:p>
-            <w:pPr>
-              <w:jc w:val="center"/>
-              <w:cnfStyle w:val="000000000000" w:firstRow="0" w:lastRow="0" w:firstColumn="0" w:lastColumn="0" w:oddVBand="0" w:evenVBand="0" w:oddHBand="0" w:evenHBand="0" w:firstRowFirstColumn="0" w:firstRowLastColumn="0" w:lastRowFirstColumn="0" w:lastRowLastColumn="0"/>
-              <w:rPr>
-                <w:rFonts w:ascii="Times New Roman" w:hAnsi="Times New Roman" w:cs="Times New Roman"/>
-              </w:rPr>
-            </w:pPr>
-            <w:r>
-              <w:rPr>
-                <w:rFonts w:ascii="Times New Roman" w:hAnsi="Times New Roman" w:cs="Times New Roman"/>
-              </w:rPr>
-              <w:t>13:42</w:t>
+              <w:jc w:val="center"/>
+              <w:cnfStyle w:val="000000000000" w:firstRow="0" w:lastRow="0" w:firstColumn="0" w:lastColumn="0" w:oddVBand="0" w:evenVBand="0" w:oddHBand="0" w:evenHBand="0" w:firstRowFirstColumn="0" w:firstRowLastColumn="0" w:lastRowFirstColumn="0" w:lastRowLastColumn="0"/>
+              <w:rPr>
+                <w:rFonts w:ascii="Times New Roman" w:hAnsi="Times New Roman" w:cs="Times New Roman"/>
+                <w:sz w:val="28"/>
+                <w:szCs w:val="28"/>
+              </w:rPr>
+            </w:pPr>
+            <w:r>
+              <w:rPr>
+                <w:rFonts w:ascii="Times New Roman" w:hAnsi="Times New Roman" w:cs="Times New Roman"/>
+                <w:sz w:val="28"/>
+                <w:szCs w:val="28"/>
+              </w:rPr>
+              <w:t>2026-09-</w:t>
+            </w:r>
+            <w:r>
+              <w:rPr>
+                <w:rFonts w:ascii="Times New Roman" w:hAnsi="Times New Roman" w:cs="Times New Roman"/>
+                <w:sz w:val="28"/>
+                <w:szCs w:val="28"/>
+              </w:rPr>
+              <w:t>18</w:t>
+            </w:r>
+          </w:p>
+          <w:p>
+            <w:pPr>
+              <w:jc w:val="center"/>
+              <w:cnfStyle w:val="000000000000" w:firstRow="0" w:lastRow="0" w:firstColumn="0" w:lastColumn="0" w:oddVBand="0" w:evenVBand="0" w:oddHBand="0" w:evenHBand="0" w:firstRowFirstColumn="0" w:firstRowLastColumn="0" w:lastRowFirstColumn="0" w:lastRowLastColumn="0"/>
+              <w:rPr>
+                <w:rFonts w:ascii="Times New Roman" w:hAnsi="Times New Roman" w:cs="Times New Roman"/>
+              </w:rPr>
+            </w:pPr>
+            <w:r>
+              <w:rPr>
+                <w:rFonts w:ascii="Times New Roman" w:hAnsi="Times New Roman" w:cs="Times New Roman"/>
+                <w:sz w:val="28"/>
+                <w:szCs w:val="28"/>
+              </w:rPr>
+              <w:t>1</w:t>
+            </w:r>
+            <w:r>
+              <w:rPr>
+                <w:rFonts w:ascii="Times New Roman" w:hAnsi="Times New Roman" w:cs="Times New Roman"/>
+                <w:sz w:val="28"/>
+                <w:szCs w:val="28"/>
+              </w:rPr>
+              <w:t>1</w:t>
+            </w:r>
+            <w:r>
+              <w:rPr>
+                <w:rFonts w:ascii="Times New Roman" w:hAnsi="Times New Roman" w:cs="Times New Roman"/>
+                <w:sz w:val="28"/>
+                <w:szCs w:val="28"/>
+              </w:rPr>
+              <w:t>:</w:t>
+            </w:r>
+            <w:r>
+              <w:rPr>
+                <w:rFonts w:ascii="Times New Roman" w:hAnsi="Times New Roman" w:cs="Times New Roman"/>
+                <w:sz w:val="28"/>
+                <w:szCs w:val="28"/>
+              </w:rPr>
+              <w:t>20</w:t>
             </w:r>
           </w:p>
         </w:tc>
@@ -2317,13 +2340,13 @@
           </w:tcPr>
           <w:p>
             <w:pPr>
+              <w:jc w:val="center"/>
               <w:rPr>
                 <w:rFonts w:ascii="Times New Roman" w:hAnsi="Times New Roman" w:cs="Times New Roman"/>
                 <w:b w:val="0"/>
                 <w:bCs w:val="0"/>
               </w:rPr>
             </w:pPr>
-            <w:proofErr w:type="spellStart"/>
             <w:r>
               <w:rPr>
                 <w:rFonts w:ascii="Times New Roman" w:hAnsi="Times New Roman" w:cs="Times New Roman"/>
@@ -2340,7 +2363,6 @@
               </w:rPr>
               <w:t>pdated_at</w:t>
             </w:r>
-            <w:proofErr w:type="spellEnd"/>
           </w:p>
         </w:tc>
         <w:tc>
@@ -2349,6 +2371,7 @@
           </w:tcPr>
           <w:p>
             <w:pPr>
+              <w:jc w:val="center"/>
               <w:cnfStyle w:val="000000000000" w:firstRow="0" w:lastRow="0" w:firstColumn="0" w:lastColumn="0" w:oddVBand="0" w:evenVBand="0" w:oddHBand="0" w:evenHBand="0" w:firstRowFirstColumn="0" w:firstRowLastColumn="0" w:lastRowFirstColumn="0" w:lastRowLastColumn="0"/>
               <w:rPr>
                 <w:rFonts w:ascii="Times New Roman" w:hAnsi="Times New Roman" w:cs="Times New Roman"/>
@@ -2360,14 +2383,12 @@
               </w:rPr>
               <w:t xml:space="preserve">Latest status </w:t>
             </w:r>
-            <w:proofErr w:type="gramStart"/>
-            <w:r>
-              <w:rPr>
-                <w:rFonts w:ascii="Times New Roman" w:hAnsi="Times New Roman" w:cs="Times New Roman"/>
-              </w:rPr>
-              <w:t>change</w:t>
-            </w:r>
-            <w:proofErr w:type="gramEnd"/>
+            <w:r>
+              <w:rPr>
+                <w:rFonts w:ascii="Times New Roman" w:hAnsi="Times New Roman" w:cs="Times New Roman"/>
+              </w:rPr>
+              <w:t>changes</w:t>
+            </w:r>
             <w:r>
               <w:rPr>
                 <w:rFonts w:ascii="Times New Roman" w:hAnsi="Times New Roman" w:cs="Times New Roman"/>
@@ -2382,6 +2403,7 @@
           </w:tcPr>
           <w:p>
             <w:pPr>
+              <w:jc w:val="center"/>
               <w:cnfStyle w:val="000000000000" w:firstRow="0" w:lastRow="0" w:firstColumn="0" w:lastColumn="0" w:oddVBand="0" w:evenVBand="0" w:oddHBand="0" w:evenHBand="0" w:firstRowFirstColumn="0" w:firstRowLastColumn="0" w:lastRowFirstColumn="0" w:lastRowLastColumn="0"/>
               <w:rPr>
                 <w:rFonts w:ascii="Times New Roman" w:hAnsi="Times New Roman" w:cs="Times New Roman"/>
@@ -2394,19 +2416,18 @@
           </w:p>
           <w:p>
             <w:pPr>
-              <w:cnfStyle w:val="000000000000" w:firstRow="0" w:lastRow="0" w:firstColumn="0" w:lastColumn="0" w:oddVBand="0" w:evenVBand="0" w:oddHBand="0" w:evenHBand="0" w:firstRowFirstColumn="0" w:firstRowLastColumn="0" w:lastRowFirstColumn="0" w:lastRowLastColumn="0"/>
-              <w:rPr>
-                <w:rFonts w:ascii="Times New Roman" w:hAnsi="Times New Roman" w:cs="Times New Roman"/>
-              </w:rPr>
-            </w:pPr>
-            <w:proofErr w:type="spellStart"/>
+              <w:jc w:val="center"/>
+              <w:cnfStyle w:val="000000000000" w:firstRow="0" w:lastRow="0" w:firstColumn="0" w:lastColumn="0" w:oddVBand="0" w:evenVBand="0" w:oddHBand="0" w:evenHBand="0" w:firstRowFirstColumn="0" w:firstRowLastColumn="0" w:lastRowFirstColumn="0" w:lastRowLastColumn="0"/>
+              <w:rPr>
+                <w:rFonts w:ascii="Times New Roman" w:hAnsi="Times New Roman" w:cs="Times New Roman"/>
+              </w:rPr>
+            </w:pPr>
             <w:r>
               <w:rPr>
                 <w:rFonts w:ascii="Times New Roman" w:hAnsi="Times New Roman" w:cs="Times New Roman"/>
               </w:rPr>
               <w:t>DateTime</w:t>
             </w:r>
-            <w:proofErr w:type="spellEnd"/>
           </w:p>
         </w:tc>
         <w:tc>
@@ -2415,6 +2436,7 @@
           </w:tcPr>
           <w:p>
             <w:pPr>
+              <w:jc w:val="center"/>
               <w:cnfStyle w:val="000000000000" w:firstRow="0" w:lastRow="0" w:firstColumn="0" w:lastColumn="0" w:oddVBand="0" w:evenVBand="0" w:oddHBand="0" w:evenHBand="0" w:firstRowFirstColumn="0" w:firstRowLastColumn="0" w:lastRowFirstColumn="0" w:lastRowLastColumn="0"/>
               <w:rPr>
                 <w:rFonts w:ascii="Times New Roman" w:hAnsi="Times New Roman" w:cs="Times New Roman"/>
@@ -2427,6 +2449,7 @@
           </w:p>
           <w:p>
             <w:pPr>
+              <w:jc w:val="center"/>
               <w:cnfStyle w:val="000000000000" w:firstRow="0" w:lastRow="0" w:firstColumn="0" w:lastColumn="0" w:oddVBand="0" w:evenVBand="0" w:oddHBand="0" w:evenHBand="0" w:firstRowFirstColumn="0" w:firstRowLastColumn="0" w:lastRowFirstColumn="0" w:lastRowLastColumn="0"/>
               <w:rPr>
                 <w:rFonts w:ascii="Times New Roman" w:hAnsi="Times New Roman" w:cs="Times New Roman"/>
@@ -2446,6 +2469,7 @@
           </w:tcPr>
           <w:p>
             <w:pPr>
+              <w:jc w:val="center"/>
               <w:cnfStyle w:val="000000000000" w:firstRow="0" w:lastRow="0" w:firstColumn="0" w:lastColumn="0" w:oddVBand="0" w:evenVBand="0" w:oddHBand="0" w:evenHBand="0" w:firstRowFirstColumn="0" w:firstRowLastColumn="0" w:lastRowFirstColumn="0" w:lastRowLastColumn="0"/>
               <w:rPr>
                 <w:rFonts w:ascii="Times New Roman" w:hAnsi="Times New Roman" w:cs="Times New Roman"/>
@@ -2458,6 +2482,7 @@
           </w:p>
           <w:p>
             <w:pPr>
+              <w:jc w:val="center"/>
               <w:cnfStyle w:val="000000000000" w:firstRow="0" w:lastRow="0" w:firstColumn="0" w:lastColumn="0" w:oddVBand="0" w:evenVBand="0" w:oddHBand="0" w:evenHBand="0" w:firstRowFirstColumn="0" w:firstRowLastColumn="0" w:lastRowFirstColumn="0" w:lastRowLastColumn="0"/>
               <w:rPr>
                 <w:rFonts w:ascii="Times New Roman" w:hAnsi="Times New Roman" w:cs="Times New Roman"/>
@@ -2477,6 +2502,7 @@
           </w:tcPr>
           <w:p>
             <w:pPr>
+              <w:jc w:val="center"/>
               <w:cnfStyle w:val="000000000000" w:firstRow="0" w:lastRow="0" w:firstColumn="0" w:lastColumn="0" w:oddVBand="0" w:evenVBand="0" w:oddHBand="0" w:evenHBand="0" w:firstRowFirstColumn="0" w:firstRowLastColumn="0" w:lastRowFirstColumn="0" w:lastRowLastColumn="0"/>
               <w:rPr>
                 <w:rFonts w:ascii="Times New Roman" w:hAnsi="Times New Roman" w:cs="Times New Roman"/>
@@ -2509,6 +2535,7 @@
           </w:tcPr>
           <w:p>
             <w:pPr>
+              <w:jc w:val="center"/>
               <w:cnfStyle w:val="000000000000" w:firstRow="0" w:lastRow="0" w:firstColumn="0" w:lastColumn="0" w:oddVBand="0" w:evenVBand="0" w:oddHBand="0" w:evenHBand="0" w:firstRowFirstColumn="0" w:firstRowLastColumn="0" w:lastRowFirstColumn="0" w:lastRowLastColumn="0"/>
               <w:rPr>
                 <w:rFonts w:ascii="Times New Roman" w:hAnsi="Times New Roman" w:cs="Times New Roman"/>
@@ -2521,6 +2548,7 @@
           </w:p>
           <w:p>
             <w:pPr>
+              <w:jc w:val="center"/>
               <w:cnfStyle w:val="000000000000" w:firstRow="0" w:lastRow="0" w:firstColumn="0" w:lastColumn="0" w:oddVBand="0" w:evenVBand="0" w:oddHBand="0" w:evenHBand="0" w:firstRowFirstColumn="0" w:firstRowLastColumn="0" w:lastRowFirstColumn="0" w:lastRowLastColumn="0"/>
               <w:rPr>
                 <w:rFonts w:ascii="Times New Roman" w:hAnsi="Times New Roman" w:cs="Times New Roman"/>
@@ -2547,26 +2575,614 @@
                 <w:sz w:val="28"/>
                 <w:szCs w:val="28"/>
               </w:rPr>
-              <w:t>2026-09-25</w:t>
-            </w:r>
-          </w:p>
-          <w:p>
-            <w:pPr>
-              <w:jc w:val="center"/>
-              <w:cnfStyle w:val="000000000000" w:firstRow="0" w:lastRow="0" w:firstColumn="0" w:lastColumn="0" w:oddVBand="0" w:evenVBand="0" w:oddHBand="0" w:evenHBand="0" w:firstRowFirstColumn="0" w:firstRowLastColumn="0" w:lastRowFirstColumn="0" w:lastRowLastColumn="0"/>
-              <w:rPr>
-                <w:rFonts w:ascii="Times New Roman" w:hAnsi="Times New Roman" w:cs="Times New Roman"/>
-                <w:sz w:val="28"/>
-                <w:szCs w:val="28"/>
-              </w:rPr>
-            </w:pPr>
-            <w:r>
-              <w:rPr>
-                <w:rFonts w:ascii="Times New Roman" w:hAnsi="Times New Roman" w:cs="Times New Roman"/>
-                <w:sz w:val="28"/>
-                <w:szCs w:val="28"/>
-              </w:rPr>
-              <w:t>12:30</w:t>
+              <w:t>2026-09-</w:t>
+            </w:r>
+            <w:r>
+              <w:rPr>
+                <w:rFonts w:ascii="Times New Roman" w:hAnsi="Times New Roman" w:cs="Times New Roman"/>
+                <w:sz w:val="28"/>
+                <w:szCs w:val="28"/>
+              </w:rPr>
+              <w:t>18</w:t>
+            </w:r>
+          </w:p>
+          <w:p>
+            <w:pPr>
+              <w:jc w:val="center"/>
+              <w:cnfStyle w:val="000000000000" w:firstRow="0" w:lastRow="0" w:firstColumn="0" w:lastColumn="0" w:oddVBand="0" w:evenVBand="0" w:oddHBand="0" w:evenHBand="0" w:firstRowFirstColumn="0" w:firstRowLastColumn="0" w:lastRowFirstColumn="0" w:lastRowLastColumn="0"/>
+              <w:rPr>
+                <w:rFonts w:ascii="Times New Roman" w:hAnsi="Times New Roman" w:cs="Times New Roman"/>
+                <w:sz w:val="28"/>
+                <w:szCs w:val="28"/>
+              </w:rPr>
+            </w:pPr>
+            <w:r>
+              <w:rPr>
+                <w:rFonts w:ascii="Times New Roman" w:hAnsi="Times New Roman" w:cs="Times New Roman"/>
+                <w:sz w:val="28"/>
+                <w:szCs w:val="28"/>
+              </w:rPr>
+              <w:t>1</w:t>
+            </w:r>
+            <w:r>
+              <w:rPr>
+                <w:rFonts w:ascii="Times New Roman" w:hAnsi="Times New Roman" w:cs="Times New Roman"/>
+                <w:sz w:val="28"/>
+                <w:szCs w:val="28"/>
+              </w:rPr>
+              <w:t>1</w:t>
+            </w:r>
+            <w:r>
+              <w:rPr>
+                <w:rFonts w:ascii="Times New Roman" w:hAnsi="Times New Roman" w:cs="Times New Roman"/>
+                <w:sz w:val="28"/>
+                <w:szCs w:val="28"/>
+              </w:rPr>
+              <w:t>:</w:t>
+            </w:r>
+            <w:r>
+              <w:rPr>
+                <w:rFonts w:ascii="Times New Roman" w:hAnsi="Times New Roman" w:cs="Times New Roman"/>
+                <w:sz w:val="28"/>
+                <w:szCs w:val="28"/>
+              </w:rPr>
+              <w:t>27</w:t>
+            </w:r>
+          </w:p>
+        </w:tc>
+      </w:tr>
+      <w:tr>
+        <w:trPr>
+          <w:trHeight w:val="872"/>
+        </w:trPr>
+        <w:tc>
+          <w:tcPr>
+            <w:cnfStyle w:val="001000000000" w:firstRow="0" w:lastRow="0" w:firstColumn="1" w:lastColumn="0" w:oddVBand="0" w:evenVBand="0" w:oddHBand="0" w:evenHBand="0" w:firstRowFirstColumn="0" w:firstRowLastColumn="0" w:lastRowFirstColumn="0" w:lastRowLastColumn="0"/>
+            <w:tcW w:w="2887" w:type="dxa"/>
+          </w:tcPr>
+          <w:p>
+            <w:pPr>
+              <w:jc w:val="center"/>
+              <w:rPr>
+                <w:rFonts w:ascii="Times New Roman" w:hAnsi="Times New Roman" w:cs="Times New Roman"/>
+                <w:b w:val="0"/>
+                <w:bCs w:val="0"/>
+                <w:sz w:val="22"/>
+                <w:szCs w:val="22"/>
+              </w:rPr>
+            </w:pPr>
+            <w:r>
+              <w:rPr>
+                <w:rFonts w:ascii="Times New Roman" w:hAnsi="Times New Roman" w:cs="Times New Roman"/>
+                <w:b w:val="0"/>
+                <w:bCs w:val="0"/>
+                <w:sz w:val="22"/>
+                <w:szCs w:val="22"/>
+              </w:rPr>
+              <w:t>request_status</w:t>
+            </w:r>
+          </w:p>
+        </w:tc>
+        <w:tc>
+          <w:tcPr>
+            <w:tcW w:w="1376" w:type="dxa"/>
+          </w:tcPr>
+          <w:p>
+            <w:pPr>
+              <w:jc w:val="center"/>
+              <w:cnfStyle w:val="000000000000" w:firstRow="0" w:lastRow="0" w:firstColumn="0" w:lastColumn="0" w:oddVBand="0" w:evenVBand="0" w:oddHBand="0" w:evenHBand="0" w:firstRowFirstColumn="0" w:firstRowLastColumn="0" w:lastRowFirstColumn="0" w:lastRowLastColumn="0"/>
+              <w:rPr>
+                <w:rFonts w:ascii="Times New Roman" w:hAnsi="Times New Roman" w:cs="Times New Roman"/>
+                <w:sz w:val="22"/>
+                <w:szCs w:val="22"/>
+              </w:rPr>
+            </w:pPr>
+            <w:r>
+              <w:rPr>
+                <w:rFonts w:ascii="Times New Roman" w:hAnsi="Times New Roman" w:cs="Times New Roman"/>
+                <w:sz w:val="22"/>
+                <w:szCs w:val="22"/>
+              </w:rPr>
+              <w:t>Current state of the shift-swap request</w:t>
+            </w:r>
+          </w:p>
+        </w:tc>
+        <w:tc>
+          <w:tcPr>
+            <w:tcW w:w="1168" w:type="dxa"/>
+          </w:tcPr>
+          <w:p>
+            <w:pPr>
+              <w:jc w:val="center"/>
+              <w:cnfStyle w:val="000000000000" w:firstRow="0" w:lastRow="0" w:firstColumn="0" w:lastColumn="0" w:oddVBand="0" w:evenVBand="0" w:oddHBand="0" w:evenHBand="0" w:firstRowFirstColumn="0" w:firstRowLastColumn="0" w:lastRowFirstColumn="0" w:lastRowLastColumn="0"/>
+              <w:rPr>
+                <w:rFonts w:ascii="Times New Roman" w:hAnsi="Times New Roman" w:cs="Times New Roman"/>
+                <w:b/>
+                <w:bCs/>
+                <w:sz w:val="22"/>
+                <w:szCs w:val="22"/>
+              </w:rPr>
+            </w:pPr>
+            <w:r>
+              <w:rPr>
+                <w:rFonts w:ascii="Times New Roman" w:hAnsi="Times New Roman" w:cs="Times New Roman"/>
+                <w:sz w:val="22"/>
+                <w:szCs w:val="22"/>
+              </w:rPr>
+              <w:t>String</w:t>
+            </w:r>
+          </w:p>
+        </w:tc>
+        <w:tc>
+          <w:tcPr>
+            <w:tcW w:w="750" w:type="dxa"/>
+          </w:tcPr>
+          <w:p>
+            <w:pPr>
+              <w:jc w:val="center"/>
+              <w:cnfStyle w:val="000000000000" w:firstRow="0" w:lastRow="0" w:firstColumn="0" w:lastColumn="0" w:oddVBand="0" w:evenVBand="0" w:oddHBand="0" w:evenHBand="0" w:firstRowFirstColumn="0" w:firstRowLastColumn="0" w:lastRowFirstColumn="0" w:lastRowLastColumn="0"/>
+              <w:rPr>
+                <w:rFonts w:ascii="Times New Roman" w:hAnsi="Times New Roman" w:cs="Times New Roman"/>
+                <w:sz w:val="22"/>
+                <w:szCs w:val="22"/>
+              </w:rPr>
+            </w:pPr>
+            <w:r>
+              <w:rPr>
+                <w:rFonts w:ascii="Times New Roman" w:hAnsi="Times New Roman" w:cs="Times New Roman"/>
+                <w:sz w:val="22"/>
+                <w:szCs w:val="22"/>
+              </w:rPr>
+              <w:t>Yes</w:t>
+            </w:r>
+          </w:p>
+        </w:tc>
+        <w:tc>
+          <w:tcPr>
+            <w:tcW w:w="1443" w:type="dxa"/>
+          </w:tcPr>
+          <w:p>
+            <w:pPr>
+              <w:jc w:val="center"/>
+              <w:cnfStyle w:val="000000000000" w:firstRow="0" w:lastRow="0" w:firstColumn="0" w:lastColumn="0" w:oddVBand="0" w:evenVBand="0" w:oddHBand="0" w:evenHBand="0" w:firstRowFirstColumn="0" w:firstRowLastColumn="0" w:lastRowFirstColumn="0" w:lastRowLastColumn="0"/>
+              <w:rPr>
+                <w:rFonts w:ascii="Times New Roman" w:hAnsi="Times New Roman" w:cs="Times New Roman"/>
+                <w:b/>
+                <w:bCs/>
+                <w:sz w:val="22"/>
+                <w:szCs w:val="22"/>
+              </w:rPr>
+            </w:pPr>
+            <w:r>
+              <w:rPr>
+                <w:rFonts w:ascii="Times New Roman" w:hAnsi="Times New Roman" w:cs="Times New Roman"/>
+                <w:sz w:val="22"/>
+                <w:szCs w:val="22"/>
+              </w:rPr>
+              <w:t>Shift-swap processing service</w:t>
+            </w:r>
+          </w:p>
+        </w:tc>
+        <w:tc>
+          <w:tcPr>
+            <w:tcW w:w="1870" w:type="dxa"/>
+          </w:tcPr>
+          <w:p>
+            <w:pPr>
+              <w:jc w:val="center"/>
+              <w:cnfStyle w:val="000000000000" w:firstRow="0" w:lastRow="0" w:firstColumn="0" w:lastColumn="0" w:oddVBand="0" w:evenVBand="0" w:oddHBand="0" w:evenHBand="0" w:firstRowFirstColumn="0" w:firstRowLastColumn="0" w:lastRowFirstColumn="0" w:lastRowLastColumn="0"/>
+              <w:rPr>
+                <w:rFonts w:ascii="Times New Roman" w:hAnsi="Times New Roman" w:cs="Times New Roman"/>
+                <w:sz w:val="22"/>
+                <w:szCs w:val="22"/>
+              </w:rPr>
+            </w:pPr>
+            <w:r>
+              <w:rPr>
+                <w:rFonts w:ascii="Times New Roman" w:hAnsi="Times New Roman" w:cs="Times New Roman"/>
+                <w:sz w:val="22"/>
+                <w:szCs w:val="22"/>
+              </w:rPr>
+              <w:t xml:space="preserve">Must be one of the states in </w:t>
+            </w:r>
+            <w:r>
+              <w:rPr>
+                <w:rStyle w:val="HTMLCode"/>
+                <w:rFonts w:ascii="Times New Roman" w:eastAsiaTheme="majorEastAsia" w:hAnsi="Times New Roman" w:cs="Times New Roman"/>
+                <w:sz w:val="22"/>
+                <w:szCs w:val="22"/>
+              </w:rPr>
+              <w:t>state-definitions.docx</w:t>
+            </w:r>
+          </w:p>
+        </w:tc>
+        <w:tc>
+          <w:tcPr>
+            <w:tcW w:w="1629" w:type="dxa"/>
+          </w:tcPr>
+          <w:p>
+            <w:pPr>
+              <w:jc w:val="center"/>
+              <w:cnfStyle w:val="000000000000" w:firstRow="0" w:lastRow="0" w:firstColumn="0" w:lastColumn="0" w:oddVBand="0" w:evenVBand="0" w:oddHBand="0" w:evenHBand="0" w:firstRowFirstColumn="0" w:firstRowLastColumn="0" w:lastRowFirstColumn="0" w:lastRowLastColumn="0"/>
+              <w:rPr>
+                <w:rFonts w:ascii="Times New Roman" w:hAnsi="Times New Roman" w:cs="Times New Roman"/>
+                <w:sz w:val="28"/>
+                <w:szCs w:val="28"/>
+              </w:rPr>
+            </w:pPr>
+            <w:r>
+              <w:rPr>
+                <w:rFonts w:ascii="Times New Roman" w:hAnsi="Times New Roman" w:cs="Times New Roman"/>
+                <w:sz w:val="28"/>
+                <w:szCs w:val="28"/>
+              </w:rPr>
+              <w:t>APPROVED</w:t>
+            </w:r>
+          </w:p>
+        </w:tc>
+      </w:tr>
+      <w:tr>
+        <w:trPr>
+          <w:trHeight w:val="872"/>
+        </w:trPr>
+        <w:tc>
+          <w:tcPr>
+            <w:cnfStyle w:val="001000000000" w:firstRow="0" w:lastRow="0" w:firstColumn="1" w:lastColumn="0" w:oddVBand="0" w:evenVBand="0" w:oddHBand="0" w:evenHBand="0" w:firstRowFirstColumn="0" w:firstRowLastColumn="0" w:lastRowFirstColumn="0" w:lastRowLastColumn="0"/>
+            <w:tcW w:w="2887" w:type="dxa"/>
+          </w:tcPr>
+          <w:p>
+            <w:pPr>
+              <w:jc w:val="center"/>
+              <w:rPr>
+                <w:rFonts w:ascii="Times New Roman" w:hAnsi="Times New Roman" w:cs="Times New Roman"/>
+                <w:sz w:val="22"/>
+                <w:szCs w:val="22"/>
+              </w:rPr>
+            </w:pPr>
+            <w:r>
+              <w:rPr>
+                <w:rFonts w:ascii="Times New Roman" w:hAnsi="Times New Roman" w:cs="Times New Roman"/>
+                <w:b w:val="0"/>
+                <w:bCs w:val="0"/>
+              </w:rPr>
+              <w:t>target_shift_start</w:t>
+            </w:r>
+          </w:p>
+        </w:tc>
+        <w:tc>
+          <w:tcPr>
+            <w:tcW w:w="1376" w:type="dxa"/>
+          </w:tcPr>
+          <w:p>
+            <w:pPr>
+              <w:jc w:val="center"/>
+              <w:cnfStyle w:val="000000000000" w:firstRow="0" w:lastRow="0" w:firstColumn="0" w:lastColumn="0" w:oddVBand="0" w:evenVBand="0" w:oddHBand="0" w:evenHBand="0" w:firstRowFirstColumn="0" w:firstRowLastColumn="0" w:lastRowFirstColumn="0" w:lastRowLastColumn="0"/>
+              <w:rPr>
+                <w:rFonts w:ascii="Times New Roman" w:hAnsi="Times New Roman" w:cs="Times New Roman"/>
+                <w:sz w:val="22"/>
+                <w:szCs w:val="22"/>
+              </w:rPr>
+            </w:pPr>
+            <w:r>
+              <w:rPr>
+                <w:rFonts w:ascii="Times New Roman" w:hAnsi="Times New Roman" w:cs="Times New Roman"/>
+              </w:rPr>
+              <w:t>Start date and time of the other employee’s shift</w:t>
+            </w:r>
+          </w:p>
+        </w:tc>
+        <w:tc>
+          <w:tcPr>
+            <w:tcW w:w="1168" w:type="dxa"/>
+          </w:tcPr>
+          <w:p>
+            <w:pPr>
+              <w:jc w:val="center"/>
+              <w:cnfStyle w:val="000000000000" w:firstRow="0" w:lastRow="0" w:firstColumn="0" w:lastColumn="0" w:oddVBand="0" w:evenVBand="0" w:oddHBand="0" w:evenHBand="0" w:firstRowFirstColumn="0" w:firstRowLastColumn="0" w:lastRowFirstColumn="0" w:lastRowLastColumn="0"/>
+              <w:rPr>
+                <w:rFonts w:ascii="Times New Roman" w:hAnsi="Times New Roman" w:cs="Times New Roman"/>
+                <w:sz w:val="22"/>
+                <w:szCs w:val="22"/>
+              </w:rPr>
+            </w:pPr>
+            <w:r>
+              <w:rPr>
+                <w:rFonts w:ascii="Times New Roman" w:hAnsi="Times New Roman" w:cs="Times New Roman"/>
+              </w:rPr>
+              <w:t>DateTime</w:t>
+            </w:r>
+          </w:p>
+        </w:tc>
+        <w:tc>
+          <w:tcPr>
+            <w:tcW w:w="750" w:type="dxa"/>
+          </w:tcPr>
+          <w:p>
+            <w:pPr>
+              <w:jc w:val="center"/>
+              <w:cnfStyle w:val="000000000000" w:firstRow="0" w:lastRow="0" w:firstColumn="0" w:lastColumn="0" w:oddVBand="0" w:evenVBand="0" w:oddHBand="0" w:evenHBand="0" w:firstRowFirstColumn="0" w:firstRowLastColumn="0" w:lastRowFirstColumn="0" w:lastRowLastColumn="0"/>
+              <w:rPr>
+                <w:rFonts w:ascii="Times New Roman" w:hAnsi="Times New Roman" w:cs="Times New Roman"/>
+                <w:sz w:val="22"/>
+                <w:szCs w:val="22"/>
+              </w:rPr>
+            </w:pPr>
+            <w:r>
+              <w:rPr>
+                <w:rFonts w:ascii="Times New Roman" w:hAnsi="Times New Roman" w:cs="Times New Roman"/>
+              </w:rPr>
+              <w:t>Yes</w:t>
+            </w:r>
+          </w:p>
+        </w:tc>
+        <w:tc>
+          <w:tcPr>
+            <w:tcW w:w="1443" w:type="dxa"/>
+          </w:tcPr>
+          <w:p>
+            <w:pPr>
+              <w:jc w:val="center"/>
+              <w:cnfStyle w:val="000000000000" w:firstRow="0" w:lastRow="0" w:firstColumn="0" w:lastColumn="0" w:oddVBand="0" w:evenVBand="0" w:oddHBand="0" w:evenHBand="0" w:firstRowFirstColumn="0" w:firstRowLastColumn="0" w:lastRowFirstColumn="0" w:lastRowLastColumn="0"/>
+              <w:rPr>
+                <w:rFonts w:ascii="Times New Roman" w:hAnsi="Times New Roman" w:cs="Times New Roman"/>
+                <w:sz w:val="22"/>
+                <w:szCs w:val="22"/>
+              </w:rPr>
+            </w:pPr>
+            <w:r>
+              <w:rPr>
+                <w:rFonts w:ascii="Times New Roman" w:hAnsi="Times New Roman" w:cs="Times New Roman"/>
+              </w:rPr>
+              <w:t>Schedule management system</w:t>
+            </w:r>
+          </w:p>
+        </w:tc>
+        <w:tc>
+          <w:tcPr>
+            <w:tcW w:w="1870" w:type="dxa"/>
+          </w:tcPr>
+          <w:p>
+            <w:pPr>
+              <w:jc w:val="center"/>
+              <w:cnfStyle w:val="000000000000" w:firstRow="0" w:lastRow="0" w:firstColumn="0" w:lastColumn="0" w:oddVBand="0" w:evenVBand="0" w:oddHBand="0" w:evenHBand="0" w:firstRowFirstColumn="0" w:firstRowLastColumn="0" w:lastRowFirstColumn="0" w:lastRowLastColumn="0"/>
+              <w:rPr>
+                <w:rFonts w:ascii="Times New Roman" w:hAnsi="Times New Roman" w:cs="Times New Roman"/>
+                <w:sz w:val="22"/>
+                <w:szCs w:val="22"/>
+              </w:rPr>
+            </w:pPr>
+            <w:r>
+              <w:rPr>
+                <w:rFonts w:ascii="Times New Roman" w:hAnsi="Times New Roman" w:cs="Times New Roman"/>
+              </w:rPr>
+              <w:t>Must identify a scheduled shift assigned to the target employee</w:t>
+            </w:r>
+          </w:p>
+        </w:tc>
+        <w:tc>
+          <w:tcPr>
+            <w:tcW w:w="1629" w:type="dxa"/>
+          </w:tcPr>
+          <w:p>
+            <w:pPr>
+              <w:jc w:val="center"/>
+              <w:cnfStyle w:val="000000000000" w:firstRow="0" w:lastRow="0" w:firstColumn="0" w:lastColumn="0" w:oddVBand="0" w:evenVBand="0" w:oddHBand="0" w:evenHBand="0" w:firstRowFirstColumn="0" w:firstRowLastColumn="0" w:lastRowFirstColumn="0" w:lastRowLastColumn="0"/>
+              <w:rPr>
+                <w:rFonts w:ascii="Times New Roman" w:hAnsi="Times New Roman" w:cs="Times New Roman"/>
+                <w:sz w:val="28"/>
+                <w:szCs w:val="28"/>
+              </w:rPr>
+            </w:pPr>
+            <w:r>
+              <w:rPr>
+                <w:rFonts w:ascii="Times New Roman" w:hAnsi="Times New Roman" w:cs="Times New Roman"/>
+                <w:sz w:val="28"/>
+                <w:szCs w:val="28"/>
+              </w:rPr>
+              <w:t>2026-09-20</w:t>
+            </w:r>
+          </w:p>
+          <w:p>
+            <w:pPr>
+              <w:jc w:val="center"/>
+              <w:cnfStyle w:val="000000000000" w:firstRow="0" w:lastRow="0" w:firstColumn="0" w:lastColumn="0" w:oddVBand="0" w:evenVBand="0" w:oddHBand="0" w:evenHBand="0" w:firstRowFirstColumn="0" w:firstRowLastColumn="0" w:lastRowFirstColumn="0" w:lastRowLastColumn="0"/>
+              <w:rPr>
+                <w:rFonts w:ascii="Times New Roman" w:hAnsi="Times New Roman" w:cs="Times New Roman"/>
+                <w:sz w:val="28"/>
+                <w:szCs w:val="28"/>
+              </w:rPr>
+            </w:pPr>
+            <w:r>
+              <w:rPr>
+                <w:rFonts w:ascii="Times New Roman" w:hAnsi="Times New Roman" w:cs="Times New Roman"/>
+                <w:sz w:val="28"/>
+                <w:szCs w:val="28"/>
+              </w:rPr>
+              <w:t>09:00</w:t>
+            </w:r>
+          </w:p>
+        </w:tc>
+      </w:tr>
+      <w:tr>
+        <w:trPr>
+          <w:trHeight w:val="872"/>
+        </w:trPr>
+        <w:tc>
+          <w:tcPr>
+            <w:cnfStyle w:val="001000000000" w:firstRow="0" w:lastRow="0" w:firstColumn="1" w:lastColumn="0" w:oddVBand="0" w:evenVBand="0" w:oddHBand="0" w:evenHBand="0" w:firstRowFirstColumn="0" w:firstRowLastColumn="0" w:lastRowFirstColumn="0" w:lastRowLastColumn="0"/>
+            <w:tcW w:w="2887" w:type="dxa"/>
+          </w:tcPr>
+          <w:p>
+            <w:pPr>
+              <w:jc w:val="center"/>
+              <w:rPr>
+                <w:rFonts w:ascii="Times New Roman" w:hAnsi="Times New Roman" w:cs="Times New Roman"/>
+                <w:b w:val="0"/>
+                <w:bCs w:val="0"/>
+              </w:rPr>
+            </w:pPr>
+            <w:r>
+              <w:rPr>
+                <w:rFonts w:ascii="Times New Roman" w:hAnsi="Times New Roman" w:cs="Times New Roman"/>
+                <w:b w:val="0"/>
+                <w:bCs w:val="0"/>
+              </w:rPr>
+              <w:t>target_shift_end</w:t>
+            </w:r>
+          </w:p>
+        </w:tc>
+        <w:tc>
+          <w:tcPr>
+            <w:tcW w:w="1376" w:type="dxa"/>
+          </w:tcPr>
+          <w:p>
+            <w:pPr>
+              <w:jc w:val="center"/>
+              <w:cnfStyle w:val="000000000000" w:firstRow="0" w:lastRow="0" w:firstColumn="0" w:lastColumn="0" w:oddVBand="0" w:evenVBand="0" w:oddHBand="0" w:evenHBand="0" w:firstRowFirstColumn="0" w:firstRowLastColumn="0" w:lastRowFirstColumn="0" w:lastRowLastColumn="0"/>
+              <w:rPr>
+                <w:rFonts w:ascii="Times New Roman" w:hAnsi="Times New Roman" w:cs="Times New Roman"/>
+              </w:rPr>
+            </w:pPr>
+            <w:r>
+              <w:rPr>
+                <w:rFonts w:ascii="Times New Roman" w:hAnsi="Times New Roman" w:cs="Times New Roman"/>
+              </w:rPr>
+              <w:t>End date and time of the other employee’s shift</w:t>
+            </w:r>
+          </w:p>
+        </w:tc>
+        <w:tc>
+          <w:tcPr>
+            <w:tcW w:w="1168" w:type="dxa"/>
+          </w:tcPr>
+          <w:p>
+            <w:pPr>
+              <w:jc w:val="center"/>
+              <w:cnfStyle w:val="000000000000" w:firstRow="0" w:lastRow="0" w:firstColumn="0" w:lastColumn="0" w:oddVBand="0" w:evenVBand="0" w:oddHBand="0" w:evenHBand="0" w:firstRowFirstColumn="0" w:firstRowLastColumn="0" w:lastRowFirstColumn="0" w:lastRowLastColumn="0"/>
+              <w:rPr>
+                <w:rFonts w:ascii="Times New Roman" w:hAnsi="Times New Roman" w:cs="Times New Roman"/>
+              </w:rPr>
+            </w:pPr>
+            <w:r>
+              <w:rPr>
+                <w:rFonts w:ascii="Times New Roman" w:hAnsi="Times New Roman" w:cs="Times New Roman"/>
+              </w:rPr>
+              <w:t>DateTime</w:t>
+            </w:r>
+          </w:p>
+        </w:tc>
+        <w:tc>
+          <w:tcPr>
+            <w:tcW w:w="750" w:type="dxa"/>
+          </w:tcPr>
+          <w:p>
+            <w:pPr>
+              <w:jc w:val="center"/>
+              <w:cnfStyle w:val="000000000000" w:firstRow="0" w:lastRow="0" w:firstColumn="0" w:lastColumn="0" w:oddVBand="0" w:evenVBand="0" w:oddHBand="0" w:evenHBand="0" w:firstRowFirstColumn="0" w:firstRowLastColumn="0" w:lastRowFirstColumn="0" w:lastRowLastColumn="0"/>
+              <w:rPr>
+                <w:rFonts w:ascii="Times New Roman" w:hAnsi="Times New Roman" w:cs="Times New Roman"/>
+              </w:rPr>
+            </w:pPr>
+            <w:r>
+              <w:rPr>
+                <w:rFonts w:ascii="Times New Roman" w:hAnsi="Times New Roman" w:cs="Times New Roman"/>
+              </w:rPr>
+              <w:t>Yes</w:t>
+            </w:r>
+          </w:p>
+        </w:tc>
+        <w:tc>
+          <w:tcPr>
+            <w:tcW w:w="1443" w:type="dxa"/>
+          </w:tcPr>
+          <w:p>
+            <w:pPr>
+              <w:jc w:val="center"/>
+              <w:cnfStyle w:val="000000000000" w:firstRow="0" w:lastRow="0" w:firstColumn="0" w:lastColumn="0" w:oddVBand="0" w:evenVBand="0" w:oddHBand="0" w:evenHBand="0" w:firstRowFirstColumn="0" w:firstRowLastColumn="0" w:lastRowFirstColumn="0" w:lastRowLastColumn="0"/>
+              <w:rPr>
+                <w:rFonts w:ascii="Times New Roman" w:hAnsi="Times New Roman" w:cs="Times New Roman"/>
+              </w:rPr>
+            </w:pPr>
+            <w:r>
+              <w:rPr>
+                <w:rFonts w:ascii="Times New Roman" w:hAnsi="Times New Roman" w:cs="Times New Roman"/>
+              </w:rPr>
+              <w:t>Schedule management system</w:t>
+            </w:r>
+          </w:p>
+        </w:tc>
+        <w:tc>
+          <w:tcPr>
+            <w:tcW w:w="1870" w:type="dxa"/>
+          </w:tcPr>
+          <w:p>
+            <w:pPr>
+              <w:jc w:val="center"/>
+              <w:cnfStyle w:val="000000000000" w:firstRow="0" w:lastRow="0" w:firstColumn="0" w:lastColumn="0" w:oddVBand="0" w:evenVBand="0" w:oddHBand="0" w:evenHBand="0" w:firstRowFirstColumn="0" w:firstRowLastColumn="0" w:lastRowFirstColumn="0" w:lastRowLastColumn="0"/>
+              <w:rPr>
+                <w:rFonts w:ascii="Times New Roman" w:hAnsi="Times New Roman" w:cs="Times New Roman"/>
+              </w:rPr>
+            </w:pPr>
+            <w:r>
+              <w:rPr>
+                <w:rFonts w:ascii="Times New Roman" w:hAnsi="Times New Roman" w:cs="Times New Roman"/>
+              </w:rPr>
+              <w:t xml:space="preserve">Must </w:t>
+            </w:r>
+            <w:r>
+              <w:rPr>
+                <w:rFonts w:ascii="Times New Roman" w:hAnsi="Times New Roman" w:cs="Times New Roman"/>
+              </w:rPr>
+              <w:t xml:space="preserve">be after </w:t>
+            </w:r>
+            <w:r>
+              <w:rPr>
+                <w:rFonts w:ascii="Times New Roman" w:hAnsi="Times New Roman" w:cs="Times New Roman"/>
+              </w:rPr>
+              <w:t>target_shift_start</w:t>
+            </w:r>
+          </w:p>
+        </w:tc>
+        <w:tc>
+          <w:tcPr>
+            <w:tcW w:w="1629" w:type="dxa"/>
+          </w:tcPr>
+          <w:p>
+            <w:pPr>
+              <w:jc w:val="center"/>
+              <w:cnfStyle w:val="000000000000" w:firstRow="0" w:lastRow="0" w:firstColumn="0" w:lastColumn="0" w:oddVBand="0" w:evenVBand="0" w:oddHBand="0" w:evenHBand="0" w:firstRowFirstColumn="0" w:firstRowLastColumn="0" w:lastRowFirstColumn="0" w:lastRowLastColumn="0"/>
+              <w:rPr>
+                <w:rFonts w:ascii="Times New Roman" w:hAnsi="Times New Roman" w:cs="Times New Roman"/>
+                <w:sz w:val="28"/>
+                <w:szCs w:val="28"/>
+              </w:rPr>
+            </w:pPr>
+            <w:r>
+              <w:rPr>
+                <w:rFonts w:ascii="Times New Roman" w:hAnsi="Times New Roman" w:cs="Times New Roman"/>
+                <w:sz w:val="28"/>
+                <w:szCs w:val="28"/>
+              </w:rPr>
+              <w:t>2026-09-20</w:t>
+            </w:r>
+          </w:p>
+          <w:p>
+            <w:pPr>
+              <w:jc w:val="center"/>
+              <w:cnfStyle w:val="000000000000" w:firstRow="0" w:lastRow="0" w:firstColumn="0" w:lastColumn="0" w:oddVBand="0" w:evenVBand="0" w:oddHBand="0" w:evenHBand="0" w:firstRowFirstColumn="0" w:firstRowLastColumn="0" w:lastRowFirstColumn="0" w:lastRowLastColumn="0"/>
+              <w:rPr>
+                <w:rFonts w:ascii="Times New Roman" w:hAnsi="Times New Roman" w:cs="Times New Roman"/>
+                <w:sz w:val="28"/>
+                <w:szCs w:val="28"/>
+              </w:rPr>
+            </w:pPr>
+            <w:r>
+              <w:rPr>
+                <w:rFonts w:ascii="Times New Roman" w:hAnsi="Times New Roman" w:cs="Times New Roman"/>
+                <w:sz w:val="28"/>
+                <w:szCs w:val="28"/>
+              </w:rPr>
+              <w:t>16:00</w:t>
             </w:r>
           </w:p>
         </w:tc>
@@ -2574,6 +3190,7 @@
     </w:tbl>
     <w:p>
       <w:pPr>
+        <w:jc w:val="center"/>
         <w:rPr>
           <w:rFonts w:ascii="Times New Roman" w:hAnsi="Times New Roman" w:cs="Times New Roman"/>
           <w:b/>
@@ -3756,6 +4373,19 @@
     <w:uiPriority w:val="99"/>
     <w:rsid w:val="00A93E95"/>
   </w:style>
+  <w:style w:type="character" w:styleId="HTMLCode">
+    <w:name w:val="HTML Code"/>
+    <w:basedOn w:val="DefaultParagraphFont"/>
+    <w:uiPriority w:val="99"/>
+    <w:semiHidden/>
+    <w:unhideWhenUsed/>
+    <w:rsid w:val="00713BE3"/>
+    <w:rPr>
+      <w:rFonts w:ascii="Courier New" w:eastAsia="Times New Roman" w:hAnsi="Courier New" w:cs="Courier New"/>
+      <w:sz w:val="20"/>
+      <w:szCs w:val="20"/>
+    </w:rPr>
+  </w:style>
 </w:styles>
 </file>
 

</xml_diff>